<commit_message>
Add Home screen prototype
</commit_message>
<xml_diff>
--- a/__ IT353 Project_.docx
+++ b/__ IT353 Project_.docx
@@ -2748,16 +2748,7 @@
                                           <w:sz w:val="28"/>
                                           <w:szCs w:val="28"/>
                                         </w:rPr>
-                                        <w:t xml:space="preserve"> </w:t>
-                                      </w:r>
-                                      <w:r>
-                                        <w:rPr>
-                                          <w:b/>
-                                          <w:bCs/>
-                                          <w:sz w:val="28"/>
-                                          <w:szCs w:val="28"/>
-                                        </w:rPr>
-                                        <w:t>S240031741</w:t>
+                                        <w:t xml:space="preserve"> S240031741</w:t>
                                       </w:r>
                                     </w:p>
                                     <w:p>
@@ -3251,16 +3242,7 @@
                                     <w:sz w:val="28"/>
                                     <w:szCs w:val="28"/>
                                   </w:rPr>
-                                  <w:t xml:space="preserve"> </w:t>
-                                </w:r>
-                                <w:r>
-                                  <w:rPr>
-                                    <w:b/>
-                                    <w:bCs/>
-                                    <w:sz w:val="28"/>
-                                    <w:szCs w:val="28"/>
-                                  </w:rPr>
-                                  <w:t>S240031741</w:t>
+                                  <w:t xml:space="preserve"> S240031741</w:t>
                                 </w:r>
                               </w:p>
                               <w:p>
@@ -5582,7 +5564,132 @@
         <w:t>Evolutionary Prototyping was selected because it allows the system to be improved step by step based on user feedback. Since the Student Activities Management System includes different features such as browsing activities, registration, notifications, attendance tracking, and activity management, this approach is more suitable. It helps the team understand user needs better, make improvements during development, and reduce the chance of creating a system that does not meet user expectations. </w:t>
       </w:r>
     </w:p>
-    <w:p/>
+    <w:p>
+      <w:pPr>
+        <w:rPr>
+          <w:rFonts w:ascii="Times New Roman" w:hAnsi="Times New Roman" w:cs="Times New Roman"/>
+          <w:sz w:val="28"/>
+          <w:szCs w:val="28"/>
+        </w:rPr>
+      </w:pPr>
+      <w:r>
+        <w:rPr>
+          <w:rFonts w:ascii="Times New Roman" w:hAnsi="Times New Roman" w:cs="Times New Roman"/>
+          <w:b/>
+          <w:bCs/>
+          <w:sz w:val="28"/>
+          <w:szCs w:val="28"/>
+        </w:rPr>
+        <w:t>Low-Fidelity Prototype Screens </w:t>
+      </w:r>
+    </w:p>
+    <w:p>
+      <w:pPr>
+        <w:rPr>
+          <w:rtl/>
+        </w:rPr>
+      </w:pPr>
+    </w:p>
+    <w:p>
+      <w:pPr>
+        <w:rPr>
+          <w:rtl/>
+        </w:rPr>
+      </w:pPr>
+    </w:p>
+    <w:p>
+      <w:pPr>
+        <w:rPr>
+          <w:rtl/>
+        </w:rPr>
+      </w:pPr>
+    </w:p>
+    <w:p>
+      <w:pPr>
+        <w:rPr>
+          <w:rtl/>
+        </w:rPr>
+      </w:pPr>
+    </w:p>
+    <w:p>
+      <w:pPr>
+        <w:rPr>
+          <w:rtl/>
+        </w:rPr>
+      </w:pPr>
+    </w:p>
+    <w:p>
+      <w:pPr>
+        <w:rPr>
+          <w:rtl/>
+        </w:rPr>
+      </w:pPr>
+    </w:p>
+    <w:p>
+      <w:pPr>
+        <w:rPr>
+          <w:rFonts w:ascii="Times New Roman" w:hAnsi="Times New Roman" w:cs="Times New Roman"/>
+          <w:b/>
+          <w:bCs/>
+          <w:sz w:val="24"/>
+          <w:szCs w:val="24"/>
+          <w:rtl/>
+        </w:rPr>
+      </w:pPr>
+      <w:r>
+        <w:rPr>
+          <w:rFonts w:ascii="Times New Roman" w:hAnsi="Times New Roman" w:cs="Times New Roman"/>
+          <w:b/>
+          <w:bCs/>
+          <w:sz w:val="24"/>
+          <w:szCs w:val="24"/>
+        </w:rPr>
+        <w:lastRenderedPageBreak/>
+        <w:t>Screen 1: Home</w:t>
+      </w:r>
+    </w:p>
+    <w:p>
+      <w:r>
+        <w:rPr>
+          <w:noProof/>
+        </w:rPr>
+        <w:drawing>
+          <wp:inline distT="0" distB="0" distL="0" distR="0" wp14:anchorId="23A716D0" wp14:editId="53CC4293">
+            <wp:extent cx="3648584" cy="6592220"/>
+            <wp:effectExtent l="0" t="0" r="9525" b="0"/>
+            <wp:docPr id="1226730610" name="Picture 12"/>
+            <wp:cNvGraphicFramePr>
+              <a:graphicFrameLocks xmlns:a="http://schemas.openxmlformats.org/drawingml/2006/main" noChangeAspect="1"/>
+            </wp:cNvGraphicFramePr>
+            <a:graphic xmlns:a="http://schemas.openxmlformats.org/drawingml/2006/main">
+              <a:graphicData uri="http://schemas.openxmlformats.org/drawingml/2006/picture">
+                <pic:pic xmlns:pic="http://schemas.openxmlformats.org/drawingml/2006/picture">
+                  <pic:nvPicPr>
+                    <pic:cNvPr id="1226730610" name="Picture 1226730610"/>
+                    <pic:cNvPicPr/>
+                  </pic:nvPicPr>
+                  <pic:blipFill>
+                    <a:blip r:embed="rId15"/>
+                    <a:stretch>
+                      <a:fillRect/>
+                    </a:stretch>
+                  </pic:blipFill>
+                  <pic:spPr>
+                    <a:xfrm>
+                      <a:off x="0" y="0"/>
+                      <a:ext cx="3648584" cy="6592220"/>
+                    </a:xfrm>
+                    <a:prstGeom prst="rect">
+                      <a:avLst/>
+                    </a:prstGeom>
+                  </pic:spPr>
+                </pic:pic>
+              </a:graphicData>
+            </a:graphic>
+          </wp:inline>
+        </w:drawing>
+      </w:r>
+    </w:p>
     <w:p>
       <w:pPr>
         <w:pStyle w:val="Heading1"/>
@@ -6511,7 +6618,7 @@
       </w:pPr>
     </w:p>
     <w:sectPr>
-      <w:headerReference w:type="default" r:id="rId15"/>
+      <w:headerReference w:type="default" r:id="rId16"/>
       <w:pgSz w:w="12240" w:h="15840" w:code="1"/>
       <w:pgMar w:top="1080" w:right="720" w:bottom="2160" w:left="3096" w:header="1080" w:footer="720" w:gutter="0"/>
       <w:pgNumType w:start="1"/>
@@ -7433,7 +7540,7 @@
             <w:rPr>
               <w:noProof/>
             </w:rPr>
-            <w:instrText>Task 3</w:instrText>
+            <w:instrText>Task 4</w:instrText>
           </w:r>
           <w:r>
             <w:rPr>
@@ -7466,7 +7573,7 @@
             <w:rPr>
               <w:noProof/>
             </w:rPr>
-            <w:instrText>Task 3</w:instrText>
+            <w:instrText>Task 4</w:instrText>
           </w:r>
           <w:r>
             <w:rPr>
@@ -7484,7 +7591,7 @@
             <w:rPr>
               <w:noProof/>
             </w:rPr>
-            <w:t xml:space="preserve">Task 3 </w:t>
+            <w:t xml:space="preserve">Task 4 </w:t>
           </w:r>
           <w:r>
             <w:fldChar w:fldCharType="end"/>
@@ -11285,11 +11392,13 @@
   <w:rsids>
     <w:rsidRoot w:val="00324ACF"/>
     <w:rsid w:val="000129E1"/>
+    <w:rsid w:val="00020C57"/>
     <w:rsid w:val="00051231"/>
     <w:rsid w:val="00075A1C"/>
     <w:rsid w:val="0018073C"/>
     <w:rsid w:val="001A632E"/>
     <w:rsid w:val="00207A61"/>
+    <w:rsid w:val="002D4EA1"/>
     <w:rsid w:val="00324ACF"/>
     <w:rsid w:val="00351A43"/>
     <w:rsid w:val="003B2F21"/>
@@ -11318,6 +11427,7 @@
     <w:rsid w:val="00C40158"/>
     <w:rsid w:val="00C54676"/>
     <w:rsid w:val="00C77297"/>
+    <w:rsid w:val="00CB721F"/>
     <w:rsid w:val="00CC6F9F"/>
     <w:rsid w:val="00D1374E"/>
     <w:rsid w:val="00D248BA"/>
@@ -11328,6 +11438,7 @@
     <w:rsid w:val="00E552F8"/>
     <w:rsid w:val="00E575CD"/>
     <w:rsid w:val="00F55C51"/>
+    <w:rsid w:val="00FC128F"/>
   </w:rsids>
   <m:mathPr>
     <m:mathFont m:val="Cambria Math"/>

</xml_diff>

<commit_message>
I add Task 1
</commit_message>
<xml_diff>
--- a/__ IT353 Project_.docx
+++ b/__ IT353 Project_.docx
@@ -1,6 +1,6 @@
 
 <file path=word/document.xml><?xml version="1.0" encoding="utf-8"?>
-<w:document xmlns:wpc="http://schemas.microsoft.com/office/word/2010/wordprocessingCanvas" xmlns:cx="http://schemas.microsoft.com/office/drawing/2014/chartex" xmlns:cx1="http://schemas.microsoft.com/office/drawing/2015/9/8/chartex" xmlns:cx2="http://schemas.microsoft.com/office/drawing/2015/10/21/chartex" xmlns:cx3="http://schemas.microsoft.com/office/drawing/2016/5/9/chartex" xmlns:cx4="http://schemas.microsoft.com/office/drawing/2016/5/10/chartex" xmlns:cx5="http://schemas.microsoft.com/office/drawing/2016/5/11/chartex" xmlns:cx6="http://schemas.microsoft.com/office/drawing/2016/5/12/chartex" xmlns:cx7="http://schemas.microsoft.com/office/drawing/2016/5/13/chartex" xmlns:cx8="http://schemas.microsoft.com/office/drawing/2016/5/14/chartex" xmlns:mc="http://schemas.openxmlformats.org/markup-compatibility/2006" xmlns:aink="http://schemas.microsoft.com/office/drawing/2016/ink" xmlns:am3d="http://schemas.microsoft.com/office/drawing/2017/model3d" xmlns:o="urn:schemas-microsoft-com:office:office" xmlns:oel="http://schemas.microsoft.com/office/2019/extlst" xmlns:r="http://schemas.openxmlformats.org/officeDocument/2006/relationships" xmlns:m="http://schemas.openxmlformats.org/officeDocument/2006/math" xmlns:v="urn:schemas-microsoft-com:vml" xmlns:wp14="http://schemas.microsoft.com/office/word/2010/wordprocessingDrawing" xmlns:wp="http://schemas.openxmlformats.org/drawingml/2006/wordprocessingDrawing" xmlns:w10="urn:schemas-microsoft-com:office:word" xmlns:w="http://schemas.openxmlformats.org/wordprocessingml/2006/main" xmlns:w14="http://schemas.microsoft.com/office/word/2010/wordml" xmlns:w15="http://schemas.microsoft.com/office/word/2012/wordml" xmlns:w16cex="http://schemas.microsoft.com/office/word/2018/wordml/cex" xmlns:w16cid="http://schemas.microsoft.com/office/word/2016/wordml/cid" xmlns:w16="http://schemas.microsoft.com/office/word/2018/wordml" xmlns:w16du="http://schemas.microsoft.com/office/word/2023/wordml/word16du" xmlns:w16sdtdh="http://schemas.microsoft.com/office/word/2020/wordml/sdtdatahash" xmlns:w16sdtfl="http://schemas.microsoft.com/office/word/2024/wordml/sdtformatlock" xmlns:w16se="http://schemas.microsoft.com/office/word/2015/wordml/symex" xmlns:wpg="http://schemas.microsoft.com/office/word/2010/wordprocessingGroup" xmlns:wpi="http://schemas.microsoft.com/office/word/2010/wordprocessingInk" xmlns:wne="http://schemas.microsoft.com/office/word/2006/wordml" xmlns:wps="http://schemas.microsoft.com/office/word/2010/wordprocessingShape" mc:Ignorable="w14 w15 w16se w16cid w16 w16cex w16sdtdh w16sdtfl w16du wp14">
+<w:document xmlns:wpc="http://schemas.microsoft.com/office/word/2010/wordprocessingCanvas" xmlns:cx="http://schemas.microsoft.com/office/drawing/2014/chartex" xmlns:cx1="http://schemas.microsoft.com/office/drawing/2015/9/8/chartex" xmlns:cx2="http://schemas.microsoft.com/office/drawing/2015/10/21/chartex" xmlns:cx3="http://schemas.microsoft.com/office/drawing/2016/5/9/chartex" xmlns:cx4="http://schemas.microsoft.com/office/drawing/2016/5/10/chartex" xmlns:cx5="http://schemas.microsoft.com/office/drawing/2016/5/11/chartex" xmlns:cx6="http://schemas.microsoft.com/office/drawing/2016/5/12/chartex" xmlns:cx7="http://schemas.microsoft.com/office/drawing/2016/5/13/chartex" xmlns:cx8="http://schemas.microsoft.com/office/drawing/2016/5/14/chartex" xmlns:mc="http://schemas.openxmlformats.org/markup-compatibility/2006" xmlns:m="http://schemas.openxmlformats.org/officeDocument/2006/math" xmlns:aink="http://schemas.microsoft.com/office/drawing/2016/ink" xmlns:am3d="http://schemas.microsoft.com/office/drawing/2017/model3d" xmlns:oel="http://schemas.microsoft.com/office/2019/extlst" xmlns:r="http://schemas.openxmlformats.org/officeDocument/2006/relationships" xmlns:wp14="http://schemas.microsoft.com/office/word/2010/wordprocessingDrawing" xmlns:wp="http://schemas.openxmlformats.org/drawingml/2006/wordprocessingDrawing" xmlns:wpg="http://schemas.microsoft.com/office/word/2010/wordprocessingGroup" xmlns:wpi="http://schemas.microsoft.com/office/word/2010/wordprocessingInk" xmlns:wps="http://schemas.microsoft.com/office/word/2010/wordprocessingShape" xmlns:o="urn:schemas-microsoft-com:office:office" xmlns:v="urn:schemas-microsoft-com:vml" xmlns:w10="urn:schemas-microsoft-com:office:word" xmlns:w="http://schemas.openxmlformats.org/wordprocessingml/2006/main" xmlns:w14="http://schemas.microsoft.com/office/word/2010/wordml" xmlns:w15="http://schemas.microsoft.com/office/word/2012/wordml" xmlns:w16cei="http://schemas.microsoft.com/office/word/2026/wordml/cei" xmlns:w16cex="http://schemas.microsoft.com/office/word/2018/wordml/cex" xmlns:w16cid="http://schemas.microsoft.com/office/word/2016/wordml/cid" xmlns:w16="http://schemas.microsoft.com/office/word/2018/wordml" xmlns:w16sdtdh="http://schemas.microsoft.com/office/word/2020/wordml/sdtdatahash" xmlns:w16sdtfl="http://schemas.microsoft.com/office/word/2024/wordml/sdtformatlock" xmlns:w16se="http://schemas.microsoft.com/office/word/2015/wordml/symex" xmlns:w16du="http://schemas.microsoft.com/office/word/2023/wordml/word16du" xmlns:wne="http://schemas.microsoft.com/office/word/2006/wordml" mc:Ignorable="w14 w15 w16se w16cid w16 w16cex w16sdtdh w16sdtfl w16du wp14">
   <w:body>
     <w:p>
       <w:r>
@@ -13,7 +13,7 @@
         <mc:AlternateContent>
           <mc:Choice Requires="wps">
             <w:drawing>
-              <wp:anchor distT="0" distB="0" distL="114300" distR="114300" simplePos="0" relativeHeight="251674624" behindDoc="1" locked="0" layoutInCell="1" allowOverlap="0" wp14:anchorId="31BDEDF3" wp14:editId="16A9BE7C">
+              <wp:anchor distT="0" distB="0" distL="114300" distR="114300" simplePos="0" relativeHeight="251674624" behindDoc="1" locked="0" layoutInCell="1" allowOverlap="0" wp14:anchorId="31BDEDF3" wp14:editId="151A5E66">
                 <wp:simplePos x="0" y="0"/>
                 <wp:positionH relativeFrom="page">
                   <wp:posOffset>463550</wp:posOffset>
@@ -74,10 +74,11 @@
                               <w:dataBinding w:prefixMappings="xmlns:ns0='http://purl.org/dc/elements/1.1/' xmlns:ns1='http://schemas.openxmlformats.org/package/2006/metadata/core-properties' " w:xpath="/ns1:coreProperties[1]/ns0:title[1]" w:storeItemID="{6C3C8BC8-F283-45AE-878A-BAB7291924A1}"/>
                               <w:text/>
                             </w:sdtPr>
+                            <w:sdtEndPr/>
                             <w:sdtContent>
                               <w:p>
                                 <w:pPr>
-                                  <w:pStyle w:val="Title"/>
+                                  <w:pStyle w:val="a9"/>
                                   <w:jc w:val="center"/>
                                   <w:rPr>
                                     <w:sz w:val="56"/>
@@ -96,7 +97,7 @@
                           </w:sdt>
                           <w:p>
                             <w:pPr>
-                              <w:pStyle w:val="Subtitle"/>
+                              <w:pStyle w:val="a6"/>
                               <w:spacing w:after="120" w:line="240" w:lineRule="auto"/>
                               <w:ind w:left="706" w:right="720"/>
                               <w:jc w:val="center"/>
@@ -132,6 +133,7 @@
                                 <w:dataBinding w:prefixMappings="xmlns:ns0='http://purl.org/dc/elements/1.1/' xmlns:ns1='http://schemas.openxmlformats.org/package/2006/metadata/core-properties' " w:xpath="/ns1:coreProperties[1]/ns0:subject[1]" w:storeItemID="{6C3C8BC8-F283-45AE-878A-BAB7291924A1}"/>
                                 <w:text/>
                               </w:sdtPr>
+                              <w:sdtEndPr/>
                               <w:sdtContent>
                                 <w:r>
                                   <w:rPr>
@@ -495,6 +497,7 @@
                               <w:dataBinding w:prefixMappings="xmlns:ns0='http://schemas.microsoft.com/office/2006/coverPageProps'" w:xpath="/ns0:CoverPageProperties[1]/ns0:Abstract[1]" w:storeItemID="{55AF091B-3C7A-41E3-B477-F2FDAA23CFDA}"/>
                               <w:text/>
                             </w:sdtPr>
+                            <w:sdtEndPr/>
                             <w:sdtContent>
                               <w:p>
                                 <w:pPr>
@@ -569,7 +572,7 @@
                 <v:stroke joinstyle="miter"/>
                 <v:path gradientshapeok="t" o:connecttype="rect"/>
               </v:shapetype>
-              <v:shape id="Text Box 14" o:spid="_x0000_s1026" type="#_x0000_t202" alt="Report title" style="position:absolute;margin-left:36.5pt;margin-top:90.15pt;width:540pt;height:141.5pt;z-index:-251641856;visibility:visible;mso-wrap-style:square;mso-width-percent:0;mso-height-percent:0;mso-wrap-distance-left:9pt;mso-wrap-distance-top:0;mso-wrap-distance-right:9pt;mso-wrap-distance-bottom:0;mso-position-horizontal:absolute;mso-position-horizontal-relative:page;mso-position-vertical:absolute;mso-position-vertical-relative:margin;mso-width-percent:0;mso-height-percent:0;mso-width-relative:margin;mso-height-relative:margin;v-text-anchor:bottom" o:gfxdata="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" o:allowoverlap="f" filled="f" stroked="f">
+              <v:shape id="Text Box 14" o:spid="_x0000_s1026" type="#_x0000_t202" alt="Report title" style="position:absolute;margin-left:36.5pt;margin-top:90.15pt;width:540pt;height:141.5pt;z-index:-251641856;visibility:visible;mso-wrap-style:square;mso-width-percent:0;mso-height-percent:0;mso-wrap-distance-left:9pt;mso-wrap-distance-top:0;mso-wrap-distance-right:9pt;mso-wrap-distance-bottom:0;mso-position-horizontal:absolute;mso-position-horizontal-relative:page;mso-position-vertical:absolute;mso-position-vertical-relative:margin;mso-width-percent:0;mso-height-percent:0;mso-width-relative:margin;mso-height-relative:margin;v-text-anchor:bottom" o:gfxdata="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" o:allowoverlap="f" filled="f" stroked="f">
                 <v:textbox inset="0,0,0,0">
                   <w:txbxContent>
                     <w:sdt>
@@ -587,10 +590,11 @@
                         <w:dataBinding w:prefixMappings="xmlns:ns0='http://purl.org/dc/elements/1.1/' xmlns:ns1='http://schemas.openxmlformats.org/package/2006/metadata/core-properties' " w:xpath="/ns1:coreProperties[1]/ns0:title[1]" w:storeItemID="{6C3C8BC8-F283-45AE-878A-BAB7291924A1}"/>
                         <w:text/>
                       </w:sdtPr>
+                      <w:sdtEndPr/>
                       <w:sdtContent>
                         <w:p>
                           <w:pPr>
-                            <w:pStyle w:val="Title"/>
+                            <w:pStyle w:val="a9"/>
                             <w:jc w:val="center"/>
                             <w:rPr>
                               <w:sz w:val="56"/>
@@ -609,7 +613,7 @@
                     </w:sdt>
                     <w:p>
                       <w:pPr>
-                        <w:pStyle w:val="Subtitle"/>
+                        <w:pStyle w:val="a6"/>
                         <w:spacing w:after="120" w:line="240" w:lineRule="auto"/>
                         <w:ind w:left="706" w:right="720"/>
                         <w:jc w:val="center"/>
@@ -645,6 +649,7 @@
                           <w:dataBinding w:prefixMappings="xmlns:ns0='http://purl.org/dc/elements/1.1/' xmlns:ns1='http://schemas.openxmlformats.org/package/2006/metadata/core-properties' " w:xpath="/ns1:coreProperties[1]/ns0:subject[1]" w:storeItemID="{6C3C8BC8-F283-45AE-878A-BAB7291924A1}"/>
                           <w:text/>
                         </w:sdtPr>
+                        <w:sdtEndPr/>
                         <w:sdtContent>
                           <w:r>
                             <w:rPr>
@@ -1008,6 +1013,7 @@
                         <w:dataBinding w:prefixMappings="xmlns:ns0='http://schemas.microsoft.com/office/2006/coverPageProps'" w:xpath="/ns0:CoverPageProperties[1]/ns0:Abstract[1]" w:storeItemID="{55AF091B-3C7A-41E3-B477-F2FDAA23CFDA}"/>
                         <w:text/>
                       </w:sdtPr>
+                      <w:sdtEndPr/>
                       <w:sdtContent>
                         <w:p>
                           <w:pPr>
@@ -1228,7 +1234,7 @@
           </mc:Choice>
           <mc:Fallback>
             <w:pict>
-              <v:shape w14:anchorId="6466823C" id="Text Box 2" o:spid="_x0000_s1027" type="#_x0000_t202" style="position:absolute;margin-left:40.3pt;margin-top:4.65pt;width:545.45pt;height:87.55pt;z-index:251679744;visibility:visible;mso-wrap-style:square;mso-width-percent:0;mso-height-percent:0;mso-wrap-distance-left:9pt;mso-wrap-distance-top:7.2pt;mso-wrap-distance-right:9pt;mso-wrap-distance-bottom:7.2pt;mso-position-horizontal:absolute;mso-position-horizontal-relative:page;mso-position-vertical:absolute;mso-position-vertical-relative:text;mso-width-percent:0;mso-height-percent:0;mso-width-relative:margin;mso-height-relative:margin;v-text-anchor:top" o:gfxdata="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" filled="f" stroked="f">
+              <v:shape w14:anchorId="6466823C" id="Text Box 2" o:spid="_x0000_s1027" type="#_x0000_t202" style="position:absolute;margin-left:40.3pt;margin-top:4.65pt;width:545.45pt;height:87.55pt;z-index:251679744;visibility:visible;mso-wrap-style:square;mso-width-percent:0;mso-height-percent:0;mso-wrap-distance-left:9pt;mso-wrap-distance-top:7.2pt;mso-wrap-distance-right:9pt;mso-wrap-distance-bottom:7.2pt;mso-position-horizontal:absolute;mso-position-horizontal-relative:page;mso-position-vertical:absolute;mso-position-vertical-relative:text;mso-width-percent:0;mso-height-percent:0;mso-width-relative:margin;mso-height-relative:margin;v-text-anchor:top" o:gfxdata="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" filled="f" stroked="f">
                 <v:textbox>
                   <w:txbxContent>
                     <w:p>
@@ -1346,6 +1352,7 @@
           <w:docPartUnique/>
         </w:docPartObj>
       </w:sdtPr>
+      <w:sdtEndPr/>
       <w:sdtContent>
         <w:p/>
         <w:p>
@@ -1363,7 +1370,7 @@
             <mc:AlternateContent>
               <mc:Choice Requires="wpg">
                 <w:drawing>
-                  <wp:anchor distT="45720" distB="45720" distL="182880" distR="182880" simplePos="0" relativeHeight="251677696" behindDoc="0" locked="0" layoutInCell="1" allowOverlap="1" wp14:anchorId="31857F9A" wp14:editId="7C4DFF5D">
+                  <wp:anchor distT="45720" distB="45720" distL="182880" distR="182880" simplePos="0" relativeHeight="251677696" behindDoc="0" locked="0" layoutInCell="1" allowOverlap="1" wp14:anchorId="31857F9A" wp14:editId="6864EF05">
                     <wp:simplePos x="0" y="0"/>
                     <wp:positionH relativeFrom="margin">
                       <wp:posOffset>-1292860</wp:posOffset>
@@ -1372,7 +1379,7 @@
                       <wp:posOffset>4211955</wp:posOffset>
                     </wp:positionV>
                     <wp:extent cx="6581775" cy="3919220"/>
-                    <wp:effectExtent l="0" t="0" r="9525" b="5080"/>
+                    <wp:effectExtent l="0" t="0" r="0" b="5080"/>
                     <wp:wrapSquare wrapText="bothSides"/>
                     <wp:docPr id="198" name="Group 198"/>
                     <wp:cNvGraphicFramePr/>
@@ -1491,7 +1498,7 @@
                               <w:txbxContent>
                                 <w:p>
                                   <w:pPr>
-                                    <w:pStyle w:val="ListParagraph"/>
+                                    <w:pStyle w:val="af5"/>
                                     <w:numPr>
                                       <w:ilvl w:val="0"/>
                                       <w:numId w:val="6"/>
@@ -1560,7 +1567,7 @@
                                 </w:p>
                                 <w:p>
                                   <w:pPr>
-                                    <w:pStyle w:val="ListParagraph"/>
+                                    <w:pStyle w:val="af5"/>
                                     <w:numPr>
                                       <w:ilvl w:val="0"/>
                                       <w:numId w:val="6"/>
@@ -1581,7 +1588,7 @@
                                 </w:p>
                                 <w:p>
                                   <w:pPr>
-                                    <w:pStyle w:val="ListParagraph"/>
+                                    <w:pStyle w:val="af5"/>
                                     <w:numPr>
                                       <w:ilvl w:val="0"/>
                                       <w:numId w:val="6"/>
@@ -1693,7 +1700,7 @@
                                 </w:p>
                                 <w:p>
                                   <w:pPr>
-                                    <w:pStyle w:val="ListParagraph"/>
+                                    <w:pStyle w:val="af5"/>
                                     <w:numPr>
                                       <w:ilvl w:val="0"/>
                                       <w:numId w:val="6"/>
@@ -1715,7 +1722,7 @@
                                 </w:p>
                                 <w:p>
                                   <w:pPr>
-                                    <w:pStyle w:val="ListParagraph"/>
+                                    <w:pStyle w:val="af5"/>
                                     <w:numPr>
                                       <w:ilvl w:val="0"/>
                                       <w:numId w:val="6"/>
@@ -1743,7 +1750,7 @@
                                 </w:p>
                                 <w:p>
                                   <w:pPr>
-                                    <w:pStyle w:val="ListParagraph"/>
+                                    <w:pStyle w:val="af5"/>
                                     <w:numPr>
                                       <w:ilvl w:val="0"/>
                                       <w:numId w:val="6"/>
@@ -1765,7 +1772,7 @@
                                 </w:p>
                                 <w:p>
                                   <w:pPr>
-                                    <w:pStyle w:val="ListParagraph"/>
+                                    <w:pStyle w:val="af5"/>
                                     <w:numPr>
                                       <w:ilvl w:val="0"/>
                                       <w:numId w:val="6"/>
@@ -1812,7 +1819,7 @@
                                 </w:p>
                                 <w:p>
                                   <w:pPr>
-                                    <w:pStyle w:val="ListParagraph"/>
+                                    <w:pStyle w:val="af5"/>
                                     <w:numPr>
                                       <w:ilvl w:val="0"/>
                                       <w:numId w:val="6"/>
@@ -1834,7 +1841,7 @@
                                 </w:p>
                                 <w:p>
                                   <w:pPr>
-                                    <w:pStyle w:val="ListParagraph"/>
+                                    <w:pStyle w:val="af5"/>
                                     <w:numPr>
                                       <w:ilvl w:val="0"/>
                                       <w:numId w:val="6"/>
@@ -1874,7 +1881,7 @@
                                 </w:p>
                                 <w:p>
                                   <w:pPr>
-                                    <w:pStyle w:val="ListParagraph"/>
+                                    <w:pStyle w:val="af5"/>
                                     <w:numPr>
                                       <w:ilvl w:val="0"/>
                                       <w:numId w:val="6"/>
@@ -1936,8 +1943,8 @@
               </mc:Choice>
               <mc:Fallback>
                 <w:pict>
-                  <v:group w14:anchorId="31857F9A" id="Group 198" o:spid="_x0000_s1028" style="position:absolute;margin-left:-101.8pt;margin-top:331.65pt;width:518.25pt;height:308.6pt;z-index:251677696;mso-wrap-distance-left:14.4pt;mso-wrap-distance-top:3.6pt;mso-wrap-distance-right:14.4pt;mso-wrap-distance-bottom:3.6pt;mso-position-horizontal-relative:margin;mso-position-vertical-relative:margin;mso-width-relative:margin;mso-height-relative:margin" coordorigin=",228" coordsize="35784,21867" o:gfxdata="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">
-                    <v:rect id="Rectangle 199" o:spid="_x0000_s1029" style="position:absolute;top:228;width:35674;height:1949;visibility:visible;mso-wrap-style:square;v-text-anchor:middle" o:gfxdata="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" fillcolor="#ef4623 [3204]" stroked="f" strokeweight="2pt">
+                  <v:group w14:anchorId="31857F9A" id="Group 198" o:spid="_x0000_s1028" style="position:absolute;margin-left:-101.8pt;margin-top:331.65pt;width:518.25pt;height:308.6pt;z-index:251677696;mso-wrap-distance-left:14.4pt;mso-wrap-distance-top:3.6pt;mso-wrap-distance-right:14.4pt;mso-wrap-distance-bottom:3.6pt;mso-position-horizontal-relative:margin;mso-position-vertical-relative:margin;mso-width-relative:margin;mso-height-relative:margin" coordorigin=",228" coordsize="35784,21867" o:gfxdata="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">
+                    <v:rect id="Rectangle 199" o:spid="_x0000_s1029" style="position:absolute;top:228;width:35674;height:1949;visibility:visible;mso-wrap-style:square;v-text-anchor:middle" o:gfxdata="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" fillcolor="#ef4623 [3204]" stroked="f" strokeweight="2pt">
                       <v:textbox>
                         <w:txbxContent>
                           <w:p>
@@ -1966,12 +1973,12 @@
                         </w:txbxContent>
                       </v:textbox>
                     </v:rect>
-                    <v:shape id="Text Box 200" o:spid="_x0000_s1030" type="#_x0000_t202" style="position:absolute;top:2187;width:35784;height:19908;visibility:visible;mso-wrap-style:square;v-text-anchor:top" o:gfxdata="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" filled="f" stroked="f" strokeweight=".5pt">
+                    <v:shape id="Text Box 200" o:spid="_x0000_s1030" type="#_x0000_t202" style="position:absolute;top:2187;width:35784;height:19908;visibility:visible;mso-wrap-style:square;v-text-anchor:top" o:gfxdata="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" filled="f" stroked="f" strokeweight=".5pt">
                       <v:textbox inset=",7.2pt,,0">
                         <w:txbxContent>
                           <w:p>
                             <w:pPr>
-                              <w:pStyle w:val="ListParagraph"/>
+                              <w:pStyle w:val="af5"/>
                               <w:numPr>
                                 <w:ilvl w:val="0"/>
                                 <w:numId w:val="6"/>
@@ -2040,7 +2047,7 @@
                           </w:p>
                           <w:p>
                             <w:pPr>
-                              <w:pStyle w:val="ListParagraph"/>
+                              <w:pStyle w:val="af5"/>
                               <w:numPr>
                                 <w:ilvl w:val="0"/>
                                 <w:numId w:val="6"/>
@@ -2061,7 +2068,7 @@
                           </w:p>
                           <w:p>
                             <w:pPr>
-                              <w:pStyle w:val="ListParagraph"/>
+                              <w:pStyle w:val="af5"/>
                               <w:numPr>
                                 <w:ilvl w:val="0"/>
                                 <w:numId w:val="6"/>
@@ -2173,7 +2180,7 @@
                           </w:p>
                           <w:p>
                             <w:pPr>
-                              <w:pStyle w:val="ListParagraph"/>
+                              <w:pStyle w:val="af5"/>
                               <w:numPr>
                                 <w:ilvl w:val="0"/>
                                 <w:numId w:val="6"/>
@@ -2195,7 +2202,7 @@
                           </w:p>
                           <w:p>
                             <w:pPr>
-                              <w:pStyle w:val="ListParagraph"/>
+                              <w:pStyle w:val="af5"/>
                               <w:numPr>
                                 <w:ilvl w:val="0"/>
                                 <w:numId w:val="6"/>
@@ -2223,7 +2230,7 @@
                           </w:p>
                           <w:p>
                             <w:pPr>
-                              <w:pStyle w:val="ListParagraph"/>
+                              <w:pStyle w:val="af5"/>
                               <w:numPr>
                                 <w:ilvl w:val="0"/>
                                 <w:numId w:val="6"/>
@@ -2245,7 +2252,7 @@
                           </w:p>
                           <w:p>
                             <w:pPr>
-                              <w:pStyle w:val="ListParagraph"/>
+                              <w:pStyle w:val="af5"/>
                               <w:numPr>
                                 <w:ilvl w:val="0"/>
                                 <w:numId w:val="6"/>
@@ -2292,7 +2299,7 @@
                           </w:p>
                           <w:p>
                             <w:pPr>
-                              <w:pStyle w:val="ListParagraph"/>
+                              <w:pStyle w:val="af5"/>
                               <w:numPr>
                                 <w:ilvl w:val="0"/>
                                 <w:numId w:val="6"/>
@@ -2314,7 +2321,7 @@
                           </w:p>
                           <w:p>
                             <w:pPr>
-                              <w:pStyle w:val="ListParagraph"/>
+                              <w:pStyle w:val="af5"/>
                               <w:numPr>
                                 <w:ilvl w:val="0"/>
                                 <w:numId w:val="6"/>
@@ -2354,7 +2361,7 @@
                           </w:p>
                           <w:p>
                             <w:pPr>
-                              <w:pStyle w:val="ListParagraph"/>
+                              <w:pStyle w:val="af5"/>
                               <w:numPr>
                                 <w:ilvl w:val="0"/>
                                 <w:numId w:val="6"/>
@@ -2471,6 +2478,7 @@
                                     <w:dataBinding w:prefixMappings="xmlns:ns0='http://schemas.openxmlformats.org/officeDocument/2006/extended-properties' " w:xpath="/ns0:Properties[1]/ns0:Company[1]" w:storeItemID="{6668398D-A668-4E3E-A5EB-62B293D839F1}"/>
                                     <w:text/>
                                   </w:sdtPr>
+                                  <w:sdtEndPr/>
                                   <w:sdtContent>
                                     <w:r>
                                       <w:t>Student Details:                                            CRN:</w:t>
@@ -2501,9 +2509,9 @@
                                   <w:tblLook w:val="04A0" w:firstRow="1" w:lastRow="0" w:firstColumn="1" w:lastColumn="0" w:noHBand="0" w:noVBand="1"/>
                                 </w:tblPr>
                                 <w:tblGrid>
-                                  <w:gridCol w:w="3596"/>
-                                  <w:gridCol w:w="3597"/>
-                                  <w:gridCol w:w="3597"/>
+                                  <w:gridCol w:w="3591"/>
+                                  <w:gridCol w:w="3592"/>
+                                  <w:gridCol w:w="3592"/>
                                 </w:tblGrid>
                                 <w:tr>
                                   <w:trPr>
@@ -2542,7 +2550,7 @@
                                     </w:tcPr>
                                     <w:p>
                                       <w:pPr>
-                                        <w:pStyle w:val="Footer"/>
+                                        <w:pStyle w:val="a5"/>
                                         <w:rPr>
                                           <w:b/>
                                           <w:bCs/>
@@ -2575,12 +2583,32 @@
                                           <w:sz w:val="28"/>
                                           <w:szCs w:val="28"/>
                                         </w:rPr>
-                                        <w:t xml:space="preserve">Bushra Alshayeb </w:t>
+                                        <w:t xml:space="preserve">Bushra </w:t>
+                                      </w:r>
+                                      <w:proofErr w:type="spellStart"/>
+                                      <w:r>
+                                        <w:rPr>
+                                          <w:b/>
+                                          <w:bCs/>
+                                          <w:sz w:val="28"/>
+                                          <w:szCs w:val="28"/>
+                                        </w:rPr>
+                                        <w:t>Alshayeb</w:t>
+                                      </w:r>
+                                      <w:proofErr w:type="spellEnd"/>
+                                      <w:r>
+                                        <w:rPr>
+                                          <w:b/>
+                                          <w:bCs/>
+                                          <w:sz w:val="28"/>
+                                          <w:szCs w:val="28"/>
+                                        </w:rPr>
+                                        <w:t xml:space="preserve"> </w:t>
                                       </w:r>
                                     </w:p>
                                     <w:p>
                                       <w:pPr>
-                                        <w:pStyle w:val="Footer"/>
+                                        <w:pStyle w:val="a5"/>
                                         <w:rPr>
                                           <w:b/>
                                           <w:bCs/>
@@ -2604,12 +2632,23 @@
                                           <w:sz w:val="28"/>
                                           <w:szCs w:val="28"/>
                                         </w:rPr>
-                                        <w:t>Gala Algodah</w:t>
+                                        <w:t xml:space="preserve">Gala </w:t>
                                       </w:r>
+                                      <w:proofErr w:type="spellStart"/>
+                                      <w:r>
+                                        <w:rPr>
+                                          <w:b/>
+                                          <w:bCs/>
+                                          <w:sz w:val="28"/>
+                                          <w:szCs w:val="28"/>
+                                        </w:rPr>
+                                        <w:t>Algodah</w:t>
+                                      </w:r>
+                                      <w:proofErr w:type="spellEnd"/>
                                     </w:p>
                                     <w:p>
                                       <w:pPr>
-                                        <w:pStyle w:val="Footer"/>
+                                        <w:pStyle w:val="a5"/>
                                         <w:rPr>
                                           <w:b/>
                                           <w:bCs/>
@@ -2629,7 +2668,7 @@
                                     </w:p>
                                     <w:p>
                                       <w:pPr>
-                                        <w:pStyle w:val="Footer"/>
+                                        <w:pStyle w:val="a5"/>
                                         <w:rPr>
                                           <w:b/>
                                           <w:bCs/>
@@ -2649,7 +2688,7 @@
                                     </w:p>
                                     <w:p>
                                       <w:pPr>
-                                        <w:pStyle w:val="Footer"/>
+                                        <w:pStyle w:val="a5"/>
                                         <w:rPr>
                                           <w:b/>
                                           <w:bCs/>
@@ -2677,7 +2716,7 @@
                                     </w:tcPr>
                                     <w:p>
                                       <w:pPr>
-                                        <w:pStyle w:val="Footer"/>
+                                        <w:pStyle w:val="a5"/>
                                         <w:ind w:left="0"/>
                                         <w:rPr>
                                           <w:b/>
@@ -2695,7 +2734,7 @@
                                     </w:tcPr>
                                     <w:p>
                                       <w:pPr>
-                                        <w:pStyle w:val="Footer"/>
+                                        <w:pStyle w:val="a5"/>
                                         <w:rPr>
                                           <w:b/>
                                           <w:bCs/>
@@ -2724,7 +2763,7 @@
                                     </w:p>
                                     <w:p>
                                       <w:pPr>
-                                        <w:pStyle w:val="Footer"/>
+                                        <w:pStyle w:val="a5"/>
                                         <w:rPr>
                                           <w:b/>
                                           <w:bCs/>
@@ -2753,7 +2792,7 @@
                                     </w:p>
                                     <w:p>
                                       <w:pPr>
-                                        <w:pStyle w:val="Footer"/>
+                                        <w:pStyle w:val="a5"/>
                                         <w:rPr>
                                           <w:b/>
                                           <w:bCs/>
@@ -2773,7 +2812,7 @@
                                     </w:p>
                                     <w:p>
                                       <w:pPr>
-                                        <w:pStyle w:val="Footer"/>
+                                        <w:pStyle w:val="a5"/>
                                         <w:rPr>
                                           <w:b/>
                                           <w:bCs/>
@@ -2793,7 +2832,7 @@
                                     </w:p>
                                     <w:p>
                                       <w:pPr>
-                                        <w:pStyle w:val="Footer"/>
+                                        <w:pStyle w:val="a5"/>
                                         <w:rPr>
                                           <w:b/>
                                           <w:bCs/>
@@ -2813,7 +2852,7 @@
                                     </w:p>
                                     <w:p>
                                       <w:pPr>
-                                        <w:pStyle w:val="Footer"/>
+                                        <w:pStyle w:val="a5"/>
                                         <w:rPr>
                                           <w:b/>
                                           <w:bCs/>
@@ -2835,7 +2874,7 @@
                                     </w:tcPr>
                                     <w:p>
                                       <w:pPr>
-                                        <w:pStyle w:val="Footer"/>
+                                        <w:pStyle w:val="a5"/>
                                         <w:rPr>
                                           <w:b/>
                                           <w:bCs/>
@@ -2854,7 +2893,7 @@
                                     </w:tcPr>
                                     <w:p>
                                       <w:pPr>
-                                        <w:pStyle w:val="Footer"/>
+                                        <w:pStyle w:val="a5"/>
                                         <w:ind w:left="0"/>
                                         <w:rPr>
                                           <w:b/>
@@ -2872,7 +2911,7 @@
                                     </w:tcPr>
                                     <w:p>
                                       <w:pPr>
-                                        <w:pStyle w:val="Footer"/>
+                                        <w:pStyle w:val="a5"/>
                                         <w:rPr>
                                           <w:b/>
                                           <w:bCs/>
@@ -2895,7 +2934,7 @@
                                     </w:tcPr>
                                     <w:p>
                                       <w:pPr>
-                                        <w:pStyle w:val="Footer"/>
+                                        <w:pStyle w:val="a5"/>
                                       </w:pPr>
                                     </w:p>
                                   </w:tc>
@@ -2906,7 +2945,7 @@
                                     </w:tcPr>
                                     <w:p>
                                       <w:pPr>
-                                        <w:pStyle w:val="Footer"/>
+                                        <w:pStyle w:val="a5"/>
                                       </w:pPr>
                                     </w:p>
                                   </w:tc>
@@ -2917,7 +2956,7 @@
                                     </w:tcPr>
                                     <w:p>
                                       <w:pPr>
-                                        <w:pStyle w:val="Footer"/>
+                                        <w:pStyle w:val="a5"/>
                                       </w:pPr>
                                     </w:p>
                                   </w:tc>
@@ -2925,7 +2964,7 @@
                               </w:tbl>
                               <w:p>
                                 <w:pPr>
-                                  <w:pStyle w:val="NoSpacing"/>
+                                  <w:pStyle w:val="ad"/>
                                 </w:pPr>
                               </w:p>
                             </w:txbxContent>
@@ -2950,7 +2989,7 @@
               </mc:Choice>
               <mc:Fallback>
                 <w:pict>
-                  <v:shape w14:anchorId="7CBAAF0B" id="Text Box 15" o:spid="_x0000_s1031" type="#_x0000_t202" alt="contact info" style="position:absolute;margin-left:36.5pt;margin-top:226.65pt;width:540pt;height:114pt;z-index:251675648;visibility:visible;mso-wrap-style:square;mso-width-percent:1282;mso-height-percent:0;mso-wrap-distance-left:9pt;mso-wrap-distance-top:0;mso-wrap-distance-right:9pt;mso-wrap-distance-bottom:0;mso-position-horizontal:absolute;mso-position-horizontal-relative:page;mso-position-vertical:absolute;mso-position-vertical-relative:margin;mso-width-percent:1282;mso-height-percent:0;mso-width-relative:margin;mso-height-relative:margin;v-text-anchor:bottom" o:gfxdata="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" o:allowoverlap="f" filled="f" stroked="f" strokeweight=".5pt">
+                  <v:shape w14:anchorId="7CBAAF0B" id="Text Box 15" o:spid="_x0000_s1031" type="#_x0000_t202" alt="contact info" style="position:absolute;margin-left:36.5pt;margin-top:226.65pt;width:540pt;height:114pt;z-index:251675648;visibility:visible;mso-wrap-style:square;mso-width-percent:1282;mso-height-percent:0;mso-wrap-distance-left:9pt;mso-wrap-distance-top:0;mso-wrap-distance-right:9pt;mso-wrap-distance-bottom:0;mso-position-horizontal:absolute;mso-position-horizontal-relative:page;mso-position-vertical:absolute;mso-position-vertical-relative:margin;mso-width-percent:1282;mso-height-percent:0;mso-width-relative:margin;mso-height-relative:margin;v-text-anchor:bottom" o:gfxdata="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" o:allowoverlap="f" filled="f" stroked="f" strokeweight=".5pt">
                     <v:textbox inset="0,0,0,0">
                       <w:txbxContent>
                         <w:p>
@@ -2965,6 +3004,7 @@
                               <w:dataBinding w:prefixMappings="xmlns:ns0='http://schemas.openxmlformats.org/officeDocument/2006/extended-properties' " w:xpath="/ns0:Properties[1]/ns0:Company[1]" w:storeItemID="{6668398D-A668-4E3E-A5EB-62B293D839F1}"/>
                               <w:text/>
                             </w:sdtPr>
+                            <w:sdtEndPr/>
                             <w:sdtContent>
                               <w:r>
                                 <w:t>Student Details:                                            CRN:</w:t>
@@ -2995,9 +3035,9 @@
                             <w:tblLook w:val="04A0" w:firstRow="1" w:lastRow="0" w:firstColumn="1" w:lastColumn="0" w:noHBand="0" w:noVBand="1"/>
                           </w:tblPr>
                           <w:tblGrid>
-                            <w:gridCol w:w="3596"/>
-                            <w:gridCol w:w="3597"/>
-                            <w:gridCol w:w="3597"/>
+                            <w:gridCol w:w="3591"/>
+                            <w:gridCol w:w="3592"/>
+                            <w:gridCol w:w="3592"/>
                           </w:tblGrid>
                           <w:tr>
                             <w:trPr>
@@ -3036,7 +3076,7 @@
                               </w:tcPr>
                               <w:p>
                                 <w:pPr>
-                                  <w:pStyle w:val="Footer"/>
+                                  <w:pStyle w:val="a5"/>
                                   <w:rPr>
                                     <w:b/>
                                     <w:bCs/>
@@ -3069,12 +3109,32 @@
                                     <w:sz w:val="28"/>
                                     <w:szCs w:val="28"/>
                                   </w:rPr>
-                                  <w:t xml:space="preserve">Bushra Alshayeb </w:t>
+                                  <w:t xml:space="preserve">Bushra </w:t>
+                                </w:r>
+                                <w:proofErr w:type="spellStart"/>
+                                <w:r>
+                                  <w:rPr>
+                                    <w:b/>
+                                    <w:bCs/>
+                                    <w:sz w:val="28"/>
+                                    <w:szCs w:val="28"/>
+                                  </w:rPr>
+                                  <w:t>Alshayeb</w:t>
+                                </w:r>
+                                <w:proofErr w:type="spellEnd"/>
+                                <w:r>
+                                  <w:rPr>
+                                    <w:b/>
+                                    <w:bCs/>
+                                    <w:sz w:val="28"/>
+                                    <w:szCs w:val="28"/>
+                                  </w:rPr>
+                                  <w:t xml:space="preserve"> </w:t>
                                 </w:r>
                               </w:p>
                               <w:p>
                                 <w:pPr>
-                                  <w:pStyle w:val="Footer"/>
+                                  <w:pStyle w:val="a5"/>
                                   <w:rPr>
                                     <w:b/>
                                     <w:bCs/>
@@ -3098,12 +3158,23 @@
                                     <w:sz w:val="28"/>
                                     <w:szCs w:val="28"/>
                                   </w:rPr>
-                                  <w:t>Gala Algodah</w:t>
+                                  <w:t xml:space="preserve">Gala </w:t>
                                 </w:r>
+                                <w:proofErr w:type="spellStart"/>
+                                <w:r>
+                                  <w:rPr>
+                                    <w:b/>
+                                    <w:bCs/>
+                                    <w:sz w:val="28"/>
+                                    <w:szCs w:val="28"/>
+                                  </w:rPr>
+                                  <w:t>Algodah</w:t>
+                                </w:r>
+                                <w:proofErr w:type="spellEnd"/>
                               </w:p>
                               <w:p>
                                 <w:pPr>
-                                  <w:pStyle w:val="Footer"/>
+                                  <w:pStyle w:val="a5"/>
                                   <w:rPr>
                                     <w:b/>
                                     <w:bCs/>
@@ -3123,7 +3194,7 @@
                               </w:p>
                               <w:p>
                                 <w:pPr>
-                                  <w:pStyle w:val="Footer"/>
+                                  <w:pStyle w:val="a5"/>
                                   <w:rPr>
                                     <w:b/>
                                     <w:bCs/>
@@ -3143,7 +3214,7 @@
                               </w:p>
                               <w:p>
                                 <w:pPr>
-                                  <w:pStyle w:val="Footer"/>
+                                  <w:pStyle w:val="a5"/>
                                   <w:rPr>
                                     <w:b/>
                                     <w:bCs/>
@@ -3171,7 +3242,7 @@
                               </w:tcPr>
                               <w:p>
                                 <w:pPr>
-                                  <w:pStyle w:val="Footer"/>
+                                  <w:pStyle w:val="a5"/>
                                   <w:ind w:left="0"/>
                                   <w:rPr>
                                     <w:b/>
@@ -3189,7 +3260,7 @@
                               </w:tcPr>
                               <w:p>
                                 <w:pPr>
-                                  <w:pStyle w:val="Footer"/>
+                                  <w:pStyle w:val="a5"/>
                                   <w:rPr>
                                     <w:b/>
                                     <w:bCs/>
@@ -3218,7 +3289,7 @@
                               </w:p>
                               <w:p>
                                 <w:pPr>
-                                  <w:pStyle w:val="Footer"/>
+                                  <w:pStyle w:val="a5"/>
                                   <w:rPr>
                                     <w:b/>
                                     <w:bCs/>
@@ -3247,7 +3318,7 @@
                               </w:p>
                               <w:p>
                                 <w:pPr>
-                                  <w:pStyle w:val="Footer"/>
+                                  <w:pStyle w:val="a5"/>
                                   <w:rPr>
                                     <w:b/>
                                     <w:bCs/>
@@ -3267,7 +3338,7 @@
                               </w:p>
                               <w:p>
                                 <w:pPr>
-                                  <w:pStyle w:val="Footer"/>
+                                  <w:pStyle w:val="a5"/>
                                   <w:rPr>
                                     <w:b/>
                                     <w:bCs/>
@@ -3287,7 +3358,7 @@
                               </w:p>
                               <w:p>
                                 <w:pPr>
-                                  <w:pStyle w:val="Footer"/>
+                                  <w:pStyle w:val="a5"/>
                                   <w:rPr>
                                     <w:b/>
                                     <w:bCs/>
@@ -3307,7 +3378,7 @@
                               </w:p>
                               <w:p>
                                 <w:pPr>
-                                  <w:pStyle w:val="Footer"/>
+                                  <w:pStyle w:val="a5"/>
                                   <w:rPr>
                                     <w:b/>
                                     <w:bCs/>
@@ -3329,7 +3400,7 @@
                               </w:tcPr>
                               <w:p>
                                 <w:pPr>
-                                  <w:pStyle w:val="Footer"/>
+                                  <w:pStyle w:val="a5"/>
                                   <w:rPr>
                                     <w:b/>
                                     <w:bCs/>
@@ -3348,7 +3419,7 @@
                               </w:tcPr>
                               <w:p>
                                 <w:pPr>
-                                  <w:pStyle w:val="Footer"/>
+                                  <w:pStyle w:val="a5"/>
                                   <w:ind w:left="0"/>
                                   <w:rPr>
                                     <w:b/>
@@ -3366,7 +3437,7 @@
                               </w:tcPr>
                               <w:p>
                                 <w:pPr>
-                                  <w:pStyle w:val="Footer"/>
+                                  <w:pStyle w:val="a5"/>
                                   <w:rPr>
                                     <w:b/>
                                     <w:bCs/>
@@ -3389,7 +3460,7 @@
                               </w:tcPr>
                               <w:p>
                                 <w:pPr>
-                                  <w:pStyle w:val="Footer"/>
+                                  <w:pStyle w:val="a5"/>
                                 </w:pPr>
                               </w:p>
                             </w:tc>
@@ -3400,7 +3471,7 @@
                               </w:tcPr>
                               <w:p>
                                 <w:pPr>
-                                  <w:pStyle w:val="Footer"/>
+                                  <w:pStyle w:val="a5"/>
                                 </w:pPr>
                               </w:p>
                             </w:tc>
@@ -3411,7 +3482,7 @@
                               </w:tcPr>
                               <w:p>
                                 <w:pPr>
-                                  <w:pStyle w:val="Footer"/>
+                                  <w:pStyle w:val="a5"/>
                                 </w:pPr>
                               </w:p>
                             </w:tc>
@@ -3419,7 +3490,7 @@
                         </w:tbl>
                         <w:p>
                           <w:pPr>
-                            <w:pStyle w:val="NoSpacing"/>
+                            <w:pStyle w:val="ad"/>
                           </w:pPr>
                         </w:p>
                       </w:txbxContent>
@@ -3455,7 +3526,7 @@
     </w:p>
     <w:p>
       <w:pPr>
-        <w:pStyle w:val="Heading1"/>
+        <w:pStyle w:val="1"/>
       </w:pPr>
       <w:r>
         <w:lastRenderedPageBreak/>
@@ -3464,7 +3535,7 @@
     </w:p>
     <w:p>
       <w:pPr>
-        <w:pStyle w:val="ListParagraph"/>
+        <w:pStyle w:val="af5"/>
         <w:numPr>
           <w:ilvl w:val="0"/>
           <w:numId w:val="20"/>
@@ -3488,7 +3559,7 @@
     </w:p>
     <w:p>
       <w:pPr>
-        <w:pStyle w:val="ListParagraph"/>
+        <w:pStyle w:val="af5"/>
         <w:rPr>
           <w:sz w:val="24"/>
           <w:szCs w:val="24"/>
@@ -3504,7 +3575,7 @@
     </w:p>
     <w:p>
       <w:pPr>
-        <w:pStyle w:val="ListParagraph"/>
+        <w:pStyle w:val="af5"/>
         <w:numPr>
           <w:ilvl w:val="1"/>
           <w:numId w:val="20"/>
@@ -3524,7 +3595,7 @@
     </w:p>
     <w:p>
       <w:pPr>
-        <w:pStyle w:val="ListParagraph"/>
+        <w:pStyle w:val="af5"/>
         <w:numPr>
           <w:ilvl w:val="1"/>
           <w:numId w:val="20"/>
@@ -3544,7 +3615,7 @@
     </w:p>
     <w:p>
       <w:pPr>
-        <w:pStyle w:val="ListParagraph"/>
+        <w:pStyle w:val="af5"/>
         <w:numPr>
           <w:ilvl w:val="1"/>
           <w:numId w:val="20"/>
@@ -3564,7 +3635,7 @@
     </w:p>
     <w:p>
       <w:pPr>
-        <w:pStyle w:val="ListParagraph"/>
+        <w:pStyle w:val="af5"/>
         <w:numPr>
           <w:ilvl w:val="1"/>
           <w:numId w:val="20"/>
@@ -3584,7 +3655,7 @@
     </w:p>
     <w:p>
       <w:pPr>
-        <w:pStyle w:val="ListParagraph"/>
+        <w:pStyle w:val="af5"/>
         <w:numPr>
           <w:ilvl w:val="1"/>
           <w:numId w:val="20"/>
@@ -3604,7 +3675,7 @@
     </w:p>
     <w:p>
       <w:pPr>
-        <w:pStyle w:val="ListParagraph"/>
+        <w:pStyle w:val="af5"/>
         <w:numPr>
           <w:ilvl w:val="1"/>
           <w:numId w:val="20"/>
@@ -3645,7 +3716,7 @@
     </w:p>
     <w:p>
       <w:pPr>
-        <w:pStyle w:val="ListParagraph"/>
+        <w:pStyle w:val="af5"/>
         <w:numPr>
           <w:ilvl w:val="0"/>
           <w:numId w:val="20"/>
@@ -3669,7 +3740,7 @@
     </w:p>
     <w:p>
       <w:pPr>
-        <w:pStyle w:val="ListParagraph"/>
+        <w:pStyle w:val="af5"/>
         <w:rPr>
           <w:sz w:val="24"/>
           <w:szCs w:val="24"/>
@@ -3734,7 +3805,7 @@
     </w:p>
     <w:p>
       <w:pPr>
-        <w:pStyle w:val="ListParagraph"/>
+        <w:pStyle w:val="af5"/>
         <w:rPr>
           <w:sz w:val="24"/>
           <w:szCs w:val="24"/>
@@ -3820,7 +3891,7 @@
     </w:p>
     <w:p>
       <w:pPr>
-        <w:pStyle w:val="ListParagraph"/>
+        <w:pStyle w:val="af5"/>
         <w:rPr>
           <w:sz w:val="24"/>
           <w:szCs w:val="24"/>
@@ -3859,7 +3930,7 @@
     </w:p>
     <w:p>
       <w:pPr>
-        <w:pStyle w:val="ListParagraph"/>
+        <w:pStyle w:val="af5"/>
         <w:numPr>
           <w:ilvl w:val="0"/>
           <w:numId w:val="20"/>
@@ -3883,7 +3954,7 @@
     </w:p>
     <w:p>
       <w:pPr>
-        <w:pStyle w:val="ListParagraph"/>
+        <w:pStyle w:val="af5"/>
         <w:rPr>
           <w:sz w:val="24"/>
           <w:szCs w:val="24"/>
@@ -3921,7 +3992,7 @@
     </w:p>
     <w:p>
       <w:pPr>
-        <w:pStyle w:val="ListParagraph"/>
+        <w:pStyle w:val="af5"/>
         <w:numPr>
           <w:ilvl w:val="1"/>
           <w:numId w:val="20"/>
@@ -3941,7 +4012,7 @@
     </w:p>
     <w:p>
       <w:pPr>
-        <w:pStyle w:val="ListParagraph"/>
+        <w:pStyle w:val="af5"/>
         <w:numPr>
           <w:ilvl w:val="1"/>
           <w:numId w:val="20"/>
@@ -3961,7 +4032,7 @@
     </w:p>
     <w:p>
       <w:pPr>
-        <w:pStyle w:val="ListParagraph"/>
+        <w:pStyle w:val="af5"/>
         <w:numPr>
           <w:ilvl w:val="1"/>
           <w:numId w:val="20"/>
@@ -3981,7 +4052,7 @@
     </w:p>
     <w:p>
       <w:pPr>
-        <w:pStyle w:val="ListParagraph"/>
+        <w:pStyle w:val="af5"/>
         <w:numPr>
           <w:ilvl w:val="1"/>
           <w:numId w:val="20"/>
@@ -4081,7 +4152,7 @@
     </w:p>
     <w:p>
       <w:pPr>
-        <w:pStyle w:val="Heading1"/>
+        <w:pStyle w:val="1"/>
       </w:pPr>
       <w:r>
         <w:lastRenderedPageBreak/>
@@ -4090,7 +4161,7 @@
     </w:p>
     <w:p>
       <w:pPr>
-        <w:pStyle w:val="ListParagraph"/>
+        <w:pStyle w:val="af5"/>
         <w:numPr>
           <w:ilvl w:val="0"/>
           <w:numId w:val="21"/>
@@ -4123,7 +4194,7 @@
     </w:p>
     <w:p>
       <w:pPr>
-        <w:pStyle w:val="ListParagraph"/>
+        <w:pStyle w:val="af5"/>
         <w:numPr>
           <w:ilvl w:val="0"/>
           <w:numId w:val="21"/>
@@ -4143,7 +4214,7 @@
     </w:p>
     <w:p>
       <w:pPr>
-        <w:pStyle w:val="ListParagraph"/>
+        <w:pStyle w:val="af5"/>
         <w:numPr>
           <w:ilvl w:val="0"/>
           <w:numId w:val="21"/>
@@ -4243,7 +4314,7 @@
     </w:p>
     <w:p>
       <w:pPr>
-        <w:pStyle w:val="Heading1"/>
+        <w:pStyle w:val="1"/>
       </w:pPr>
       <w:r>
         <w:lastRenderedPageBreak/>
@@ -4836,7 +4907,7 @@
     <w:p/>
     <w:p>
       <w:pPr>
-        <w:pStyle w:val="Heading1"/>
+        <w:pStyle w:val="1"/>
         <w:rPr>
           <w:rFonts w:ascii="Times New Roman" w:hAnsi="Times New Roman" w:cs="Times New Roman"/>
           <w:sz w:val="36"/>
@@ -4939,7 +5010,7 @@
           </mc:Choice>
           <mc:Fallback>
             <w:pict>
-              <v:shape w14:anchorId="54D30FE5" id="Text Box 5" o:spid="_x0000_s1032" type="#_x0000_t202" alt="Sidebar" style="position:absolute;margin-left:35.8pt;margin-top:-4.85pt;width:98.25pt;height:181.45pt;z-index:251681792;visibility:visible;mso-wrap-style:square;mso-width-percent:250;mso-height-percent:950;mso-wrap-distance-left:14.4pt;mso-wrap-distance-top:0;mso-wrap-distance-right:14.4pt;mso-wrap-distance-bottom:3in;mso-position-horizontal:absolute;mso-position-horizontal-relative:page;mso-position-vertical:absolute;mso-position-vertical-relative:margin;mso-width-percent:250;mso-height-percent:950;mso-width-relative:margin;mso-height-relative:margin;v-text-anchor:top" o:gfxdata="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" filled="f" stroked="f" strokeweight=".5pt">
+              <v:shape w14:anchorId="54D30FE5" id="Text Box 5" o:spid="_x0000_s1032" type="#_x0000_t202" alt="Sidebar" style="position:absolute;margin-left:35.8pt;margin-top:-4.85pt;width:98.25pt;height:181.45pt;z-index:251681792;visibility:visible;mso-wrap-style:square;mso-width-percent:250;mso-height-percent:950;mso-wrap-distance-left:14.4pt;mso-wrap-distance-top:0;mso-wrap-distance-right:14.4pt;mso-wrap-distance-bottom:3in;mso-position-horizontal:absolute;mso-position-horizontal-relative:page;mso-position-vertical:absolute;mso-position-vertical-relative:margin;mso-width-percent:250;mso-height-percent:950;mso-width-relative:margin;mso-height-relative:margin;v-text-anchor:top" o:gfxdata="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" filled="f" stroked="f" strokeweight=".5pt">
                 <v:textbox inset="3.6pt,0,3.6pt,0">
                   <w:txbxContent>
                     <w:p/>
@@ -5041,16 +5112,16 @@
                         <w:txbxContent>
                           <w:p>
                             <w:pPr>
-                              <w:pStyle w:val="Quote"/>
+                              <w:pStyle w:val="af"/>
                               <w:rPr>
-                                <w:rStyle w:val="QuoteChar"/>
+                                <w:rStyle w:val="Char5"/>
                                 <w:i/>
                                 <w:iCs/>
                               </w:rPr>
                             </w:pPr>
                             <w:r>
                               <w:rPr>
-                                <w:rStyle w:val="QuoteChar"/>
+                                <w:rStyle w:val="Char5"/>
                                 <w:i/>
                                 <w:iCs/>
                               </w:rPr>
@@ -5059,16 +5130,16 @@
                           </w:p>
                           <w:p>
                             <w:pPr>
-                              <w:pStyle w:val="Quote"/>
+                              <w:pStyle w:val="af"/>
                               <w:rPr>
-                                <w:rStyle w:val="QuoteChar"/>
+                                <w:rStyle w:val="Char5"/>
                                 <w:i/>
                                 <w:iCs/>
                               </w:rPr>
                             </w:pPr>
                             <w:r>
                               <w:rPr>
-                                <w:rStyle w:val="QuoteChar"/>
+                                <w:rStyle w:val="Char5"/>
                                 <w:i/>
                                 <w:iCs/>
                               </w:rPr>
@@ -5115,21 +5186,21 @@
           </mc:Choice>
           <mc:Fallback>
             <w:pict>
-              <v:shape w14:anchorId="1D5252A4" id="Text Box 574844441" o:spid="_x0000_s1033" type="#_x0000_t202" alt="Sidebar" style="position:absolute;margin-left:47.8pt;margin-top:7.15pt;width:98.25pt;height:181.45pt;z-index:251689984;visibility:visible;mso-wrap-style:square;mso-width-percent:250;mso-height-percent:950;mso-wrap-distance-left:14.4pt;mso-wrap-distance-top:0;mso-wrap-distance-right:14.4pt;mso-wrap-distance-bottom:3in;mso-position-horizontal:absolute;mso-position-horizontal-relative:page;mso-position-vertical:absolute;mso-position-vertical-relative:margin;mso-width-percent:250;mso-height-percent:950;mso-width-relative:margin;mso-height-relative:margin;v-text-anchor:top" o:gfxdata="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" filled="f" stroked="f" strokeweight=".5pt">
+              <v:shape w14:anchorId="1D5252A4" id="Text Box 574844441" o:spid="_x0000_s1033" type="#_x0000_t202" alt="Sidebar" style="position:absolute;margin-left:47.8pt;margin-top:7.15pt;width:98.25pt;height:181.45pt;z-index:251689984;visibility:visible;mso-wrap-style:square;mso-width-percent:250;mso-height-percent:950;mso-wrap-distance-left:14.4pt;mso-wrap-distance-top:0;mso-wrap-distance-right:14.4pt;mso-wrap-distance-bottom:3in;mso-position-horizontal:absolute;mso-position-horizontal-relative:page;mso-position-vertical:absolute;mso-position-vertical-relative:margin;mso-width-percent:250;mso-height-percent:950;mso-width-relative:margin;mso-height-relative:margin;v-text-anchor:top" o:gfxdata="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" filled="f" stroked="f" strokeweight=".5pt">
                 <v:textbox inset="3.6pt,0,3.6pt,0">
                   <w:txbxContent>
                     <w:p>
                       <w:pPr>
-                        <w:pStyle w:val="Quote"/>
+                        <w:pStyle w:val="af"/>
                         <w:rPr>
-                          <w:rStyle w:val="QuoteChar"/>
+                          <w:rStyle w:val="Char5"/>
                           <w:i/>
                           <w:iCs/>
                         </w:rPr>
                       </w:pPr>
                       <w:r>
                         <w:rPr>
-                          <w:rStyle w:val="QuoteChar"/>
+                          <w:rStyle w:val="Char5"/>
                           <w:i/>
                           <w:iCs/>
                         </w:rPr>
@@ -5138,16 +5209,16 @@
                     </w:p>
                     <w:p>
                       <w:pPr>
-                        <w:pStyle w:val="Quote"/>
+                        <w:pStyle w:val="af"/>
                         <w:rPr>
-                          <w:rStyle w:val="QuoteChar"/>
+                          <w:rStyle w:val="Char5"/>
                           <w:i/>
                           <w:iCs/>
                         </w:rPr>
                       </w:pPr>
                       <w:r>
                         <w:rPr>
-                          <w:rStyle w:val="QuoteChar"/>
+                          <w:rStyle w:val="Char5"/>
                           <w:i/>
                           <w:iCs/>
                         </w:rPr>
@@ -5299,7 +5370,7 @@
     </w:p>
     <w:p>
       <w:pPr>
-        <w:pStyle w:val="Heading1"/>
+        <w:pStyle w:val="1"/>
       </w:pPr>
       <w:r>
         <w:lastRenderedPageBreak/>
@@ -5360,304 +5431,33 @@
       </w:r>
     </w:p>
     <w:p>
-      <w:r>
-        <w:br/>
-      </w:r>
-    </w:p>
-    <w:p>
-      <w:pPr>
-        <w:pStyle w:val="Heading1"/>
-      </w:pPr>
-      <w:r>
-        <w:lastRenderedPageBreak/>
-        <w:t>Task 2</w:t>
-      </w:r>
-    </w:p>
-    <w:p>
-      <w:pPr>
-        <w:pStyle w:val="ListParagraph"/>
-        <w:numPr>
-          <w:ilvl w:val="0"/>
-          <w:numId w:val="23"/>
-        </w:numPr>
-        <w:rPr>
-          <w:sz w:val="24"/>
-          <w:szCs w:val="24"/>
-          <w:rtl/>
-        </w:rPr>
-      </w:pPr>
-      <w:r>
-        <w:rPr>
-          <w:sz w:val="24"/>
-          <w:szCs w:val="24"/>
-        </w:rPr>
-        <w:t>Select ONE prototyping approach</w:t>
-      </w:r>
-    </w:p>
-    <w:p>
-      <w:pPr>
-        <w:pStyle w:val="ListParagraph"/>
-        <w:numPr>
-          <w:ilvl w:val="0"/>
-          <w:numId w:val="22"/>
-        </w:numPr>
-        <w:rPr>
-          <w:sz w:val="24"/>
-          <w:szCs w:val="24"/>
-          <w:rtl/>
-        </w:rPr>
-      </w:pPr>
-      <w:r>
-        <w:rPr>
-          <w:sz w:val="24"/>
-          <w:szCs w:val="24"/>
-        </w:rPr>
-        <w:t>(Evolutionary Prototyping or Throwaway Prototyping).</w:t>
-      </w:r>
-    </w:p>
-    <w:p>
-      <w:pPr>
-        <w:pStyle w:val="ListParagraph"/>
-        <w:numPr>
-          <w:ilvl w:val="0"/>
-          <w:numId w:val="22"/>
-        </w:numPr>
-        <w:rPr>
-          <w:sz w:val="24"/>
-          <w:szCs w:val="24"/>
-          <w:rtl/>
-        </w:rPr>
-      </w:pPr>
-      <w:r>
-        <w:rPr>
-          <w:sz w:val="24"/>
-          <w:szCs w:val="24"/>
-        </w:rPr>
-        <w:t>Develop low-fidelity prototypes for 3 main screens</w:t>
-      </w:r>
-    </w:p>
-    <w:p>
-      <w:pPr>
-        <w:rPr>
-          <w:sz w:val="24"/>
-          <w:szCs w:val="24"/>
-        </w:rPr>
-      </w:pPr>
-      <w:r>
-        <w:rPr>
-          <w:sz w:val="24"/>
-          <w:szCs w:val="24"/>
-        </w:rPr>
-        <w:t xml:space="preserve"> of the system and justify why your chosen approach is more appropriate for this project.</w:t>
-      </w:r>
-      <w:r>
-        <w:rPr>
-          <w:sz w:val="24"/>
-          <w:szCs w:val="24"/>
-        </w:rPr>
-        <w:t xml:space="preserve"> </w:t>
-      </w:r>
-      <w:r>
-        <w:rPr>
-          <w:color w:val="EE0000"/>
-          <w:sz w:val="24"/>
-          <w:szCs w:val="24"/>
-        </w:rPr>
-        <w:t>[</w:t>
-      </w:r>
-      <w:r>
-        <w:rPr>
-          <w:color w:val="EE0000"/>
-          <w:sz w:val="24"/>
-          <w:szCs w:val="24"/>
-        </w:rPr>
-        <w:t xml:space="preserve">2 </w:t>
-      </w:r>
-      <w:r>
-        <w:rPr>
-          <w:color w:val="EE0000"/>
-          <w:sz w:val="24"/>
-          <w:szCs w:val="24"/>
-        </w:rPr>
-        <w:t>marks]</w:t>
-      </w:r>
-    </w:p>
-    <w:p>
-      <w:pPr>
-        <w:rPr>
-          <w:rFonts w:ascii="Times New Roman" w:hAnsi="Times New Roman" w:cs="Times New Roman"/>
+      <w:pPr>
+        <w:rPr>
           <w:b/>
           <w:bCs/>
-          <w:sz w:val="32"/>
-          <w:szCs w:val="32"/>
-          <w:rtl/>
-        </w:rPr>
-      </w:pPr>
-      <w:r>
-        <w:br/>
-      </w:r>
-      <w:r>
-        <w:rPr>
-          <w:rFonts w:ascii="Times New Roman" w:hAnsi="Times New Roman" w:cs="Times New Roman"/>
-          <w:b/>
-          <w:bCs/>
-          <w:sz w:val="32"/>
-          <w:szCs w:val="32"/>
-        </w:rPr>
-        <w:t>Selected Prototyping Approach</w:t>
-      </w:r>
-    </w:p>
-    <w:p>
-      <w:pPr>
-        <w:rPr>
-          <w:rFonts w:ascii="Times New Roman" w:hAnsi="Times New Roman" w:cs="Times New Roman"/>
-          <w:sz w:val="28"/>
-          <w:szCs w:val="28"/>
-          <w:rtl/>
-        </w:rPr>
-      </w:pPr>
-      <w:r>
-        <w:rPr>
-          <w:rFonts w:ascii="Times New Roman" w:hAnsi="Times New Roman" w:cs="Times New Roman"/>
-          <w:sz w:val="28"/>
-          <w:szCs w:val="28"/>
-        </w:rPr>
-        <w:t> Evolutionary Prototyping</w:t>
-      </w:r>
-    </w:p>
-    <w:p>
-      <w:pPr>
-        <w:rPr>
-          <w:rFonts w:ascii="Times New Roman" w:hAnsi="Times New Roman" w:cs="Times New Roman"/>
-          <w:b/>
-          <w:bCs/>
-          <w:sz w:val="28"/>
-          <w:szCs w:val="28"/>
-          <w:rtl/>
-        </w:rPr>
-      </w:pPr>
-      <w:r>
-        <w:rPr>
-          <w:rFonts w:ascii="Times New Roman" w:hAnsi="Times New Roman" w:cs="Times New Roman"/>
-          <w:b/>
-          <w:bCs/>
-          <w:sz w:val="28"/>
-          <w:szCs w:val="28"/>
-        </w:rPr>
-        <w:t>Justification</w:t>
-      </w:r>
-    </w:p>
-    <w:p>
-      <w:pPr>
-        <w:rPr>
-          <w:rFonts w:ascii="Times New Roman" w:hAnsi="Times New Roman" w:cs="Times New Roman"/>
-          <w:sz w:val="24"/>
-          <w:szCs w:val="24"/>
-        </w:rPr>
-      </w:pPr>
-      <w:r>
-        <w:rPr>
-          <w:rFonts w:ascii="Times New Roman" w:hAnsi="Times New Roman" w:cs="Times New Roman"/>
-          <w:sz w:val="24"/>
-          <w:szCs w:val="24"/>
-        </w:rPr>
-        <w:t>Evolutionary Prototyping was selected because it allows the system to be improved step by step based on user feedback. Since the Student Activities Management System includes different features such as browsing activities, registration, notifications, attendance tracking, and activity management, this approach is more suitable. It helps the team understand user needs better, make improvements during development, and reduce the chance of creating a system that does not meet user expectations. </w:t>
-      </w:r>
-    </w:p>
-    <w:p>
-      <w:pPr>
-        <w:rPr>
-          <w:rFonts w:ascii="Times New Roman" w:hAnsi="Times New Roman" w:cs="Times New Roman"/>
-          <w:sz w:val="28"/>
-          <w:szCs w:val="28"/>
-        </w:rPr>
-      </w:pPr>
-      <w:r>
-        <w:rPr>
-          <w:rFonts w:ascii="Times New Roman" w:hAnsi="Times New Roman" w:cs="Times New Roman"/>
-          <w:b/>
-          <w:bCs/>
-          <w:sz w:val="28"/>
-          <w:szCs w:val="28"/>
-        </w:rPr>
-        <w:t>Low-Fidelity Prototype Screens </w:t>
-      </w:r>
-    </w:p>
-    <w:p>
-      <w:pPr>
-        <w:rPr>
-          <w:rtl/>
-        </w:rPr>
-      </w:pPr>
-    </w:p>
-    <w:p>
-      <w:pPr>
-        <w:rPr>
-          <w:rtl/>
-        </w:rPr>
-      </w:pPr>
-    </w:p>
-    <w:p>
-      <w:pPr>
-        <w:rPr>
-          <w:rtl/>
-        </w:rPr>
-      </w:pPr>
-    </w:p>
-    <w:p>
-      <w:pPr>
-        <w:rPr>
-          <w:rtl/>
-        </w:rPr>
-      </w:pPr>
-    </w:p>
-    <w:p>
-      <w:pPr>
-        <w:rPr>
-          <w:rtl/>
-        </w:rPr>
-      </w:pPr>
-    </w:p>
-    <w:p>
-      <w:pPr>
-        <w:rPr>
-          <w:rtl/>
-        </w:rPr>
-      </w:pPr>
-    </w:p>
-    <w:p>
-      <w:pPr>
-        <w:rPr>
-          <w:rFonts w:ascii="Times New Roman" w:hAnsi="Times New Roman" w:cs="Times New Roman"/>
-          <w:b/>
-          <w:bCs/>
-          <w:sz w:val="24"/>
-          <w:szCs w:val="24"/>
-          <w:rtl/>
-        </w:rPr>
-      </w:pPr>
-      <w:r>
-        <w:rPr>
-          <w:rFonts w:ascii="Times New Roman" w:hAnsi="Times New Roman" w:cs="Times New Roman"/>
-          <w:b/>
-          <w:bCs/>
-          <w:sz w:val="24"/>
-          <w:szCs w:val="24"/>
-        </w:rPr>
-        <w:lastRenderedPageBreak/>
-        <w:t>Screen 1: Home</w:t>
-      </w:r>
-    </w:p>
-    <w:p>
-      <w:r>
-        <w:rPr>
+          <w:lang w:val="en-GB"/>
+        </w:rPr>
+      </w:pPr>
+      <w:r>
+        <w:rPr>
+          <w:rFonts w:ascii="Frutiger LT Arabic 45 Light" w:hAnsi="Frutiger LT Arabic 45 Light" w:cs="Frutiger LT Arabic 45 Light"/>
           <w:noProof/>
+          <w:sz w:val="18"/>
+          <w:szCs w:val="18"/>
         </w:rPr>
         <w:drawing>
-          <wp:inline distT="0" distB="0" distL="0" distR="0" wp14:anchorId="23A716D0" wp14:editId="53CC4293">
-            <wp:extent cx="3648584" cy="6592220"/>
-            <wp:effectExtent l="0" t="0" r="9525" b="0"/>
-            <wp:docPr id="1226730610" name="Picture 12"/>
+          <wp:anchor distT="0" distB="0" distL="114300" distR="114300" simplePos="0" relativeHeight="251692032" behindDoc="0" locked="0" layoutInCell="1" allowOverlap="1" wp14:anchorId="3E9AEEBF" wp14:editId="66731C1D">
+            <wp:simplePos x="0" y="0"/>
+            <wp:positionH relativeFrom="column">
+              <wp:posOffset>-1213485</wp:posOffset>
+            </wp:positionH>
+            <wp:positionV relativeFrom="paragraph">
+              <wp:posOffset>-4445</wp:posOffset>
+            </wp:positionV>
+            <wp:extent cx="6566535" cy="3463925"/>
+            <wp:effectExtent l="0" t="0" r="0" b="3175"/>
+            <wp:wrapTopAndBottom/>
+            <wp:docPr id="1241716066" name="صورة 1"/>
             <wp:cNvGraphicFramePr>
               <a:graphicFrameLocks xmlns:a="http://schemas.openxmlformats.org/drawingml/2006/main" noChangeAspect="1"/>
             </wp:cNvGraphicFramePr>
@@ -5665,7 +5465,7 @@
               <a:graphicData uri="http://schemas.openxmlformats.org/drawingml/2006/picture">
                 <pic:pic xmlns:pic="http://schemas.openxmlformats.org/drawingml/2006/picture">
                   <pic:nvPicPr>
-                    <pic:cNvPr id="1226730610" name="Picture 1226730610"/>
+                    <pic:cNvPr id="1241716066" name="صورة 1241716066"/>
                     <pic:cNvPicPr/>
                   </pic:nvPicPr>
                   <pic:blipFill>
@@ -5677,7 +5477,7 @@
                   <pic:spPr>
                     <a:xfrm>
                       <a:off x="0" y="0"/>
-                      <a:ext cx="3648584" cy="6592220"/>
+                      <a:ext cx="6566535" cy="3463925"/>
                     </a:xfrm>
                     <a:prstGeom prst="rect">
                       <a:avLst/>
@@ -5686,13 +5486,500 @@
                 </pic:pic>
               </a:graphicData>
             </a:graphic>
-          </wp:inline>
+            <wp14:sizeRelH relativeFrom="margin">
+              <wp14:pctWidth>0</wp14:pctWidth>
+            </wp14:sizeRelH>
+            <wp14:sizeRelV relativeFrom="margin">
+              <wp14:pctHeight>0</wp14:pctHeight>
+            </wp14:sizeRelV>
+          </wp:anchor>
         </w:drawing>
       </w:r>
-    </w:p>
-    <w:p>
-      <w:pPr>
-        <w:pStyle w:val="Heading1"/>
+      <w:r>
+        <w:br/>
+      </w:r>
+      <w:r>
+        <w:rPr>
+          <w:b/>
+          <w:bCs/>
+          <w:lang w:val="en-GB"/>
+        </w:rPr>
+        <w:t xml:space="preserve">Reflection </w:t>
+      </w:r>
+    </w:p>
+    <w:p>
+      <w:pPr>
+        <w:spacing w:after="0" w:line="240" w:lineRule="auto"/>
+        <w:rPr>
+          <w:rFonts w:ascii="Times New Roman" w:eastAsiaTheme="minorEastAsia" w:hAnsi="Times New Roman" w:cs="Times New Roman"/>
+          <w:color w:val="000000"/>
+          <w:sz w:val="24"/>
+          <w:szCs w:val="24"/>
+          <w:rtl/>
+          <w:lang w:eastAsia="en-US"/>
+        </w:rPr>
+      </w:pPr>
+      <w:r>
+        <w:rPr>
+          <w:rFonts w:ascii="Arial" w:eastAsiaTheme="minorEastAsia" w:hAnsi="Arial" w:cs="Arial"/>
+          <w:color w:val="000000"/>
+          <w:sz w:val="22"/>
+          <w:szCs w:val="22"/>
+          <w:lang w:eastAsia="en-US"/>
+        </w:rPr>
+        <w:t xml:space="preserve">When I first started this project , I thought creating a Gantt chart would be simple. I expected it to involve just adding tasks with dates, but once I began using TeamGantt, I </w:t>
+      </w:r>
+      <w:proofErr w:type="spellStart"/>
+      <w:r>
+        <w:rPr>
+          <w:rFonts w:ascii="Arial" w:eastAsiaTheme="minorEastAsia" w:hAnsi="Arial" w:cs="Arial"/>
+          <w:color w:val="000000"/>
+          <w:sz w:val="22"/>
+          <w:szCs w:val="22"/>
+          <w:lang w:eastAsia="en-US"/>
+        </w:rPr>
+        <w:t>realised</w:t>
+      </w:r>
+      <w:proofErr w:type="spellEnd"/>
+      <w:r>
+        <w:rPr>
+          <w:rFonts w:ascii="Arial" w:eastAsiaTheme="minorEastAsia" w:hAnsi="Arial" w:cs="Arial"/>
+          <w:color w:val="000000"/>
+          <w:sz w:val="22"/>
+          <w:szCs w:val="22"/>
+          <w:lang w:eastAsia="en-US"/>
+        </w:rPr>
+        <w:t xml:space="preserve"> there was much more to it. I had to think carefully about the order of each task, estimate realistic durations, and connect the activities using dependencies. At the beginning, I made several mistakes with the dates and task relationships, which made the schedule look confusing. Instead of giving up, I went back, reviewed everything, and kept improving it until it made sense</w:t>
+      </w:r>
+      <w:r>
+        <w:rPr>
+          <w:rFonts w:ascii="Arial" w:eastAsiaTheme="minorEastAsia" w:hAnsi="Arial" w:cs="Arial"/>
+          <w:color w:val="000000"/>
+          <w:sz w:val="22"/>
+          <w:szCs w:val="22"/>
+          <w:rtl/>
+          <w:lang w:eastAsia="en-US"/>
+        </w:rPr>
+        <w:t>.</w:t>
+      </w:r>
+    </w:p>
+    <w:p>
+      <w:pPr>
+        <w:spacing w:after="0" w:line="240" w:lineRule="auto"/>
+        <w:rPr>
+          <w:rFonts w:ascii="Times New Roman" w:eastAsia="Times New Roman" w:hAnsi="Times New Roman" w:cs="Times New Roman"/>
+          <w:color w:val="000000"/>
+          <w:sz w:val="24"/>
+          <w:szCs w:val="24"/>
+          <w:rtl/>
+          <w:lang w:eastAsia="en-US"/>
+        </w:rPr>
+      </w:pPr>
+    </w:p>
+    <w:p>
+      <w:pPr>
+        <w:spacing w:after="0" w:line="240" w:lineRule="auto"/>
+        <w:rPr>
+          <w:rFonts w:ascii="Times New Roman" w:eastAsiaTheme="minorEastAsia" w:hAnsi="Times New Roman" w:cs="Times New Roman"/>
+          <w:color w:val="000000"/>
+          <w:sz w:val="24"/>
+          <w:szCs w:val="24"/>
+          <w:lang w:eastAsia="en-US"/>
+        </w:rPr>
+      </w:pPr>
+      <w:r>
+        <w:rPr>
+          <w:rFonts w:ascii="Arial" w:eastAsiaTheme="minorEastAsia" w:hAnsi="Arial" w:cs="Arial"/>
+          <w:color w:val="000000"/>
+          <w:sz w:val="22"/>
+          <w:szCs w:val="22"/>
+          <w:lang w:eastAsia="en-US"/>
+        </w:rPr>
+        <w:t xml:space="preserve">Another challenge was working with the project deadline. I had to adjust the schedule several times because I wanted all the tasks to finish before the submission date while also taking weekends into account. This taught me that effective planning is flexible </w:t>
+      </w:r>
+      <w:r>
+        <w:rPr>
+          <w:rFonts w:ascii="Arial" w:eastAsiaTheme="minorEastAsia" w:hAnsi="Arial" w:cs="Arial"/>
+          <w:color w:val="000000"/>
+          <w:sz w:val="22"/>
+          <w:szCs w:val="22"/>
+          <w:lang w:eastAsia="en-US"/>
+        </w:rPr>
+        <w:lastRenderedPageBreak/>
+        <w:t>and sometimes requires making changes until everything fits together logically, and that small adjustments can prevent bigger problems</w:t>
+      </w:r>
+      <w:r>
+        <w:rPr>
+          <w:rFonts w:ascii="Arial" w:eastAsiaTheme="minorEastAsia" w:hAnsi="Arial" w:cs="Arial"/>
+          <w:color w:val="000000"/>
+          <w:sz w:val="22"/>
+          <w:szCs w:val="22"/>
+          <w:rtl/>
+          <w:lang w:eastAsia="en-US"/>
+        </w:rPr>
+        <w:t>.</w:t>
+      </w:r>
+    </w:p>
+    <w:p>
+      <w:pPr>
+        <w:spacing w:after="0" w:line="240" w:lineRule="auto"/>
+        <w:rPr>
+          <w:rFonts w:ascii="Times New Roman" w:eastAsia="Times New Roman" w:hAnsi="Times New Roman" w:cs="Times New Roman"/>
+          <w:color w:val="000000"/>
+          <w:sz w:val="24"/>
+          <w:szCs w:val="24"/>
+          <w:rtl/>
+          <w:lang w:eastAsia="en-US"/>
+        </w:rPr>
+      </w:pPr>
+    </w:p>
+    <w:p>
+      <w:pPr>
+        <w:spacing w:after="0" w:line="240" w:lineRule="auto"/>
+        <w:rPr>
+          <w:rFonts w:ascii="Times New Roman" w:eastAsiaTheme="minorEastAsia" w:hAnsi="Times New Roman" w:cs="Times New Roman"/>
+          <w:color w:val="000000"/>
+          <w:sz w:val="24"/>
+          <w:szCs w:val="24"/>
+          <w:lang w:eastAsia="en-US"/>
+        </w:rPr>
+      </w:pPr>
+      <w:r>
+        <w:rPr>
+          <w:rFonts w:ascii="Arial" w:eastAsiaTheme="minorEastAsia" w:hAnsi="Arial" w:cs="Arial"/>
+          <w:color w:val="000000"/>
+          <w:sz w:val="22"/>
+          <w:szCs w:val="22"/>
+          <w:lang w:eastAsia="en-US"/>
+        </w:rPr>
+        <w:t xml:space="preserve">Using TeamGantt was a new experience for me. At first, I found the interface confusing, especially when adding dependencies and adjusting task durations. However, after spending more time </w:t>
+      </w:r>
+      <w:proofErr w:type="spellStart"/>
+      <w:r>
+        <w:rPr>
+          <w:rFonts w:ascii="Arial" w:eastAsiaTheme="minorEastAsia" w:hAnsi="Arial" w:cs="Arial"/>
+          <w:color w:val="000000"/>
+          <w:sz w:val="22"/>
+          <w:szCs w:val="22"/>
+          <w:lang w:eastAsia="en-US"/>
+        </w:rPr>
+        <w:t>practising</w:t>
+      </w:r>
+      <w:proofErr w:type="spellEnd"/>
+      <w:r>
+        <w:rPr>
+          <w:rFonts w:ascii="Arial" w:eastAsiaTheme="minorEastAsia" w:hAnsi="Arial" w:cs="Arial"/>
+          <w:color w:val="000000"/>
+          <w:sz w:val="22"/>
+          <w:szCs w:val="22"/>
+          <w:lang w:eastAsia="en-US"/>
+        </w:rPr>
+        <w:t xml:space="preserve">, I became more comfortable with it. By the end of the assignment, I felt much more confident and understood how project management tools help </w:t>
+      </w:r>
+      <w:proofErr w:type="spellStart"/>
+      <w:r>
+        <w:rPr>
+          <w:rFonts w:ascii="Arial" w:eastAsiaTheme="minorEastAsia" w:hAnsi="Arial" w:cs="Arial"/>
+          <w:color w:val="000000"/>
+          <w:sz w:val="22"/>
+          <w:szCs w:val="22"/>
+          <w:lang w:eastAsia="en-US"/>
+        </w:rPr>
+        <w:t>organise</w:t>
+      </w:r>
+      <w:proofErr w:type="spellEnd"/>
+      <w:r>
+        <w:rPr>
+          <w:rFonts w:ascii="Arial" w:eastAsiaTheme="minorEastAsia" w:hAnsi="Arial" w:cs="Arial"/>
+          <w:color w:val="000000"/>
+          <w:sz w:val="22"/>
+          <w:szCs w:val="22"/>
+          <w:lang w:eastAsia="en-US"/>
+        </w:rPr>
+        <w:t xml:space="preserve"> work and track progress</w:t>
+      </w:r>
+      <w:r>
+        <w:rPr>
+          <w:rFonts w:ascii="Arial" w:eastAsiaTheme="minorEastAsia" w:hAnsi="Arial" w:cs="Arial"/>
+          <w:color w:val="000000"/>
+          <w:sz w:val="22"/>
+          <w:szCs w:val="22"/>
+          <w:rtl/>
+          <w:lang w:eastAsia="en-US"/>
+        </w:rPr>
+        <w:t>.</w:t>
+      </w:r>
+    </w:p>
+    <w:p>
+      <w:pPr>
+        <w:spacing w:after="0" w:line="240" w:lineRule="auto"/>
+        <w:rPr>
+          <w:rFonts w:ascii="Times New Roman" w:eastAsiaTheme="minorEastAsia" w:hAnsi="Times New Roman" w:cs="Times New Roman"/>
+          <w:color w:val="000000"/>
+          <w:sz w:val="24"/>
+          <w:szCs w:val="24"/>
+          <w:rtl/>
+          <w:lang w:eastAsia="en-US"/>
+        </w:rPr>
+      </w:pPr>
+      <w:r>
+        <w:rPr>
+          <w:rFonts w:ascii="Arial" w:eastAsiaTheme="minorEastAsia" w:hAnsi="Arial" w:cs="Arial"/>
+          <w:color w:val="000000"/>
+          <w:sz w:val="22"/>
+          <w:szCs w:val="22"/>
+          <w:lang w:eastAsia="en-US"/>
+        </w:rPr>
+        <w:t>Overall, this assignment taught me more than how to create a Gantt chart. It showed me the importance of planning before starting any project, thinking logically about task sequences, and paying attention to detail. I believe these are practical skills that I can use not only in my university projects but also in my future career, especially when managing teams and deadlines. Looking back, I am satisfied with the final result because I learned something new and improved my problem-solving and planning skills throughout the process</w:t>
+      </w:r>
+      <w:r>
+        <w:rPr>
+          <w:rFonts w:ascii="Arial" w:eastAsiaTheme="minorEastAsia" w:hAnsi="Arial" w:cs="Arial"/>
+          <w:color w:val="000000"/>
+          <w:sz w:val="22"/>
+          <w:szCs w:val="22"/>
+          <w:rtl/>
+          <w:lang w:eastAsia="en-US"/>
+        </w:rPr>
+        <w:t>.</w:t>
+      </w:r>
+    </w:p>
+    <w:p>
+      <w:pPr>
+        <w:spacing w:after="240" w:line="240" w:lineRule="auto"/>
+        <w:rPr>
+          <w:rFonts w:ascii="Times New Roman" w:eastAsia="Times New Roman" w:hAnsi="Times New Roman" w:cs="Times New Roman"/>
+          <w:color w:val="auto"/>
+          <w:sz w:val="24"/>
+          <w:szCs w:val="24"/>
+          <w:rtl/>
+          <w:lang w:eastAsia="en-US"/>
+        </w:rPr>
+      </w:pPr>
+    </w:p>
+    <w:p>
+      <w:pPr>
+        <w:spacing w:after="0" w:line="240" w:lineRule="auto"/>
+        <w:rPr>
+          <w:rFonts w:ascii="Times New Roman" w:eastAsiaTheme="minorEastAsia" w:hAnsi="Times New Roman" w:cs="Times New Roman"/>
+          <w:color w:val="auto"/>
+          <w:sz w:val="24"/>
+          <w:szCs w:val="24"/>
+          <w:lang w:eastAsia="en-US"/>
+        </w:rPr>
+      </w:pPr>
+    </w:p>
+    <w:p>
+      <w:pPr>
+        <w:rPr>
+          <w:lang w:val="en-GB"/>
+        </w:rPr>
+      </w:pPr>
+    </w:p>
+    <w:p>
+      <w:pPr>
+        <w:pStyle w:val="1"/>
+      </w:pPr>
+      <w:r>
+        <w:lastRenderedPageBreak/>
+        <w:t>Task 2</w:t>
+      </w:r>
+    </w:p>
+    <w:p>
+      <w:pPr>
+        <w:pStyle w:val="af5"/>
+        <w:numPr>
+          <w:ilvl w:val="0"/>
+          <w:numId w:val="23"/>
+        </w:numPr>
+        <w:rPr>
+          <w:sz w:val="24"/>
+          <w:szCs w:val="24"/>
+          <w:rtl/>
+        </w:rPr>
+      </w:pPr>
+      <w:r>
+        <w:rPr>
+          <w:sz w:val="24"/>
+          <w:szCs w:val="24"/>
+        </w:rPr>
+        <w:t>Select ONE prototyping approach</w:t>
+      </w:r>
+    </w:p>
+    <w:p>
+      <w:pPr>
+        <w:pStyle w:val="af5"/>
+        <w:numPr>
+          <w:ilvl w:val="0"/>
+          <w:numId w:val="22"/>
+        </w:numPr>
+        <w:rPr>
+          <w:sz w:val="24"/>
+          <w:szCs w:val="24"/>
+          <w:rtl/>
+        </w:rPr>
+      </w:pPr>
+      <w:r>
+        <w:rPr>
+          <w:sz w:val="24"/>
+          <w:szCs w:val="24"/>
+        </w:rPr>
+        <w:t>(Evolutionary Prototyping or Throwaway Prototyping).</w:t>
+      </w:r>
+    </w:p>
+    <w:p>
+      <w:pPr>
+        <w:pStyle w:val="af5"/>
+        <w:numPr>
+          <w:ilvl w:val="0"/>
+          <w:numId w:val="22"/>
+        </w:numPr>
+        <w:rPr>
+          <w:sz w:val="24"/>
+          <w:szCs w:val="24"/>
+          <w:rtl/>
+        </w:rPr>
+      </w:pPr>
+      <w:r>
+        <w:rPr>
+          <w:sz w:val="24"/>
+          <w:szCs w:val="24"/>
+        </w:rPr>
+        <w:t>Develop low-fidelity prototypes for 3 main screens</w:t>
+      </w:r>
+    </w:p>
+    <w:p>
+      <w:pPr>
+        <w:rPr>
+          <w:sz w:val="24"/>
+          <w:szCs w:val="24"/>
+        </w:rPr>
+      </w:pPr>
+      <w:r>
+        <w:rPr>
+          <w:sz w:val="24"/>
+          <w:szCs w:val="24"/>
+        </w:rPr>
+        <w:t xml:space="preserve"> of the system and justify why your chosen approach is more appropriate for this project.</w:t>
+      </w:r>
+      <w:r>
+        <w:rPr>
+          <w:sz w:val="24"/>
+          <w:szCs w:val="24"/>
+        </w:rPr>
+        <w:t xml:space="preserve"> </w:t>
+      </w:r>
+      <w:r>
+        <w:rPr>
+          <w:color w:val="EE0000"/>
+          <w:sz w:val="24"/>
+          <w:szCs w:val="24"/>
+        </w:rPr>
+        <w:t>[</w:t>
+      </w:r>
+      <w:r>
+        <w:rPr>
+          <w:color w:val="EE0000"/>
+          <w:sz w:val="24"/>
+          <w:szCs w:val="24"/>
+        </w:rPr>
+        <w:t xml:space="preserve">2 </w:t>
+      </w:r>
+      <w:r>
+        <w:rPr>
+          <w:color w:val="EE0000"/>
+          <w:sz w:val="24"/>
+          <w:szCs w:val="24"/>
+        </w:rPr>
+        <w:t>marks]</w:t>
+      </w:r>
+    </w:p>
+    <w:p>
+      <w:pPr>
+        <w:rPr>
+          <w:rFonts w:ascii="Times New Roman" w:hAnsi="Times New Roman" w:cs="Times New Roman"/>
+          <w:b/>
+          <w:bCs/>
+          <w:sz w:val="32"/>
+          <w:szCs w:val="32"/>
+          <w:rtl/>
+        </w:rPr>
+      </w:pPr>
+      <w:r>
+        <w:br/>
+      </w:r>
+      <w:r>
+        <w:rPr>
+          <w:rFonts w:ascii="Times New Roman" w:hAnsi="Times New Roman" w:cs="Times New Roman"/>
+          <w:b/>
+          <w:bCs/>
+          <w:sz w:val="32"/>
+          <w:szCs w:val="32"/>
+        </w:rPr>
+        <w:t>Selected Prototyping Approach</w:t>
+      </w:r>
+    </w:p>
+    <w:p>
+      <w:pPr>
+        <w:rPr>
+          <w:rFonts w:ascii="Times New Roman" w:hAnsi="Times New Roman" w:cs="Times New Roman"/>
+          <w:sz w:val="28"/>
+          <w:szCs w:val="28"/>
+          <w:rtl/>
+        </w:rPr>
+      </w:pPr>
+      <w:r>
+        <w:rPr>
+          <w:rFonts w:ascii="Times New Roman" w:hAnsi="Times New Roman" w:cs="Times New Roman"/>
+          <w:sz w:val="28"/>
+          <w:szCs w:val="28"/>
+        </w:rPr>
+        <w:t> Evolutionary Prototyping</w:t>
+      </w:r>
+    </w:p>
+    <w:p>
+      <w:pPr>
+        <w:rPr>
+          <w:rFonts w:ascii="Times New Roman" w:hAnsi="Times New Roman" w:cs="Times New Roman"/>
+          <w:b/>
+          <w:bCs/>
+          <w:sz w:val="28"/>
+          <w:szCs w:val="28"/>
+          <w:rtl/>
+        </w:rPr>
+      </w:pPr>
+      <w:r>
+        <w:rPr>
+          <w:rFonts w:ascii="Times New Roman" w:hAnsi="Times New Roman" w:cs="Times New Roman"/>
+          <w:b/>
+          <w:bCs/>
+          <w:sz w:val="28"/>
+          <w:szCs w:val="28"/>
+        </w:rPr>
+        <w:t>Justification</w:t>
+      </w:r>
+    </w:p>
+    <w:p>
+      <w:pPr>
+        <w:rPr>
+          <w:rFonts w:ascii="Times New Roman" w:hAnsi="Times New Roman" w:cs="Times New Roman"/>
+          <w:sz w:val="24"/>
+          <w:szCs w:val="24"/>
+        </w:rPr>
+      </w:pPr>
+      <w:r>
+        <w:rPr>
+          <w:rFonts w:ascii="Times New Roman" w:hAnsi="Times New Roman" w:cs="Times New Roman"/>
+          <w:sz w:val="24"/>
+          <w:szCs w:val="24"/>
+        </w:rPr>
+        <w:t>Evolutionary Prototyping was selected because it allows the system to be improved step by step based on user feedback. Since the Student Activities Management System includes different features such as browsing activities, registration, notifications, attendance tracking, and activity management, this approach is more suitable. It helps the team understand user needs better, make improvements during development, and reduce the chance of creating a system that does not meet user expectations. </w:t>
+      </w:r>
+    </w:p>
+    <w:p/>
+    <w:p>
+      <w:pPr>
+        <w:pStyle w:val="1"/>
       </w:pPr>
       <w:r>
         <w:lastRenderedPageBreak/>
@@ -5716,7 +6003,7 @@
     </w:p>
     <w:p>
       <w:pPr>
-        <w:pStyle w:val="ListParagraph"/>
+        <w:pStyle w:val="af5"/>
         <w:numPr>
           <w:ilvl w:val="0"/>
           <w:numId w:val="12"/>
@@ -5736,7 +6023,7 @@
     </w:p>
     <w:p>
       <w:pPr>
-        <w:pStyle w:val="ListParagraph"/>
+        <w:pStyle w:val="af5"/>
         <w:numPr>
           <w:ilvl w:val="0"/>
           <w:numId w:val="12"/>
@@ -5756,7 +6043,7 @@
     </w:p>
     <w:p>
       <w:pPr>
-        <w:pStyle w:val="ListParagraph"/>
+        <w:pStyle w:val="af5"/>
         <w:numPr>
           <w:ilvl w:val="0"/>
           <w:numId w:val="12"/>
@@ -5955,7 +6242,7 @@
     </w:p>
     <w:p>
       <w:pPr>
-        <w:pStyle w:val="Heading1"/>
+        <w:pStyle w:val="1"/>
       </w:pPr>
       <w:r>
         <w:lastRenderedPageBreak/>
@@ -5979,7 +6266,7 @@
     </w:p>
     <w:p>
       <w:pPr>
-        <w:pStyle w:val="ListParagraph"/>
+        <w:pStyle w:val="af5"/>
         <w:numPr>
           <w:ilvl w:val="0"/>
           <w:numId w:val="13"/>
@@ -5999,7 +6286,7 @@
     </w:p>
     <w:p>
       <w:pPr>
-        <w:pStyle w:val="ListParagraph"/>
+        <w:pStyle w:val="af5"/>
         <w:numPr>
           <w:ilvl w:val="0"/>
           <w:numId w:val="13"/>
@@ -6019,7 +6306,7 @@
     </w:p>
     <w:p>
       <w:pPr>
-        <w:pStyle w:val="ListParagraph"/>
+        <w:pStyle w:val="af5"/>
         <w:numPr>
           <w:ilvl w:val="0"/>
           <w:numId w:val="13"/>
@@ -6190,7 +6477,7 @@
     </w:p>
     <w:p>
       <w:pPr>
-        <w:pStyle w:val="Heading1"/>
+        <w:pStyle w:val="1"/>
       </w:pPr>
       <w:r>
         <w:lastRenderedPageBreak/>
@@ -6397,7 +6684,7 @@
     </w:p>
     <w:p>
       <w:pPr>
-        <w:pStyle w:val="Heading1"/>
+        <w:pStyle w:val="1"/>
       </w:pPr>
       <w:r>
         <w:lastRenderedPageBreak/>
@@ -6556,7 +6843,7 @@
     </w:p>
     <w:p>
       <w:pPr>
-        <w:pStyle w:val="Heading1"/>
+        <w:pStyle w:val="1"/>
       </w:pPr>
       <w:r>
         <w:lastRenderedPageBreak/>
@@ -6630,7 +6917,7 @@
 </file>
 
 <file path=word/endnotes.xml><?xml version="1.0" encoding="utf-8"?>
-<w:endnotes xmlns:wpc="http://schemas.microsoft.com/office/word/2010/wordprocessingCanvas" xmlns:cx="http://schemas.microsoft.com/office/drawing/2014/chartex" xmlns:cx1="http://schemas.microsoft.com/office/drawing/2015/9/8/chartex" xmlns:cx2="http://schemas.microsoft.com/office/drawing/2015/10/21/chartex" xmlns:cx3="http://schemas.microsoft.com/office/drawing/2016/5/9/chartex" xmlns:cx4="http://schemas.microsoft.com/office/drawing/2016/5/10/chartex" xmlns:cx5="http://schemas.microsoft.com/office/drawing/2016/5/11/chartex" xmlns:cx6="http://schemas.microsoft.com/office/drawing/2016/5/12/chartex" xmlns:cx7="http://schemas.microsoft.com/office/drawing/2016/5/13/chartex" xmlns:cx8="http://schemas.microsoft.com/office/drawing/2016/5/14/chartex" xmlns:mc="http://schemas.openxmlformats.org/markup-compatibility/2006" xmlns:aink="http://schemas.microsoft.com/office/drawing/2016/ink" xmlns:am3d="http://schemas.microsoft.com/office/drawing/2017/model3d" xmlns:o="urn:schemas-microsoft-com:office:office" xmlns:oel="http://schemas.microsoft.com/office/2019/extlst" xmlns:r="http://schemas.openxmlformats.org/officeDocument/2006/relationships" xmlns:m="http://schemas.openxmlformats.org/officeDocument/2006/math" xmlns:v="urn:schemas-microsoft-com:vml" xmlns:wp14="http://schemas.microsoft.com/office/word/2010/wordprocessingDrawing" xmlns:wp="http://schemas.openxmlformats.org/drawingml/2006/wordprocessingDrawing" xmlns:w10="urn:schemas-microsoft-com:office:word" xmlns:w="http://schemas.openxmlformats.org/wordprocessingml/2006/main" xmlns:w14="http://schemas.microsoft.com/office/word/2010/wordml" xmlns:w15="http://schemas.microsoft.com/office/word/2012/wordml" xmlns:w16cex="http://schemas.microsoft.com/office/word/2018/wordml/cex" xmlns:w16cid="http://schemas.microsoft.com/office/word/2016/wordml/cid" xmlns:w16="http://schemas.microsoft.com/office/word/2018/wordml" xmlns:w16du="http://schemas.microsoft.com/office/word/2023/wordml/word16du" xmlns:w16sdtdh="http://schemas.microsoft.com/office/word/2020/wordml/sdtdatahash" xmlns:w16sdtfl="http://schemas.microsoft.com/office/word/2024/wordml/sdtformatlock" xmlns:w16se="http://schemas.microsoft.com/office/word/2015/wordml/symex" xmlns:wpg="http://schemas.microsoft.com/office/word/2010/wordprocessingGroup" xmlns:wpi="http://schemas.microsoft.com/office/word/2010/wordprocessingInk" xmlns:wne="http://schemas.microsoft.com/office/word/2006/wordml" xmlns:wps="http://schemas.microsoft.com/office/word/2010/wordprocessingShape" mc:Ignorable="w14 w15 w16se w16cid w16 w16cex w16sdtdh w16sdtfl w16du wp14">
+<w:endnotes xmlns:wpc="http://schemas.microsoft.com/office/word/2010/wordprocessingCanvas" xmlns:cx="http://schemas.microsoft.com/office/drawing/2014/chartex" xmlns:cx1="http://schemas.microsoft.com/office/drawing/2015/9/8/chartex" xmlns:cx2="http://schemas.microsoft.com/office/drawing/2015/10/21/chartex" xmlns:cx3="http://schemas.microsoft.com/office/drawing/2016/5/9/chartex" xmlns:cx4="http://schemas.microsoft.com/office/drawing/2016/5/10/chartex" xmlns:cx5="http://schemas.microsoft.com/office/drawing/2016/5/11/chartex" xmlns:cx6="http://schemas.microsoft.com/office/drawing/2016/5/12/chartex" xmlns:cx7="http://schemas.microsoft.com/office/drawing/2016/5/13/chartex" xmlns:cx8="http://schemas.microsoft.com/office/drawing/2016/5/14/chartex" xmlns:mc="http://schemas.openxmlformats.org/markup-compatibility/2006" xmlns:m="http://schemas.openxmlformats.org/officeDocument/2006/math" xmlns:aink="http://schemas.microsoft.com/office/drawing/2016/ink" xmlns:am3d="http://schemas.microsoft.com/office/drawing/2017/model3d" xmlns:oel="http://schemas.microsoft.com/office/2019/extlst" xmlns:r="http://schemas.openxmlformats.org/officeDocument/2006/relationships" xmlns:wp14="http://schemas.microsoft.com/office/word/2010/wordprocessingDrawing" xmlns:wp="http://schemas.openxmlformats.org/drawingml/2006/wordprocessingDrawing" xmlns:wpg="http://schemas.microsoft.com/office/word/2010/wordprocessingGroup" xmlns:wpi="http://schemas.microsoft.com/office/word/2010/wordprocessingInk" xmlns:wps="http://schemas.microsoft.com/office/word/2010/wordprocessingShape" xmlns:o="urn:schemas-microsoft-com:office:office" xmlns:v="urn:schemas-microsoft-com:vml" xmlns:w10="urn:schemas-microsoft-com:office:word" xmlns:w="http://schemas.openxmlformats.org/wordprocessingml/2006/main" xmlns:w14="http://schemas.microsoft.com/office/word/2010/wordml" xmlns:w15="http://schemas.microsoft.com/office/word/2012/wordml" xmlns:w16cei="http://schemas.microsoft.com/office/word/2026/wordml/cei" xmlns:w16cex="http://schemas.microsoft.com/office/word/2018/wordml/cex" xmlns:w16cid="http://schemas.microsoft.com/office/word/2016/wordml/cid" xmlns:w16="http://schemas.microsoft.com/office/word/2018/wordml" xmlns:w16sdtdh="http://schemas.microsoft.com/office/word/2020/wordml/sdtdatahash" xmlns:w16sdtfl="http://schemas.microsoft.com/office/word/2024/wordml/sdtformatlock" xmlns:w16se="http://schemas.microsoft.com/office/word/2015/wordml/symex" xmlns:w16du="http://schemas.microsoft.com/office/word/2023/wordml/word16du" xmlns:wne="http://schemas.microsoft.com/office/word/2006/wordml" mc:Ignorable="w14 w15 w16se w16cid w16 w16cex w16sdtdh w16sdtfl w16du wp14">
   <w:endnote w:type="separator" w:id="-1">
     <w:p>
       <w:pPr>
@@ -6659,10 +6946,10 @@
 </file>
 
 <file path=word/footer1.xml><?xml version="1.0" encoding="utf-8"?>
-<w:ftr xmlns:wpc="http://schemas.microsoft.com/office/word/2010/wordprocessingCanvas" xmlns:cx="http://schemas.microsoft.com/office/drawing/2014/chartex" xmlns:cx1="http://schemas.microsoft.com/office/drawing/2015/9/8/chartex" xmlns:cx2="http://schemas.microsoft.com/office/drawing/2015/10/21/chartex" xmlns:cx3="http://schemas.microsoft.com/office/drawing/2016/5/9/chartex" xmlns:cx4="http://schemas.microsoft.com/office/drawing/2016/5/10/chartex" xmlns:cx5="http://schemas.microsoft.com/office/drawing/2016/5/11/chartex" xmlns:cx6="http://schemas.microsoft.com/office/drawing/2016/5/12/chartex" xmlns:cx7="http://schemas.microsoft.com/office/drawing/2016/5/13/chartex" xmlns:cx8="http://schemas.microsoft.com/office/drawing/2016/5/14/chartex" xmlns:mc="http://schemas.openxmlformats.org/markup-compatibility/2006" xmlns:aink="http://schemas.microsoft.com/office/drawing/2016/ink" xmlns:am3d="http://schemas.microsoft.com/office/drawing/2017/model3d" xmlns:o="urn:schemas-microsoft-com:office:office" xmlns:oel="http://schemas.microsoft.com/office/2019/extlst" xmlns:r="http://schemas.openxmlformats.org/officeDocument/2006/relationships" xmlns:m="http://schemas.openxmlformats.org/officeDocument/2006/math" xmlns:v="urn:schemas-microsoft-com:vml" xmlns:wp14="http://schemas.microsoft.com/office/word/2010/wordprocessingDrawing" xmlns:wp="http://schemas.openxmlformats.org/drawingml/2006/wordprocessingDrawing" xmlns:w10="urn:schemas-microsoft-com:office:word" xmlns:w="http://schemas.openxmlformats.org/wordprocessingml/2006/main" xmlns:w14="http://schemas.microsoft.com/office/word/2010/wordml" xmlns:w15="http://schemas.microsoft.com/office/word/2012/wordml" xmlns:w16cex="http://schemas.microsoft.com/office/word/2018/wordml/cex" xmlns:w16cid="http://schemas.microsoft.com/office/word/2016/wordml/cid" xmlns:w16="http://schemas.microsoft.com/office/word/2018/wordml" xmlns:w16du="http://schemas.microsoft.com/office/word/2023/wordml/word16du" xmlns:w16sdtdh="http://schemas.microsoft.com/office/word/2020/wordml/sdtdatahash" xmlns:w16sdtfl="http://schemas.microsoft.com/office/word/2024/wordml/sdtformatlock" xmlns:w16se="http://schemas.microsoft.com/office/word/2015/wordml/symex" xmlns:wpg="http://schemas.microsoft.com/office/word/2010/wordprocessingGroup" xmlns:wpi="http://schemas.microsoft.com/office/word/2010/wordprocessingInk" xmlns:wne="http://schemas.microsoft.com/office/word/2006/wordml" xmlns:wps="http://schemas.microsoft.com/office/word/2010/wordprocessingShape" mc:Ignorable="w14 w15 w16se w16cid w16 w16cex w16sdtdh w16sdtfl w16du wp14">
+<w:ftr xmlns:wpc="http://schemas.microsoft.com/office/word/2010/wordprocessingCanvas" xmlns:cx="http://schemas.microsoft.com/office/drawing/2014/chartex" xmlns:cx1="http://schemas.microsoft.com/office/drawing/2015/9/8/chartex" xmlns:cx2="http://schemas.microsoft.com/office/drawing/2015/10/21/chartex" xmlns:cx3="http://schemas.microsoft.com/office/drawing/2016/5/9/chartex" xmlns:cx4="http://schemas.microsoft.com/office/drawing/2016/5/10/chartex" xmlns:cx5="http://schemas.microsoft.com/office/drawing/2016/5/11/chartex" xmlns:cx6="http://schemas.microsoft.com/office/drawing/2016/5/12/chartex" xmlns:cx7="http://schemas.microsoft.com/office/drawing/2016/5/13/chartex" xmlns:cx8="http://schemas.microsoft.com/office/drawing/2016/5/14/chartex" xmlns:mc="http://schemas.openxmlformats.org/markup-compatibility/2006" xmlns:m="http://schemas.openxmlformats.org/officeDocument/2006/math" xmlns:aink="http://schemas.microsoft.com/office/drawing/2016/ink" xmlns:am3d="http://schemas.microsoft.com/office/drawing/2017/model3d" xmlns:oel="http://schemas.microsoft.com/office/2019/extlst" xmlns:r="http://schemas.openxmlformats.org/officeDocument/2006/relationships" xmlns:wp14="http://schemas.microsoft.com/office/word/2010/wordprocessingDrawing" xmlns:wp="http://schemas.openxmlformats.org/drawingml/2006/wordprocessingDrawing" xmlns:wpg="http://schemas.microsoft.com/office/word/2010/wordprocessingGroup" xmlns:wpi="http://schemas.microsoft.com/office/word/2010/wordprocessingInk" xmlns:wps="http://schemas.microsoft.com/office/word/2010/wordprocessingShape" xmlns:o="urn:schemas-microsoft-com:office:office" xmlns:v="urn:schemas-microsoft-com:vml" xmlns:w10="urn:schemas-microsoft-com:office:word" xmlns:w="http://schemas.openxmlformats.org/wordprocessingml/2006/main" xmlns:w14="http://schemas.microsoft.com/office/word/2010/wordml" xmlns:w15="http://schemas.microsoft.com/office/word/2012/wordml" xmlns:w16cei="http://schemas.microsoft.com/office/word/2026/wordml/cei" xmlns:w16cex="http://schemas.microsoft.com/office/word/2018/wordml/cex" xmlns:w16cid="http://schemas.microsoft.com/office/word/2016/wordml/cid" xmlns:w16="http://schemas.microsoft.com/office/word/2018/wordml" xmlns:w16sdtdh="http://schemas.microsoft.com/office/word/2020/wordml/sdtdatahash" xmlns:w16sdtfl="http://schemas.microsoft.com/office/word/2024/wordml/sdtformatlock" xmlns:w16se="http://schemas.microsoft.com/office/word/2015/wordml/symex" xmlns:w16du="http://schemas.microsoft.com/office/word/2023/wordml/word16du" xmlns:wne="http://schemas.microsoft.com/office/word/2006/wordml" mc:Ignorable="w14 w15 w16se w16cid w16 w16cex w16sdtdh w16sdtfl w16du wp14">
   <w:p>
     <w:pPr>
-      <w:pStyle w:val="Footer"/>
+      <w:pStyle w:val="a5"/>
     </w:pPr>
     <w:r>
       <w:rPr>
@@ -6765,7 +7052,7 @@
               <v:stroke joinstyle="miter"/>
               <v:path gradientshapeok="t" o:connecttype="rect"/>
             </v:shapetype>
-            <v:shape id="Text Box 9" o:spid="_x0000_s1034" type="#_x0000_t202" alt="Restricted - مقيد " style="position:absolute;left:0;text-align:left;margin-left:0;margin-top:0;width:84.4pt;height:32.1pt;z-index:251663360;visibility:visible;mso-wrap-style:none;mso-wrap-distance-left:0;mso-wrap-distance-top:0;mso-wrap-distance-right:0;mso-wrap-distance-bottom:0;mso-position-horizontal:left;mso-position-horizontal-relative:page;mso-position-vertical:bottom;mso-position-vertical-relative:page;v-text-anchor:bottom" o:gfxdata="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" filled="f" stroked="f">
+            <v:shape id="Text Box 9" o:spid="_x0000_s1034" type="#_x0000_t202" alt="Restricted - مقيد " style="position:absolute;left:0;text-align:left;margin-left:0;margin-top:0;width:84.4pt;height:32.1pt;z-index:251663360;visibility:visible;mso-wrap-style:none;mso-wrap-distance-left:0;mso-wrap-distance-top:0;mso-wrap-distance-right:0;mso-wrap-distance-bottom:0;mso-position-horizontal:left;mso-position-horizontal-relative:page;mso-position-vertical:bottom;mso-position-vertical-relative:page;v-text-anchor:bottom" o:gfxdata="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" filled="f" stroked="f">
               <v:textbox style="mso-fit-shape-to-text:t" inset="20pt,0,0,15pt">
                 <w:txbxContent>
                   <w:p>
@@ -6816,10 +7103,10 @@
 </file>
 
 <file path=word/footer2.xml><?xml version="1.0" encoding="utf-8"?>
-<w:ftr xmlns:wpc="http://schemas.microsoft.com/office/word/2010/wordprocessingCanvas" xmlns:cx="http://schemas.microsoft.com/office/drawing/2014/chartex" xmlns:cx1="http://schemas.microsoft.com/office/drawing/2015/9/8/chartex" xmlns:cx2="http://schemas.microsoft.com/office/drawing/2015/10/21/chartex" xmlns:cx3="http://schemas.microsoft.com/office/drawing/2016/5/9/chartex" xmlns:cx4="http://schemas.microsoft.com/office/drawing/2016/5/10/chartex" xmlns:cx5="http://schemas.microsoft.com/office/drawing/2016/5/11/chartex" xmlns:cx6="http://schemas.microsoft.com/office/drawing/2016/5/12/chartex" xmlns:cx7="http://schemas.microsoft.com/office/drawing/2016/5/13/chartex" xmlns:cx8="http://schemas.microsoft.com/office/drawing/2016/5/14/chartex" xmlns:mc="http://schemas.openxmlformats.org/markup-compatibility/2006" xmlns:aink="http://schemas.microsoft.com/office/drawing/2016/ink" xmlns:am3d="http://schemas.microsoft.com/office/drawing/2017/model3d" xmlns:o="urn:schemas-microsoft-com:office:office" xmlns:oel="http://schemas.microsoft.com/office/2019/extlst" xmlns:r="http://schemas.openxmlformats.org/officeDocument/2006/relationships" xmlns:m="http://schemas.openxmlformats.org/officeDocument/2006/math" xmlns:v="urn:schemas-microsoft-com:vml" xmlns:wp14="http://schemas.microsoft.com/office/word/2010/wordprocessingDrawing" xmlns:wp="http://schemas.openxmlformats.org/drawingml/2006/wordprocessingDrawing" xmlns:w10="urn:schemas-microsoft-com:office:word" xmlns:w="http://schemas.openxmlformats.org/wordprocessingml/2006/main" xmlns:w14="http://schemas.microsoft.com/office/word/2010/wordml" xmlns:w15="http://schemas.microsoft.com/office/word/2012/wordml" xmlns:w16cex="http://schemas.microsoft.com/office/word/2018/wordml/cex" xmlns:w16cid="http://schemas.microsoft.com/office/word/2016/wordml/cid" xmlns:w16="http://schemas.microsoft.com/office/word/2018/wordml" xmlns:w16du="http://schemas.microsoft.com/office/word/2023/wordml/word16du" xmlns:w16sdtdh="http://schemas.microsoft.com/office/word/2020/wordml/sdtdatahash" xmlns:w16sdtfl="http://schemas.microsoft.com/office/word/2024/wordml/sdtformatlock" xmlns:w16se="http://schemas.microsoft.com/office/word/2015/wordml/symex" xmlns:wpg="http://schemas.microsoft.com/office/word/2010/wordprocessingGroup" xmlns:wpi="http://schemas.microsoft.com/office/word/2010/wordprocessingInk" xmlns:wne="http://schemas.microsoft.com/office/word/2006/wordml" xmlns:wps="http://schemas.microsoft.com/office/word/2010/wordprocessingShape" mc:Ignorable="w14 w15 w16se w16cid w16 w16cex w16sdtdh w16sdtfl w16du wp14">
+<w:ftr xmlns:wpc="http://schemas.microsoft.com/office/word/2010/wordprocessingCanvas" xmlns:cx="http://schemas.microsoft.com/office/drawing/2014/chartex" xmlns:cx1="http://schemas.microsoft.com/office/drawing/2015/9/8/chartex" xmlns:cx2="http://schemas.microsoft.com/office/drawing/2015/10/21/chartex" xmlns:cx3="http://schemas.microsoft.com/office/drawing/2016/5/9/chartex" xmlns:cx4="http://schemas.microsoft.com/office/drawing/2016/5/10/chartex" xmlns:cx5="http://schemas.microsoft.com/office/drawing/2016/5/11/chartex" xmlns:cx6="http://schemas.microsoft.com/office/drawing/2016/5/12/chartex" xmlns:cx7="http://schemas.microsoft.com/office/drawing/2016/5/13/chartex" xmlns:cx8="http://schemas.microsoft.com/office/drawing/2016/5/14/chartex" xmlns:mc="http://schemas.openxmlformats.org/markup-compatibility/2006" xmlns:m="http://schemas.openxmlformats.org/officeDocument/2006/math" xmlns:aink="http://schemas.microsoft.com/office/drawing/2016/ink" xmlns:am3d="http://schemas.microsoft.com/office/drawing/2017/model3d" xmlns:oel="http://schemas.microsoft.com/office/2019/extlst" xmlns:r="http://schemas.openxmlformats.org/officeDocument/2006/relationships" xmlns:wp14="http://schemas.microsoft.com/office/word/2010/wordprocessingDrawing" xmlns:wp="http://schemas.openxmlformats.org/drawingml/2006/wordprocessingDrawing" xmlns:wpg="http://schemas.microsoft.com/office/word/2010/wordprocessingGroup" xmlns:wpi="http://schemas.microsoft.com/office/word/2010/wordprocessingInk" xmlns:wps="http://schemas.microsoft.com/office/word/2010/wordprocessingShape" xmlns:o="urn:schemas-microsoft-com:office:office" xmlns:v="urn:schemas-microsoft-com:vml" xmlns:w10="urn:schemas-microsoft-com:office:word" xmlns:w="http://schemas.openxmlformats.org/wordprocessingml/2006/main" xmlns:w14="http://schemas.microsoft.com/office/word/2010/wordml" xmlns:w15="http://schemas.microsoft.com/office/word/2012/wordml" xmlns:w16cei="http://schemas.microsoft.com/office/word/2026/wordml/cei" xmlns:w16cex="http://schemas.microsoft.com/office/word/2018/wordml/cex" xmlns:w16cid="http://schemas.microsoft.com/office/word/2016/wordml/cid" xmlns:w16="http://schemas.microsoft.com/office/word/2018/wordml" xmlns:w16sdtdh="http://schemas.microsoft.com/office/word/2020/wordml/sdtdatahash" xmlns:w16sdtfl="http://schemas.microsoft.com/office/word/2024/wordml/sdtformatlock" xmlns:w16se="http://schemas.microsoft.com/office/word/2015/wordml/symex" xmlns:w16du="http://schemas.microsoft.com/office/word/2023/wordml/word16du" xmlns:wne="http://schemas.microsoft.com/office/word/2006/wordml" mc:Ignorable="w14 w15 w16se w16cid w16 w16cex w16sdtdh w16sdtfl w16du wp14">
   <w:p>
     <w:pPr>
-      <w:pStyle w:val="Footer"/>
+      <w:pStyle w:val="a5"/>
     </w:pPr>
     <w:r>
       <w:rPr>
@@ -6922,7 +7209,7 @@
               <v:stroke joinstyle="miter"/>
               <v:path gradientshapeok="t" o:connecttype="rect"/>
             </v:shapetype>
-            <v:shape id="Text Box 10" o:spid="_x0000_s1035" type="#_x0000_t202" alt="Restricted - مقيد " style="position:absolute;left:0;text-align:left;margin-left:0;margin-top:0;width:84.4pt;height:32.1pt;z-index:251664384;visibility:visible;mso-wrap-style:none;mso-wrap-distance-left:0;mso-wrap-distance-top:0;mso-wrap-distance-right:0;mso-wrap-distance-bottom:0;mso-position-horizontal:left;mso-position-horizontal-relative:page;mso-position-vertical:bottom;mso-position-vertical-relative:page;v-text-anchor:bottom" o:gfxdata="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" filled="f" stroked="f">
+            <v:shape id="Text Box 10" o:spid="_x0000_s1035" type="#_x0000_t202" alt="Restricted - مقيد " style="position:absolute;left:0;text-align:left;margin-left:0;margin-top:0;width:84.4pt;height:32.1pt;z-index:251664384;visibility:visible;mso-wrap-style:none;mso-wrap-distance-left:0;mso-wrap-distance-top:0;mso-wrap-distance-right:0;mso-wrap-distance-bottom:0;mso-position-horizontal:left;mso-position-horizontal-relative:page;mso-position-vertical:bottom;mso-position-vertical-relative:page;v-text-anchor:bottom" o:gfxdata="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" filled="f" stroked="f">
               <v:textbox style="mso-fit-shape-to-text:t" inset="20pt,0,0,15pt">
                 <w:txbxContent>
                   <w:p>
@@ -6973,10 +7260,10 @@
 </file>
 
 <file path=word/footer3.xml><?xml version="1.0" encoding="utf-8"?>
-<w:ftr xmlns:wpc="http://schemas.microsoft.com/office/word/2010/wordprocessingCanvas" xmlns:cx="http://schemas.microsoft.com/office/drawing/2014/chartex" xmlns:cx1="http://schemas.microsoft.com/office/drawing/2015/9/8/chartex" xmlns:cx2="http://schemas.microsoft.com/office/drawing/2015/10/21/chartex" xmlns:cx3="http://schemas.microsoft.com/office/drawing/2016/5/9/chartex" xmlns:cx4="http://schemas.microsoft.com/office/drawing/2016/5/10/chartex" xmlns:cx5="http://schemas.microsoft.com/office/drawing/2016/5/11/chartex" xmlns:cx6="http://schemas.microsoft.com/office/drawing/2016/5/12/chartex" xmlns:cx7="http://schemas.microsoft.com/office/drawing/2016/5/13/chartex" xmlns:cx8="http://schemas.microsoft.com/office/drawing/2016/5/14/chartex" xmlns:mc="http://schemas.openxmlformats.org/markup-compatibility/2006" xmlns:aink="http://schemas.microsoft.com/office/drawing/2016/ink" xmlns:am3d="http://schemas.microsoft.com/office/drawing/2017/model3d" xmlns:o="urn:schemas-microsoft-com:office:office" xmlns:oel="http://schemas.microsoft.com/office/2019/extlst" xmlns:r="http://schemas.openxmlformats.org/officeDocument/2006/relationships" xmlns:m="http://schemas.openxmlformats.org/officeDocument/2006/math" xmlns:v="urn:schemas-microsoft-com:vml" xmlns:wp14="http://schemas.microsoft.com/office/word/2010/wordprocessingDrawing" xmlns:wp="http://schemas.openxmlformats.org/drawingml/2006/wordprocessingDrawing" xmlns:w10="urn:schemas-microsoft-com:office:word" xmlns:w="http://schemas.openxmlformats.org/wordprocessingml/2006/main" xmlns:w14="http://schemas.microsoft.com/office/word/2010/wordml" xmlns:w15="http://schemas.microsoft.com/office/word/2012/wordml" xmlns:w16cex="http://schemas.microsoft.com/office/word/2018/wordml/cex" xmlns:w16cid="http://schemas.microsoft.com/office/word/2016/wordml/cid" xmlns:w16="http://schemas.microsoft.com/office/word/2018/wordml" xmlns:w16du="http://schemas.microsoft.com/office/word/2023/wordml/word16du" xmlns:w16sdtdh="http://schemas.microsoft.com/office/word/2020/wordml/sdtdatahash" xmlns:w16sdtfl="http://schemas.microsoft.com/office/word/2024/wordml/sdtformatlock" xmlns:w16se="http://schemas.microsoft.com/office/word/2015/wordml/symex" xmlns:wpg="http://schemas.microsoft.com/office/word/2010/wordprocessingGroup" xmlns:wpi="http://schemas.microsoft.com/office/word/2010/wordprocessingInk" xmlns:wne="http://schemas.microsoft.com/office/word/2006/wordml" xmlns:wps="http://schemas.microsoft.com/office/word/2010/wordprocessingShape" mc:Ignorable="w14 w15 w16se w16cid w16 w16cex w16sdtdh w16sdtfl w16du wp14">
+<w:ftr xmlns:wpc="http://schemas.microsoft.com/office/word/2010/wordprocessingCanvas" xmlns:cx="http://schemas.microsoft.com/office/drawing/2014/chartex" xmlns:cx1="http://schemas.microsoft.com/office/drawing/2015/9/8/chartex" xmlns:cx2="http://schemas.microsoft.com/office/drawing/2015/10/21/chartex" xmlns:cx3="http://schemas.microsoft.com/office/drawing/2016/5/9/chartex" xmlns:cx4="http://schemas.microsoft.com/office/drawing/2016/5/10/chartex" xmlns:cx5="http://schemas.microsoft.com/office/drawing/2016/5/11/chartex" xmlns:cx6="http://schemas.microsoft.com/office/drawing/2016/5/12/chartex" xmlns:cx7="http://schemas.microsoft.com/office/drawing/2016/5/13/chartex" xmlns:cx8="http://schemas.microsoft.com/office/drawing/2016/5/14/chartex" xmlns:mc="http://schemas.openxmlformats.org/markup-compatibility/2006" xmlns:m="http://schemas.openxmlformats.org/officeDocument/2006/math" xmlns:aink="http://schemas.microsoft.com/office/drawing/2016/ink" xmlns:am3d="http://schemas.microsoft.com/office/drawing/2017/model3d" xmlns:oel="http://schemas.microsoft.com/office/2019/extlst" xmlns:r="http://schemas.openxmlformats.org/officeDocument/2006/relationships" xmlns:wp14="http://schemas.microsoft.com/office/word/2010/wordprocessingDrawing" xmlns:wp="http://schemas.openxmlformats.org/drawingml/2006/wordprocessingDrawing" xmlns:wpg="http://schemas.microsoft.com/office/word/2010/wordprocessingGroup" xmlns:wpi="http://schemas.microsoft.com/office/word/2010/wordprocessingInk" xmlns:wps="http://schemas.microsoft.com/office/word/2010/wordprocessingShape" xmlns:o="urn:schemas-microsoft-com:office:office" xmlns:v="urn:schemas-microsoft-com:vml" xmlns:w10="urn:schemas-microsoft-com:office:word" xmlns:w="http://schemas.openxmlformats.org/wordprocessingml/2006/main" xmlns:w14="http://schemas.microsoft.com/office/word/2010/wordml" xmlns:w15="http://schemas.microsoft.com/office/word/2012/wordml" xmlns:w16cei="http://schemas.microsoft.com/office/word/2026/wordml/cei" xmlns:w16cex="http://schemas.microsoft.com/office/word/2018/wordml/cex" xmlns:w16cid="http://schemas.microsoft.com/office/word/2016/wordml/cid" xmlns:w16="http://schemas.microsoft.com/office/word/2018/wordml" xmlns:w16sdtdh="http://schemas.microsoft.com/office/word/2020/wordml/sdtdatahash" xmlns:w16sdtfl="http://schemas.microsoft.com/office/word/2024/wordml/sdtformatlock" xmlns:w16se="http://schemas.microsoft.com/office/word/2015/wordml/symex" xmlns:w16du="http://schemas.microsoft.com/office/word/2023/wordml/word16du" xmlns:wne="http://schemas.microsoft.com/office/word/2006/wordml" mc:Ignorable="w14 w15 w16se w16cid w16 w16cex w16sdtdh w16sdtfl w16du wp14">
   <w:p>
     <w:pPr>
-      <w:pStyle w:val="Footer"/>
+      <w:pStyle w:val="a5"/>
     </w:pPr>
     <w:r>
       <w:rPr>
@@ -7079,7 +7366,7 @@
               <v:stroke joinstyle="miter"/>
               <v:path gradientshapeok="t" o:connecttype="rect"/>
             </v:shapetype>
-            <v:shape id="Text Box 8" o:spid="_x0000_s1036" type="#_x0000_t202" alt="Restricted - مقيد " style="position:absolute;left:0;text-align:left;margin-left:0;margin-top:0;width:84.4pt;height:32.1pt;z-index:251662336;visibility:visible;mso-wrap-style:none;mso-wrap-distance-left:0;mso-wrap-distance-top:0;mso-wrap-distance-right:0;mso-wrap-distance-bottom:0;mso-position-horizontal:left;mso-position-horizontal-relative:page;mso-position-vertical:bottom;mso-position-vertical-relative:page;v-text-anchor:bottom" o:gfxdata="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" filled="f" stroked="f">
+            <v:shape id="Text Box 8" o:spid="_x0000_s1036" type="#_x0000_t202" alt="Restricted - مقيد " style="position:absolute;left:0;text-align:left;margin-left:0;margin-top:0;width:84.4pt;height:32.1pt;z-index:251662336;visibility:visible;mso-wrap-style:none;mso-wrap-distance-left:0;mso-wrap-distance-top:0;mso-wrap-distance-right:0;mso-wrap-distance-bottom:0;mso-position-horizontal:left;mso-position-horizontal-relative:page;mso-position-vertical:bottom;mso-position-vertical-relative:page;v-text-anchor:bottom" o:gfxdata="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" filled="f" stroked="f">
               <v:textbox style="mso-fit-shape-to-text:t" inset="20pt,0,0,15pt">
                 <w:txbxContent>
                   <w:p>
@@ -7130,7 +7417,7 @@
 </file>
 
 <file path=word/footnotes.xml><?xml version="1.0" encoding="utf-8"?>
-<w:footnotes xmlns:wpc="http://schemas.microsoft.com/office/word/2010/wordprocessingCanvas" xmlns:cx="http://schemas.microsoft.com/office/drawing/2014/chartex" xmlns:cx1="http://schemas.microsoft.com/office/drawing/2015/9/8/chartex" xmlns:cx2="http://schemas.microsoft.com/office/drawing/2015/10/21/chartex" xmlns:cx3="http://schemas.microsoft.com/office/drawing/2016/5/9/chartex" xmlns:cx4="http://schemas.microsoft.com/office/drawing/2016/5/10/chartex" xmlns:cx5="http://schemas.microsoft.com/office/drawing/2016/5/11/chartex" xmlns:cx6="http://schemas.microsoft.com/office/drawing/2016/5/12/chartex" xmlns:cx7="http://schemas.microsoft.com/office/drawing/2016/5/13/chartex" xmlns:cx8="http://schemas.microsoft.com/office/drawing/2016/5/14/chartex" xmlns:mc="http://schemas.openxmlformats.org/markup-compatibility/2006" xmlns:aink="http://schemas.microsoft.com/office/drawing/2016/ink" xmlns:am3d="http://schemas.microsoft.com/office/drawing/2017/model3d" xmlns:o="urn:schemas-microsoft-com:office:office" xmlns:oel="http://schemas.microsoft.com/office/2019/extlst" xmlns:r="http://schemas.openxmlformats.org/officeDocument/2006/relationships" xmlns:m="http://schemas.openxmlformats.org/officeDocument/2006/math" xmlns:v="urn:schemas-microsoft-com:vml" xmlns:wp14="http://schemas.microsoft.com/office/word/2010/wordprocessingDrawing" xmlns:wp="http://schemas.openxmlformats.org/drawingml/2006/wordprocessingDrawing" xmlns:w10="urn:schemas-microsoft-com:office:word" xmlns:w="http://schemas.openxmlformats.org/wordprocessingml/2006/main" xmlns:w14="http://schemas.microsoft.com/office/word/2010/wordml" xmlns:w15="http://schemas.microsoft.com/office/word/2012/wordml" xmlns:w16cex="http://schemas.microsoft.com/office/word/2018/wordml/cex" xmlns:w16cid="http://schemas.microsoft.com/office/word/2016/wordml/cid" xmlns:w16="http://schemas.microsoft.com/office/word/2018/wordml" xmlns:w16du="http://schemas.microsoft.com/office/word/2023/wordml/word16du" xmlns:w16sdtdh="http://schemas.microsoft.com/office/word/2020/wordml/sdtdatahash" xmlns:w16sdtfl="http://schemas.microsoft.com/office/word/2024/wordml/sdtformatlock" xmlns:w16se="http://schemas.microsoft.com/office/word/2015/wordml/symex" xmlns:wpg="http://schemas.microsoft.com/office/word/2010/wordprocessingGroup" xmlns:wpi="http://schemas.microsoft.com/office/word/2010/wordprocessingInk" xmlns:wne="http://schemas.microsoft.com/office/word/2006/wordml" xmlns:wps="http://schemas.microsoft.com/office/word/2010/wordprocessingShape" mc:Ignorable="w14 w15 w16se w16cid w16 w16cex w16sdtdh w16sdtfl w16du wp14">
+<w:footnotes xmlns:wpc="http://schemas.microsoft.com/office/word/2010/wordprocessingCanvas" xmlns:cx="http://schemas.microsoft.com/office/drawing/2014/chartex" xmlns:cx1="http://schemas.microsoft.com/office/drawing/2015/9/8/chartex" xmlns:cx2="http://schemas.microsoft.com/office/drawing/2015/10/21/chartex" xmlns:cx3="http://schemas.microsoft.com/office/drawing/2016/5/9/chartex" xmlns:cx4="http://schemas.microsoft.com/office/drawing/2016/5/10/chartex" xmlns:cx5="http://schemas.microsoft.com/office/drawing/2016/5/11/chartex" xmlns:cx6="http://schemas.microsoft.com/office/drawing/2016/5/12/chartex" xmlns:cx7="http://schemas.microsoft.com/office/drawing/2016/5/13/chartex" xmlns:cx8="http://schemas.microsoft.com/office/drawing/2016/5/14/chartex" xmlns:mc="http://schemas.openxmlformats.org/markup-compatibility/2006" xmlns:m="http://schemas.openxmlformats.org/officeDocument/2006/math" xmlns:aink="http://schemas.microsoft.com/office/drawing/2016/ink" xmlns:am3d="http://schemas.microsoft.com/office/drawing/2017/model3d" xmlns:oel="http://schemas.microsoft.com/office/2019/extlst" xmlns:r="http://schemas.openxmlformats.org/officeDocument/2006/relationships" xmlns:wp14="http://schemas.microsoft.com/office/word/2010/wordprocessingDrawing" xmlns:wp="http://schemas.openxmlformats.org/drawingml/2006/wordprocessingDrawing" xmlns:wpg="http://schemas.microsoft.com/office/word/2010/wordprocessingGroup" xmlns:wpi="http://schemas.microsoft.com/office/word/2010/wordprocessingInk" xmlns:wps="http://schemas.microsoft.com/office/word/2010/wordprocessingShape" xmlns:o="urn:schemas-microsoft-com:office:office" xmlns:v="urn:schemas-microsoft-com:vml" xmlns:w10="urn:schemas-microsoft-com:office:word" xmlns:w="http://schemas.openxmlformats.org/wordprocessingml/2006/main" xmlns:w14="http://schemas.microsoft.com/office/word/2010/wordml" xmlns:w15="http://schemas.microsoft.com/office/word/2012/wordml" xmlns:w16cei="http://schemas.microsoft.com/office/word/2026/wordml/cei" xmlns:w16cex="http://schemas.microsoft.com/office/word/2018/wordml/cex" xmlns:w16cid="http://schemas.microsoft.com/office/word/2016/wordml/cid" xmlns:w16="http://schemas.microsoft.com/office/word/2018/wordml" xmlns:w16sdtdh="http://schemas.microsoft.com/office/word/2020/wordml/sdtdatahash" xmlns:w16sdtfl="http://schemas.microsoft.com/office/word/2024/wordml/sdtformatlock" xmlns:w16se="http://schemas.microsoft.com/office/word/2015/wordml/symex" xmlns:w16du="http://schemas.microsoft.com/office/word/2023/wordml/word16du" xmlns:wne="http://schemas.microsoft.com/office/word/2006/wordml" mc:Ignorable="w14 w15 w16se w16cid w16 w16cex w16sdtdh w16sdtfl w16du wp14">
   <w:footnote w:type="separator" w:id="-1">
     <w:p>
       <w:pPr>
@@ -7159,7 +7446,7 @@
 </file>
 
 <file path=word/header1.xml><?xml version="1.0" encoding="utf-8"?>
-<w:hdr xmlns:wpc="http://schemas.microsoft.com/office/word/2010/wordprocessingCanvas" xmlns:cx="http://schemas.microsoft.com/office/drawing/2014/chartex" xmlns:cx1="http://schemas.microsoft.com/office/drawing/2015/9/8/chartex" xmlns:cx2="http://schemas.microsoft.com/office/drawing/2015/10/21/chartex" xmlns:cx3="http://schemas.microsoft.com/office/drawing/2016/5/9/chartex" xmlns:cx4="http://schemas.microsoft.com/office/drawing/2016/5/10/chartex" xmlns:cx5="http://schemas.microsoft.com/office/drawing/2016/5/11/chartex" xmlns:cx6="http://schemas.microsoft.com/office/drawing/2016/5/12/chartex" xmlns:cx7="http://schemas.microsoft.com/office/drawing/2016/5/13/chartex" xmlns:cx8="http://schemas.microsoft.com/office/drawing/2016/5/14/chartex" xmlns:mc="http://schemas.openxmlformats.org/markup-compatibility/2006" xmlns:aink="http://schemas.microsoft.com/office/drawing/2016/ink" xmlns:am3d="http://schemas.microsoft.com/office/drawing/2017/model3d" xmlns:o="urn:schemas-microsoft-com:office:office" xmlns:oel="http://schemas.microsoft.com/office/2019/extlst" xmlns:r="http://schemas.openxmlformats.org/officeDocument/2006/relationships" xmlns:m="http://schemas.openxmlformats.org/officeDocument/2006/math" xmlns:v="urn:schemas-microsoft-com:vml" xmlns:wp14="http://schemas.microsoft.com/office/word/2010/wordprocessingDrawing" xmlns:wp="http://schemas.openxmlformats.org/drawingml/2006/wordprocessingDrawing" xmlns:w10="urn:schemas-microsoft-com:office:word" xmlns:w="http://schemas.openxmlformats.org/wordprocessingml/2006/main" xmlns:w14="http://schemas.microsoft.com/office/word/2010/wordml" xmlns:w15="http://schemas.microsoft.com/office/word/2012/wordml" xmlns:w16cex="http://schemas.microsoft.com/office/word/2018/wordml/cex" xmlns:w16cid="http://schemas.microsoft.com/office/word/2016/wordml/cid" xmlns:w16="http://schemas.microsoft.com/office/word/2018/wordml" xmlns:w16du="http://schemas.microsoft.com/office/word/2023/wordml/word16du" xmlns:w16sdtdh="http://schemas.microsoft.com/office/word/2020/wordml/sdtdatahash" xmlns:w16sdtfl="http://schemas.microsoft.com/office/word/2024/wordml/sdtformatlock" xmlns:w16se="http://schemas.microsoft.com/office/word/2015/wordml/symex" xmlns:wpg="http://schemas.microsoft.com/office/word/2010/wordprocessingGroup" xmlns:wpi="http://schemas.microsoft.com/office/word/2010/wordprocessingInk" xmlns:wne="http://schemas.microsoft.com/office/word/2006/wordml" xmlns:wps="http://schemas.microsoft.com/office/word/2010/wordprocessingShape" mc:Ignorable="w14 w15 w16se w16cid w16 w16cex w16sdtdh w16sdtfl w16du wp14">
+<w:hdr xmlns:wpc="http://schemas.microsoft.com/office/word/2010/wordprocessingCanvas" xmlns:cx="http://schemas.microsoft.com/office/drawing/2014/chartex" xmlns:cx1="http://schemas.microsoft.com/office/drawing/2015/9/8/chartex" xmlns:cx2="http://schemas.microsoft.com/office/drawing/2015/10/21/chartex" xmlns:cx3="http://schemas.microsoft.com/office/drawing/2016/5/9/chartex" xmlns:cx4="http://schemas.microsoft.com/office/drawing/2016/5/10/chartex" xmlns:cx5="http://schemas.microsoft.com/office/drawing/2016/5/11/chartex" xmlns:cx6="http://schemas.microsoft.com/office/drawing/2016/5/12/chartex" xmlns:cx7="http://schemas.microsoft.com/office/drawing/2016/5/13/chartex" xmlns:cx8="http://schemas.microsoft.com/office/drawing/2016/5/14/chartex" xmlns:mc="http://schemas.openxmlformats.org/markup-compatibility/2006" xmlns:m="http://schemas.openxmlformats.org/officeDocument/2006/math" xmlns:aink="http://schemas.microsoft.com/office/drawing/2016/ink" xmlns:am3d="http://schemas.microsoft.com/office/drawing/2017/model3d" xmlns:oel="http://schemas.microsoft.com/office/2019/extlst" xmlns:r="http://schemas.openxmlformats.org/officeDocument/2006/relationships" xmlns:wp14="http://schemas.microsoft.com/office/word/2010/wordprocessingDrawing" xmlns:wp="http://schemas.openxmlformats.org/drawingml/2006/wordprocessingDrawing" xmlns:wpg="http://schemas.microsoft.com/office/word/2010/wordprocessingGroup" xmlns:wpi="http://schemas.microsoft.com/office/word/2010/wordprocessingInk" xmlns:wps="http://schemas.microsoft.com/office/word/2010/wordprocessingShape" xmlns:o="urn:schemas-microsoft-com:office:office" xmlns:v="urn:schemas-microsoft-com:vml" xmlns:w10="urn:schemas-microsoft-com:office:word" xmlns:w="http://schemas.openxmlformats.org/wordprocessingml/2006/main" xmlns:w14="http://schemas.microsoft.com/office/word/2010/wordml" xmlns:w15="http://schemas.microsoft.com/office/word/2012/wordml" xmlns:w16cei="http://schemas.microsoft.com/office/word/2026/wordml/cei" xmlns:w16cex="http://schemas.microsoft.com/office/word/2018/wordml/cex" xmlns:w16cid="http://schemas.microsoft.com/office/word/2016/wordml/cid" xmlns:w16="http://schemas.microsoft.com/office/word/2018/wordml" xmlns:w16sdtdh="http://schemas.microsoft.com/office/word/2020/wordml/sdtdatahash" xmlns:w16sdtfl="http://schemas.microsoft.com/office/word/2024/wordml/sdtformatlock" xmlns:w16se="http://schemas.microsoft.com/office/word/2015/wordml/symex" xmlns:w16du="http://schemas.microsoft.com/office/word/2023/wordml/word16du" xmlns:wne="http://schemas.microsoft.com/office/word/2006/wordml" mc:Ignorable="w14 w15 w16se w16cid w16 w16cex w16sdtdh w16sdtfl w16du wp14">
   <w:tbl>
     <w:tblPr>
       <w:tblW w:w="6410" w:type="pct"/>
@@ -7223,7 +7510,7 @@
         </w:tcPr>
         <w:p>
           <w:pPr>
-            <w:pStyle w:val="Header"/>
+            <w:pStyle w:val="a7"/>
           </w:pPr>
         </w:p>
       </w:tc>
@@ -7233,7 +7520,7 @@
         </w:tcPr>
         <w:p>
           <w:pPr>
-            <w:pStyle w:val="Header"/>
+            <w:pStyle w:val="a7"/>
           </w:pPr>
         </w:p>
       </w:tc>
@@ -7244,7 +7531,7 @@
         </w:tcPr>
         <w:p>
           <w:pPr>
-            <w:pStyle w:val="Header"/>
+            <w:pStyle w:val="a7"/>
           </w:pPr>
         </w:p>
       </w:tc>
@@ -7252,14 +7539,14 @@
   </w:tbl>
   <w:p>
     <w:pPr>
-      <w:pStyle w:val="Header"/>
+      <w:pStyle w:val="a7"/>
     </w:pPr>
   </w:p>
 </w:hdr>
 </file>
 
 <file path=word/header2.xml><?xml version="1.0" encoding="utf-8"?>
-<w:hdr xmlns:wpc="http://schemas.microsoft.com/office/word/2010/wordprocessingCanvas" xmlns:cx="http://schemas.microsoft.com/office/drawing/2014/chartex" xmlns:cx1="http://schemas.microsoft.com/office/drawing/2015/9/8/chartex" xmlns:cx2="http://schemas.microsoft.com/office/drawing/2015/10/21/chartex" xmlns:cx3="http://schemas.microsoft.com/office/drawing/2016/5/9/chartex" xmlns:cx4="http://schemas.microsoft.com/office/drawing/2016/5/10/chartex" xmlns:cx5="http://schemas.microsoft.com/office/drawing/2016/5/11/chartex" xmlns:cx6="http://schemas.microsoft.com/office/drawing/2016/5/12/chartex" xmlns:cx7="http://schemas.microsoft.com/office/drawing/2016/5/13/chartex" xmlns:cx8="http://schemas.microsoft.com/office/drawing/2016/5/14/chartex" xmlns:mc="http://schemas.openxmlformats.org/markup-compatibility/2006" xmlns:aink="http://schemas.microsoft.com/office/drawing/2016/ink" xmlns:am3d="http://schemas.microsoft.com/office/drawing/2017/model3d" xmlns:o="urn:schemas-microsoft-com:office:office" xmlns:oel="http://schemas.microsoft.com/office/2019/extlst" xmlns:r="http://schemas.openxmlformats.org/officeDocument/2006/relationships" xmlns:m="http://schemas.openxmlformats.org/officeDocument/2006/math" xmlns:v="urn:schemas-microsoft-com:vml" xmlns:wp14="http://schemas.microsoft.com/office/word/2010/wordprocessingDrawing" xmlns:wp="http://schemas.openxmlformats.org/drawingml/2006/wordprocessingDrawing" xmlns:w10="urn:schemas-microsoft-com:office:word" xmlns:w="http://schemas.openxmlformats.org/wordprocessingml/2006/main" xmlns:w14="http://schemas.microsoft.com/office/word/2010/wordml" xmlns:w15="http://schemas.microsoft.com/office/word/2012/wordml" xmlns:w16cex="http://schemas.microsoft.com/office/word/2018/wordml/cex" xmlns:w16cid="http://schemas.microsoft.com/office/word/2016/wordml/cid" xmlns:w16="http://schemas.microsoft.com/office/word/2018/wordml" xmlns:w16du="http://schemas.microsoft.com/office/word/2023/wordml/word16du" xmlns:w16sdtdh="http://schemas.microsoft.com/office/word/2020/wordml/sdtdatahash" xmlns:w16sdtfl="http://schemas.microsoft.com/office/word/2024/wordml/sdtformatlock" xmlns:w16se="http://schemas.microsoft.com/office/word/2015/wordml/symex" xmlns:wpg="http://schemas.microsoft.com/office/word/2010/wordprocessingGroup" xmlns:wpi="http://schemas.microsoft.com/office/word/2010/wordprocessingInk" xmlns:wne="http://schemas.microsoft.com/office/word/2006/wordml" xmlns:wps="http://schemas.microsoft.com/office/word/2010/wordprocessingShape" mc:Ignorable="w14 w15 w16se w16cid w16 w16cex w16sdtdh w16sdtfl w16du wp14">
+<w:hdr xmlns:wpc="http://schemas.microsoft.com/office/word/2010/wordprocessingCanvas" xmlns:cx="http://schemas.microsoft.com/office/drawing/2014/chartex" xmlns:cx1="http://schemas.microsoft.com/office/drawing/2015/9/8/chartex" xmlns:cx2="http://schemas.microsoft.com/office/drawing/2015/10/21/chartex" xmlns:cx3="http://schemas.microsoft.com/office/drawing/2016/5/9/chartex" xmlns:cx4="http://schemas.microsoft.com/office/drawing/2016/5/10/chartex" xmlns:cx5="http://schemas.microsoft.com/office/drawing/2016/5/11/chartex" xmlns:cx6="http://schemas.microsoft.com/office/drawing/2016/5/12/chartex" xmlns:cx7="http://schemas.microsoft.com/office/drawing/2016/5/13/chartex" xmlns:cx8="http://schemas.microsoft.com/office/drawing/2016/5/14/chartex" xmlns:mc="http://schemas.openxmlformats.org/markup-compatibility/2006" xmlns:m="http://schemas.openxmlformats.org/officeDocument/2006/math" xmlns:aink="http://schemas.microsoft.com/office/drawing/2016/ink" xmlns:am3d="http://schemas.microsoft.com/office/drawing/2017/model3d" xmlns:oel="http://schemas.microsoft.com/office/2019/extlst" xmlns:r="http://schemas.openxmlformats.org/officeDocument/2006/relationships" xmlns:wp14="http://schemas.microsoft.com/office/word/2010/wordprocessingDrawing" xmlns:wp="http://schemas.openxmlformats.org/drawingml/2006/wordprocessingDrawing" xmlns:wpg="http://schemas.microsoft.com/office/word/2010/wordprocessingGroup" xmlns:wpi="http://schemas.microsoft.com/office/word/2010/wordprocessingInk" xmlns:wps="http://schemas.microsoft.com/office/word/2010/wordprocessingShape" xmlns:o="urn:schemas-microsoft-com:office:office" xmlns:v="urn:schemas-microsoft-com:vml" xmlns:w10="urn:schemas-microsoft-com:office:word" xmlns:w="http://schemas.openxmlformats.org/wordprocessingml/2006/main" xmlns:w14="http://schemas.microsoft.com/office/word/2010/wordml" xmlns:w15="http://schemas.microsoft.com/office/word/2012/wordml" xmlns:w16cei="http://schemas.microsoft.com/office/word/2026/wordml/cei" xmlns:w16cex="http://schemas.microsoft.com/office/word/2018/wordml/cex" xmlns:w16cid="http://schemas.microsoft.com/office/word/2016/wordml/cid" xmlns:w16="http://schemas.microsoft.com/office/word/2018/wordml" xmlns:w16sdtdh="http://schemas.microsoft.com/office/word/2020/wordml/sdtdatahash" xmlns:w16sdtfl="http://schemas.microsoft.com/office/word/2024/wordml/sdtformatlock" xmlns:w16se="http://schemas.microsoft.com/office/word/2015/wordml/symex" xmlns:w16du="http://schemas.microsoft.com/office/word/2023/wordml/word16du" xmlns:wne="http://schemas.microsoft.com/office/word/2006/wordml" mc:Ignorable="w14 w15 w16se w16cid w16 w16cex w16sdtdh w16sdtfl w16du wp14">
   <w:p>
     <w:pPr>
       <w:ind w:left="-2340"/>
@@ -7429,7 +7716,7 @@
             </wp:anchor>
           </w:drawing>
         </mc:Choice>
-        <mc:Fallback xmlns:w16cei="http://schemas.microsoft.com/office/word/2026/wordml/cei">
+        <mc:Fallback>
           <w:pict>
             <v:line w14:anchorId="7169C831" id="Straight Connector 6" o:spid="_x0000_s1026" style="position:absolute;z-index:251660288;visibility:visible;mso-wrap-style:square;mso-width-percent:0;mso-height-percent:0;mso-wrap-distance-left:9pt;mso-wrap-distance-top:-3e-5mm;mso-wrap-distance-right:9pt;mso-wrap-distance-bottom:-3e-5mm;mso-position-horizontal:absolute;mso-position-horizontal-relative:text;mso-position-vertical:absolute;mso-position-vertical-relative:text;mso-width-percent:0;mso-height-percent:0;mso-width-relative:page;mso-height-relative:page" from="-68.95pt,-666.45pt" to="489.05pt,-666.45pt" o:gfxdata="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" strokecolor="#4f81bd" strokeweight="2pt">
               <v:shadow on="t" opacity="24903f" origin=",.5" offset="0,.55556mm"/>
@@ -7444,7 +7731,7 @@
 </file>
 
 <file path=word/header3.xml><?xml version="1.0" encoding="utf-8"?>
-<w:hdr xmlns:wpc="http://schemas.microsoft.com/office/word/2010/wordprocessingCanvas" xmlns:cx="http://schemas.microsoft.com/office/drawing/2014/chartex" xmlns:cx1="http://schemas.microsoft.com/office/drawing/2015/9/8/chartex" xmlns:cx2="http://schemas.microsoft.com/office/drawing/2015/10/21/chartex" xmlns:cx3="http://schemas.microsoft.com/office/drawing/2016/5/9/chartex" xmlns:cx4="http://schemas.microsoft.com/office/drawing/2016/5/10/chartex" xmlns:cx5="http://schemas.microsoft.com/office/drawing/2016/5/11/chartex" xmlns:cx6="http://schemas.microsoft.com/office/drawing/2016/5/12/chartex" xmlns:cx7="http://schemas.microsoft.com/office/drawing/2016/5/13/chartex" xmlns:cx8="http://schemas.microsoft.com/office/drawing/2016/5/14/chartex" xmlns:mc="http://schemas.openxmlformats.org/markup-compatibility/2006" xmlns:aink="http://schemas.microsoft.com/office/drawing/2016/ink" xmlns:am3d="http://schemas.microsoft.com/office/drawing/2017/model3d" xmlns:o="urn:schemas-microsoft-com:office:office" xmlns:oel="http://schemas.microsoft.com/office/2019/extlst" xmlns:r="http://schemas.openxmlformats.org/officeDocument/2006/relationships" xmlns:m="http://schemas.openxmlformats.org/officeDocument/2006/math" xmlns:v="urn:schemas-microsoft-com:vml" xmlns:wp14="http://schemas.microsoft.com/office/word/2010/wordprocessingDrawing" xmlns:wp="http://schemas.openxmlformats.org/drawingml/2006/wordprocessingDrawing" xmlns:w10="urn:schemas-microsoft-com:office:word" xmlns:w="http://schemas.openxmlformats.org/wordprocessingml/2006/main" xmlns:w14="http://schemas.microsoft.com/office/word/2010/wordml" xmlns:w15="http://schemas.microsoft.com/office/word/2012/wordml" xmlns:w16cex="http://schemas.microsoft.com/office/word/2018/wordml/cex" xmlns:w16cid="http://schemas.microsoft.com/office/word/2016/wordml/cid" xmlns:w16="http://schemas.microsoft.com/office/word/2018/wordml" xmlns:w16du="http://schemas.microsoft.com/office/word/2023/wordml/word16du" xmlns:w16sdtdh="http://schemas.microsoft.com/office/word/2020/wordml/sdtdatahash" xmlns:w16sdtfl="http://schemas.microsoft.com/office/word/2024/wordml/sdtformatlock" xmlns:w16se="http://schemas.microsoft.com/office/word/2015/wordml/symex" xmlns:wpg="http://schemas.microsoft.com/office/word/2010/wordprocessingGroup" xmlns:wpi="http://schemas.microsoft.com/office/word/2010/wordprocessingInk" xmlns:wne="http://schemas.microsoft.com/office/word/2006/wordml" xmlns:wps="http://schemas.microsoft.com/office/word/2010/wordprocessingShape" mc:Ignorable="w14 w15 w16se w16cid w16 w16cex w16sdtdh w16sdtfl w16du wp14">
+<w:hdr xmlns:wpc="http://schemas.microsoft.com/office/word/2010/wordprocessingCanvas" xmlns:cx="http://schemas.microsoft.com/office/drawing/2014/chartex" xmlns:cx1="http://schemas.microsoft.com/office/drawing/2015/9/8/chartex" xmlns:cx2="http://schemas.microsoft.com/office/drawing/2015/10/21/chartex" xmlns:cx3="http://schemas.microsoft.com/office/drawing/2016/5/9/chartex" xmlns:cx4="http://schemas.microsoft.com/office/drawing/2016/5/10/chartex" xmlns:cx5="http://schemas.microsoft.com/office/drawing/2016/5/11/chartex" xmlns:cx6="http://schemas.microsoft.com/office/drawing/2016/5/12/chartex" xmlns:cx7="http://schemas.microsoft.com/office/drawing/2016/5/13/chartex" xmlns:cx8="http://schemas.microsoft.com/office/drawing/2016/5/14/chartex" xmlns:mc="http://schemas.openxmlformats.org/markup-compatibility/2006" xmlns:m="http://schemas.openxmlformats.org/officeDocument/2006/math" xmlns:aink="http://schemas.microsoft.com/office/drawing/2016/ink" xmlns:am3d="http://schemas.microsoft.com/office/drawing/2017/model3d" xmlns:oel="http://schemas.microsoft.com/office/2019/extlst" xmlns:r="http://schemas.openxmlformats.org/officeDocument/2006/relationships" xmlns:wp14="http://schemas.microsoft.com/office/word/2010/wordprocessingDrawing" xmlns:wp="http://schemas.openxmlformats.org/drawingml/2006/wordprocessingDrawing" xmlns:wpg="http://schemas.microsoft.com/office/word/2010/wordprocessingGroup" xmlns:wpi="http://schemas.microsoft.com/office/word/2010/wordprocessingInk" xmlns:wps="http://schemas.microsoft.com/office/word/2010/wordprocessingShape" xmlns:o="urn:schemas-microsoft-com:office:office" xmlns:v="urn:schemas-microsoft-com:vml" xmlns:w10="urn:schemas-microsoft-com:office:word" xmlns:w="http://schemas.openxmlformats.org/wordprocessingml/2006/main" xmlns:w14="http://schemas.microsoft.com/office/word/2010/wordml" xmlns:w15="http://schemas.microsoft.com/office/word/2012/wordml" xmlns:w16cei="http://schemas.microsoft.com/office/word/2026/wordml/cei" xmlns:w16cex="http://schemas.microsoft.com/office/word/2018/wordml/cex" xmlns:w16cid="http://schemas.microsoft.com/office/word/2016/wordml/cid" xmlns:w16="http://schemas.microsoft.com/office/word/2018/wordml" xmlns:w16sdtdh="http://schemas.microsoft.com/office/word/2020/wordml/sdtdatahash" xmlns:w16sdtfl="http://schemas.microsoft.com/office/word/2024/wordml/sdtformatlock" xmlns:w16se="http://schemas.microsoft.com/office/word/2015/wordml/symex" xmlns:w16du="http://schemas.microsoft.com/office/word/2023/wordml/word16du" xmlns:wne="http://schemas.microsoft.com/office/word/2006/wordml" mc:Ignorable="w14 w15 w16se w16cid w16 w16cex w16sdtdh w16sdtfl w16du wp14">
   <w:tbl>
     <w:tblPr>
       <w:tblW w:w="6410" w:type="pct"/>
@@ -7538,9 +7825,26 @@
           </w:r>
           <w:r>
             <w:rPr>
+              <w:rFonts w:hint="cs"/>
+              <w:noProof/>
+              <w:rtl/>
+            </w:rPr>
+            <w:instrText xml:space="preserve">خطأ! استخدم علامة التبويب "الصفحة الرئيسية" لتطبيق </w:instrText>
+          </w:r>
+          <w:r>
+            <w:rPr>
+              <w:rFonts w:hint="cs"/>
               <w:noProof/>
             </w:rPr>
-            <w:instrText>Task 4</w:instrText>
+            <w:instrText>Heading 1</w:instrText>
+          </w:r>
+          <w:r>
+            <w:rPr>
+              <w:rFonts w:hint="cs"/>
+              <w:noProof/>
+              <w:rtl/>
+            </w:rPr>
+            <w:instrText xml:space="preserve"> على النص الذي ترغب في أن يظهر هنا.</w:instrText>
           </w:r>
           <w:r>
             <w:rPr>
@@ -7571,9 +7875,26 @@
           </w:r>
           <w:r>
             <w:rPr>
+              <w:rFonts w:hint="cs"/>
+              <w:noProof/>
+              <w:rtl/>
+            </w:rPr>
+            <w:instrText xml:space="preserve">خطأ! استخدم علامة التبويب "الصفحة الرئيسية" لتطبيق </w:instrText>
+          </w:r>
+          <w:r>
+            <w:rPr>
+              <w:rFonts w:hint="cs"/>
               <w:noProof/>
             </w:rPr>
-            <w:instrText>Task 4</w:instrText>
+            <w:instrText>Heading 1</w:instrText>
+          </w:r>
+          <w:r>
+            <w:rPr>
+              <w:rFonts w:hint="cs"/>
+              <w:noProof/>
+              <w:rtl/>
+            </w:rPr>
+            <w:instrText xml:space="preserve"> على النص الذي ترغب في أن يظهر هنا.</w:instrText>
           </w:r>
           <w:r>
             <w:rPr>
@@ -7589,9 +7910,32 @@
           </w:r>
           <w:r>
             <w:rPr>
+              <w:rFonts w:hint="cs"/>
+              <w:noProof/>
+              <w:rtl/>
+            </w:rPr>
+            <w:t xml:space="preserve">خطأ! استخدم علامة التبويب "الصفحة الرئيسية" لتطبيق </w:t>
+          </w:r>
+          <w:r>
+            <w:rPr>
+              <w:rFonts w:hint="cs"/>
               <w:noProof/>
             </w:rPr>
-            <w:t xml:space="preserve">Task 4 </w:t>
+            <w:t>Heading 1</w:t>
+          </w:r>
+          <w:r>
+            <w:rPr>
+              <w:rFonts w:hint="cs"/>
+              <w:noProof/>
+              <w:rtl/>
+            </w:rPr>
+            <w:t xml:space="preserve"> على النص الذي ترغب في أن يظهر هنا.</w:t>
+          </w:r>
+          <w:r>
+            <w:rPr>
+              <w:noProof/>
+            </w:rPr>
+            <w:t xml:space="preserve"> </w:t>
           </w:r>
           <w:r>
             <w:fldChar w:fldCharType="end"/>
@@ -7649,7 +7993,7 @@
 </file>
 
 <file path=word/numbering.xml><?xml version="1.0" encoding="utf-8"?>
-<w:numbering xmlns:wpc="http://schemas.microsoft.com/office/word/2010/wordprocessingCanvas" xmlns:cx="http://schemas.microsoft.com/office/drawing/2014/chartex" xmlns:cx1="http://schemas.microsoft.com/office/drawing/2015/9/8/chartex" xmlns:cx2="http://schemas.microsoft.com/office/drawing/2015/10/21/chartex" xmlns:cx3="http://schemas.microsoft.com/office/drawing/2016/5/9/chartex" xmlns:cx4="http://schemas.microsoft.com/office/drawing/2016/5/10/chartex" xmlns:cx5="http://schemas.microsoft.com/office/drawing/2016/5/11/chartex" xmlns:cx6="http://schemas.microsoft.com/office/drawing/2016/5/12/chartex" xmlns:cx7="http://schemas.microsoft.com/office/drawing/2016/5/13/chartex" xmlns:cx8="http://schemas.microsoft.com/office/drawing/2016/5/14/chartex" xmlns:mc="http://schemas.openxmlformats.org/markup-compatibility/2006" xmlns:aink="http://schemas.microsoft.com/office/drawing/2016/ink" xmlns:am3d="http://schemas.microsoft.com/office/drawing/2017/model3d" xmlns:o="urn:schemas-microsoft-com:office:office" xmlns:oel="http://schemas.microsoft.com/office/2019/extlst" xmlns:r="http://schemas.openxmlformats.org/officeDocument/2006/relationships" xmlns:m="http://schemas.openxmlformats.org/officeDocument/2006/math" xmlns:v="urn:schemas-microsoft-com:vml" xmlns:wp14="http://schemas.microsoft.com/office/word/2010/wordprocessingDrawing" xmlns:wp="http://schemas.openxmlformats.org/drawingml/2006/wordprocessingDrawing" xmlns:w10="urn:schemas-microsoft-com:office:word" xmlns:w="http://schemas.openxmlformats.org/wordprocessingml/2006/main" xmlns:w14="http://schemas.microsoft.com/office/word/2010/wordml" xmlns:w15="http://schemas.microsoft.com/office/word/2012/wordml" xmlns:w16cex="http://schemas.microsoft.com/office/word/2018/wordml/cex" xmlns:w16cid="http://schemas.microsoft.com/office/word/2016/wordml/cid" xmlns:w16="http://schemas.microsoft.com/office/word/2018/wordml" xmlns:w16du="http://schemas.microsoft.com/office/word/2023/wordml/word16du" xmlns:w16sdtdh="http://schemas.microsoft.com/office/word/2020/wordml/sdtdatahash" xmlns:w16sdtfl="http://schemas.microsoft.com/office/word/2024/wordml/sdtformatlock" xmlns:w16se="http://schemas.microsoft.com/office/word/2015/wordml/symex" xmlns:wpg="http://schemas.microsoft.com/office/word/2010/wordprocessingGroup" xmlns:wpi="http://schemas.microsoft.com/office/word/2010/wordprocessingInk" xmlns:wne="http://schemas.microsoft.com/office/word/2006/wordml" xmlns:wps="http://schemas.microsoft.com/office/word/2010/wordprocessingShape" mc:Ignorable="w14 w15 w16se w16cid w16 w16cex w16sdtdh w16sdtfl w16du wp14">
+<w:numbering xmlns:wpc="http://schemas.microsoft.com/office/word/2010/wordprocessingCanvas" xmlns:cx="http://schemas.microsoft.com/office/drawing/2014/chartex" xmlns:cx1="http://schemas.microsoft.com/office/drawing/2015/9/8/chartex" xmlns:cx2="http://schemas.microsoft.com/office/drawing/2015/10/21/chartex" xmlns:cx3="http://schemas.microsoft.com/office/drawing/2016/5/9/chartex" xmlns:cx4="http://schemas.microsoft.com/office/drawing/2016/5/10/chartex" xmlns:cx5="http://schemas.microsoft.com/office/drawing/2016/5/11/chartex" xmlns:cx6="http://schemas.microsoft.com/office/drawing/2016/5/12/chartex" xmlns:cx7="http://schemas.microsoft.com/office/drawing/2016/5/13/chartex" xmlns:cx8="http://schemas.microsoft.com/office/drawing/2016/5/14/chartex" xmlns:mc="http://schemas.openxmlformats.org/markup-compatibility/2006" xmlns:m="http://schemas.openxmlformats.org/officeDocument/2006/math" xmlns:aink="http://schemas.microsoft.com/office/drawing/2016/ink" xmlns:am3d="http://schemas.microsoft.com/office/drawing/2017/model3d" xmlns:oel="http://schemas.microsoft.com/office/2019/extlst" xmlns:r="http://schemas.openxmlformats.org/officeDocument/2006/relationships" xmlns:wp14="http://schemas.microsoft.com/office/word/2010/wordprocessingDrawing" xmlns:wp="http://schemas.openxmlformats.org/drawingml/2006/wordprocessingDrawing" xmlns:wpg="http://schemas.microsoft.com/office/word/2010/wordprocessingGroup" xmlns:wpi="http://schemas.microsoft.com/office/word/2010/wordprocessingInk" xmlns:wps="http://schemas.microsoft.com/office/word/2010/wordprocessingShape" xmlns:o="urn:schemas-microsoft-com:office:office" xmlns:v="urn:schemas-microsoft-com:vml" xmlns:w10="urn:schemas-microsoft-com:office:word" xmlns:w="http://schemas.openxmlformats.org/wordprocessingml/2006/main" xmlns:w14="http://schemas.microsoft.com/office/word/2010/wordml" xmlns:w15="http://schemas.microsoft.com/office/word/2012/wordml" xmlns:w16cei="http://schemas.microsoft.com/office/word/2026/wordml/cei" xmlns:w16cex="http://schemas.microsoft.com/office/word/2018/wordml/cex" xmlns:w16cid="http://schemas.microsoft.com/office/word/2016/wordml/cid" xmlns:w16="http://schemas.microsoft.com/office/word/2018/wordml" xmlns:w16sdtdh="http://schemas.microsoft.com/office/word/2020/wordml/sdtdatahash" xmlns:w16sdtfl="http://schemas.microsoft.com/office/word/2024/wordml/sdtformatlock" xmlns:w16se="http://schemas.microsoft.com/office/word/2015/wordml/symex" xmlns:w16du="http://schemas.microsoft.com/office/word/2023/wordml/word16du" xmlns:wne="http://schemas.microsoft.com/office/word/2006/wordml" mc:Ignorable="w14 w15 w16se w16cid w16 w16cex w16sdtdh w16sdtfl w16du wp14">
   <w:abstractNum w:abstractNumId="0" w15:restartNumberingAfterBreak="0">
     <w:nsid w:val="FFFFFF89"/>
     <w:multiLevelType w:val="singleLevel"/>
@@ -7657,7 +8001,7 @@
     <w:lvl w:ilvl="0">
       <w:start w:val="1"/>
       <w:numFmt w:val="bullet"/>
-      <w:pStyle w:val="ListBullet"/>
+      <w:pStyle w:val="a"/>
       <w:lvlText w:val="•"/>
       <w:lvlJc w:val="left"/>
       <w:pPr>
@@ -8232,7 +8576,7 @@
     <w:lvl w:ilvl="0">
       <w:start w:val="1"/>
       <w:numFmt w:val="decimal"/>
-      <w:pStyle w:val="ListNumber"/>
+      <w:pStyle w:val="a0"/>
       <w:lvlText w:val="%1."/>
       <w:lvlJc w:val="left"/>
       <w:pPr>
@@ -8246,7 +8590,7 @@
     <w:lvl w:ilvl="1">
       <w:start w:val="1"/>
       <w:numFmt w:val="decimal"/>
-      <w:pStyle w:val="ListNumber2"/>
+      <w:pStyle w:val="2"/>
       <w:suff w:val="space"/>
       <w:lvlText w:val="%1.%2"/>
       <w:lvlJc w:val="left"/>
@@ -8261,7 +8605,7 @@
     <w:lvl w:ilvl="2">
       <w:start w:val="1"/>
       <w:numFmt w:val="lowerLetter"/>
-      <w:pStyle w:val="ListNumber3"/>
+      <w:pStyle w:val="3"/>
       <w:lvlText w:val="%3."/>
       <w:lvlJc w:val="left"/>
       <w:pPr>
@@ -8275,7 +8619,7 @@
     <w:lvl w:ilvl="3">
       <w:start w:val="1"/>
       <w:numFmt w:val="lowerRoman"/>
-      <w:pStyle w:val="ListNumber4"/>
+      <w:pStyle w:val="4"/>
       <w:lvlText w:val="%4."/>
       <w:lvlJc w:val="left"/>
       <w:pPr>
@@ -8289,7 +8633,7 @@
     <w:lvl w:ilvl="4">
       <w:start w:val="1"/>
       <w:numFmt w:val="lowerLetter"/>
-      <w:pStyle w:val="ListNumber5"/>
+      <w:pStyle w:val="5"/>
       <w:lvlText w:val="(%5)"/>
       <w:lvlJc w:val="left"/>
       <w:pPr>
@@ -9880,7 +10224,7 @@
 </file>
 
 <file path=word/styles.xml><?xml version="1.0" encoding="utf-8"?>
-<w:styles xmlns:mc="http://schemas.openxmlformats.org/markup-compatibility/2006" xmlns:r="http://schemas.openxmlformats.org/officeDocument/2006/relationships" xmlns:w="http://schemas.openxmlformats.org/wordprocessingml/2006/main" xmlns:w14="http://schemas.microsoft.com/office/word/2010/wordml" xmlns:w15="http://schemas.microsoft.com/office/word/2012/wordml" xmlns:w16cex="http://schemas.microsoft.com/office/word/2018/wordml/cex" xmlns:w16cid="http://schemas.microsoft.com/office/word/2016/wordml/cid" xmlns:w16="http://schemas.microsoft.com/office/word/2018/wordml" xmlns:w16du="http://schemas.microsoft.com/office/word/2023/wordml/word16du" xmlns:w16sdtdh="http://schemas.microsoft.com/office/word/2020/wordml/sdtdatahash" xmlns:w16sdtfl="http://schemas.microsoft.com/office/word/2024/wordml/sdtformatlock" xmlns:w16se="http://schemas.microsoft.com/office/word/2015/wordml/symex" mc:Ignorable="w14 w15 w16se w16cid w16 w16cex w16sdtdh w16sdtfl w16du">
+<w:styles xmlns:mc="http://schemas.openxmlformats.org/markup-compatibility/2006" xmlns:r="http://schemas.openxmlformats.org/officeDocument/2006/relationships" xmlns:w="http://schemas.openxmlformats.org/wordprocessingml/2006/main" xmlns:w14="http://schemas.microsoft.com/office/word/2010/wordml" xmlns:w15="http://schemas.microsoft.com/office/word/2012/wordml" xmlns:w16cex="http://schemas.microsoft.com/office/word/2018/wordml/cex" xmlns:w16cid="http://schemas.microsoft.com/office/word/2016/wordml/cid" xmlns:w16="http://schemas.microsoft.com/office/word/2018/wordml" xmlns:w16sdtdh="http://schemas.microsoft.com/office/word/2020/wordml/sdtdatahash" xmlns:w16sdtfl="http://schemas.microsoft.com/office/word/2024/wordml/sdtformatlock" xmlns:w16se="http://schemas.microsoft.com/office/word/2015/wordml/symex" xmlns:w16du="http://schemas.microsoft.com/office/word/2023/wordml/word16du" mc:Ignorable="w14 w15 w16se w16cid w16 w16cex w16sdtdh w16sdtfl w16du">
   <w:docDefaults>
     <w:rPrDefault>
       <w:rPr>
@@ -10273,16 +10617,16 @@
     <w:lsdException w:name="Unresolved Mention" w:semiHidden="1" w:unhideWhenUsed="1"/>
     <w:lsdException w:name="Smart Link" w:semiHidden="1" w:unhideWhenUsed="1"/>
   </w:latentStyles>
-  <w:style w:type="paragraph" w:default="1" w:styleId="Normal">
+  <w:style w:type="paragraph" w:default="1" w:styleId="a1">
     <w:name w:val="Normal"/>
     <w:qFormat/>
     <w:rsid w:val="00EE0FE4"/>
   </w:style>
-  <w:style w:type="paragraph" w:styleId="Heading1">
+  <w:style w:type="paragraph" w:styleId="1">
     <w:name w:val="heading 1"/>
-    <w:basedOn w:val="Normal"/>
-    <w:next w:val="Normal"/>
-    <w:link w:val="Heading1Char"/>
+    <w:basedOn w:val="a1"/>
+    <w:next w:val="a1"/>
+    <w:link w:val="1Char"/>
     <w:uiPriority w:val="1"/>
     <w:qFormat/>
     <w:pPr>
@@ -10301,11 +10645,11 @@
       <w:sz w:val="40"/>
     </w:rPr>
   </w:style>
-  <w:style w:type="paragraph" w:styleId="Heading2">
+  <w:style w:type="paragraph" w:styleId="20">
     <w:name w:val="heading 2"/>
-    <w:basedOn w:val="Normal"/>
-    <w:next w:val="Normal"/>
-    <w:link w:val="Heading2Char"/>
+    <w:basedOn w:val="a1"/>
+    <w:next w:val="a1"/>
+    <w:link w:val="2Char"/>
     <w:uiPriority w:val="1"/>
     <w:unhideWhenUsed/>
     <w:qFormat/>
@@ -10323,11 +10667,11 @@
       <w:sz w:val="28"/>
     </w:rPr>
   </w:style>
-  <w:style w:type="paragraph" w:styleId="Heading3">
+  <w:style w:type="paragraph" w:styleId="30">
     <w:name w:val="heading 3"/>
-    <w:basedOn w:val="Normal"/>
-    <w:next w:val="Normal"/>
-    <w:link w:val="Heading3Char"/>
+    <w:basedOn w:val="a1"/>
+    <w:next w:val="a1"/>
+    <w:link w:val="3Char"/>
     <w:uiPriority w:val="1"/>
     <w:semiHidden/>
     <w:unhideWhenUsed/>
@@ -10346,13 +10690,13 @@
       <w:szCs w:val="24"/>
     </w:rPr>
   </w:style>
-  <w:style w:type="character" w:default="1" w:styleId="DefaultParagraphFont">
+  <w:style w:type="character" w:default="1" w:styleId="a2">
     <w:name w:val="Default Paragraph Font"/>
     <w:uiPriority w:val="1"/>
     <w:semiHidden/>
     <w:unhideWhenUsed/>
   </w:style>
-  <w:style w:type="table" w:default="1" w:styleId="TableNormal">
+  <w:style w:type="table" w:default="1" w:styleId="a3">
     <w:name w:val="Normal Table"/>
     <w:uiPriority w:val="99"/>
     <w:semiHidden/>
@@ -10367,16 +10711,16 @@
       </w:tblCellMar>
     </w:tblPr>
   </w:style>
-  <w:style w:type="numbering" w:default="1" w:styleId="NoList">
+  <w:style w:type="numbering" w:default="1" w:styleId="a4">
     <w:name w:val="No List"/>
     <w:uiPriority w:val="99"/>
     <w:semiHidden/>
     <w:unhideWhenUsed/>
   </w:style>
-  <w:style w:type="paragraph" w:styleId="Footer">
+  <w:style w:type="paragraph" w:styleId="a5">
     <w:name w:val="footer"/>
-    <w:basedOn w:val="Normal"/>
-    <w:link w:val="FooterChar"/>
+    <w:basedOn w:val="a1"/>
+    <w:link w:val="Char"/>
     <w:uiPriority w:val="99"/>
     <w:unhideWhenUsed/>
     <w:qFormat/>
@@ -10388,20 +10732,20 @@
       <w:color w:val="EF4623" w:themeColor="accent1"/>
     </w:rPr>
   </w:style>
-  <w:style w:type="character" w:customStyle="1" w:styleId="FooterChar">
-    <w:name w:val="Footer Char"/>
-    <w:basedOn w:val="DefaultParagraphFont"/>
-    <w:link w:val="Footer"/>
+  <w:style w:type="character" w:customStyle="1" w:styleId="Char">
+    <w:name w:val="تذييل الصفحة Char"/>
+    <w:basedOn w:val="a2"/>
+    <w:link w:val="a5"/>
     <w:uiPriority w:val="99"/>
     <w:rPr>
       <w:color w:val="EF4623" w:themeColor="accent1"/>
     </w:rPr>
   </w:style>
-  <w:style w:type="paragraph" w:styleId="Subtitle">
+  <w:style w:type="paragraph" w:styleId="a6">
     <w:name w:val="Subtitle"/>
-    <w:basedOn w:val="Normal"/>
-    <w:next w:val="Normal"/>
-    <w:link w:val="SubtitleChar"/>
+    <w:basedOn w:val="a1"/>
+    <w:next w:val="a1"/>
+    <w:link w:val="Char0"/>
     <w:uiPriority w:val="3"/>
     <w:unhideWhenUsed/>
     <w:qFormat/>
@@ -10424,36 +10768,36 @@
   </w:style>
   <w:style w:type="paragraph" w:customStyle="1" w:styleId="Graphic">
     <w:name w:val="Graphic"/>
-    <w:basedOn w:val="Normal"/>
+    <w:basedOn w:val="a1"/>
     <w:uiPriority w:val="99"/>
     <w:pPr>
       <w:spacing w:after="80" w:line="240" w:lineRule="auto"/>
       <w:jc w:val="center"/>
     </w:pPr>
   </w:style>
-  <w:style w:type="paragraph" w:styleId="Header">
+  <w:style w:type="paragraph" w:styleId="a7">
     <w:name w:val="header"/>
-    <w:basedOn w:val="Normal"/>
-    <w:link w:val="HeaderChar"/>
+    <w:basedOn w:val="a1"/>
+    <w:link w:val="Char1"/>
     <w:uiPriority w:val="99"/>
     <w:qFormat/>
     <w:pPr>
       <w:spacing w:after="380" w:line="240" w:lineRule="auto"/>
     </w:pPr>
   </w:style>
-  <w:style w:type="character" w:customStyle="1" w:styleId="HeaderChar">
-    <w:name w:val="Header Char"/>
-    <w:basedOn w:val="DefaultParagraphFont"/>
-    <w:link w:val="Header"/>
+  <w:style w:type="character" w:customStyle="1" w:styleId="Char1">
+    <w:name w:val="رأس الصفحة Char"/>
+    <w:basedOn w:val="a2"/>
+    <w:link w:val="a7"/>
     <w:uiPriority w:val="99"/>
     <w:rPr>
       <w:color w:val="404040" w:themeColor="text1" w:themeTint="BF"/>
       <w:sz w:val="20"/>
     </w:rPr>
   </w:style>
-  <w:style w:type="table" w:styleId="TableGrid">
+  <w:style w:type="table" w:styleId="a8">
     <w:name w:val="Table Grid"/>
-    <w:basedOn w:val="TableNormal"/>
+    <w:basedOn w:val="a3"/>
     <w:uiPriority w:val="59"/>
     <w:pPr>
       <w:spacing w:before="120" w:after="120" w:line="240" w:lineRule="auto"/>
@@ -10510,7 +10854,7 @@
   </w:style>
   <w:style w:type="paragraph" w:customStyle="1" w:styleId="InfoHeading">
     <w:name w:val="Info Heading"/>
-    <w:basedOn w:val="Normal"/>
+    <w:basedOn w:val="a1"/>
     <w:uiPriority w:val="2"/>
     <w:qFormat/>
     <w:pPr>
@@ -10527,8 +10871,8 @@
   </w:style>
   <w:style w:type="paragraph" w:customStyle="1" w:styleId="Page">
     <w:name w:val="Page"/>
-    <w:basedOn w:val="Normal"/>
-    <w:next w:val="Normal"/>
+    <w:basedOn w:val="a1"/>
+    <w:next w:val="a1"/>
     <w:uiPriority w:val="99"/>
     <w:unhideWhenUsed/>
     <w:qFormat/>
@@ -10541,11 +10885,11 @@
       <w:sz w:val="36"/>
     </w:rPr>
   </w:style>
-  <w:style w:type="paragraph" w:styleId="Title">
+  <w:style w:type="paragraph" w:styleId="a9">
     <w:name w:val="Title"/>
-    <w:basedOn w:val="Normal"/>
-    <w:next w:val="Normal"/>
-    <w:link w:val="TitleChar"/>
+    <w:basedOn w:val="a1"/>
+    <w:next w:val="a1"/>
+    <w:link w:val="Char2"/>
     <w:uiPriority w:val="2"/>
     <w:qFormat/>
     <w:pPr>
@@ -10559,10 +10903,10 @@
       <w:sz w:val="200"/>
     </w:rPr>
   </w:style>
-  <w:style w:type="character" w:customStyle="1" w:styleId="TitleChar">
-    <w:name w:val="Title Char"/>
-    <w:basedOn w:val="DefaultParagraphFont"/>
-    <w:link w:val="Title"/>
+  <w:style w:type="character" w:customStyle="1" w:styleId="Char2">
+    <w:name w:val="العنوان Char"/>
+    <w:basedOn w:val="a2"/>
+    <w:link w:val="a9"/>
     <w:uiPriority w:val="2"/>
     <w:rPr>
       <w:rFonts w:asciiTheme="majorHAnsi" w:eastAsiaTheme="majorEastAsia" w:hAnsiTheme="majorHAnsi" w:cstheme="majorBidi"/>
@@ -10572,19 +10916,19 @@
       <w:sz w:val="200"/>
     </w:rPr>
   </w:style>
-  <w:style w:type="character" w:styleId="PlaceholderText">
+  <w:style w:type="character" w:styleId="aa">
     <w:name w:val="Placeholder Text"/>
-    <w:basedOn w:val="DefaultParagraphFont"/>
+    <w:basedOn w:val="a2"/>
     <w:uiPriority w:val="99"/>
     <w:semiHidden/>
     <w:rPr>
       <w:color w:val="808080"/>
     </w:rPr>
   </w:style>
-  <w:style w:type="paragraph" w:styleId="BalloonText">
+  <w:style w:type="paragraph" w:styleId="ab">
     <w:name w:val="Balloon Text"/>
-    <w:basedOn w:val="Normal"/>
-    <w:link w:val="BalloonTextChar"/>
+    <w:basedOn w:val="a1"/>
+    <w:link w:val="Char3"/>
     <w:uiPriority w:val="99"/>
     <w:semiHidden/>
     <w:unhideWhenUsed/>
@@ -10596,10 +10940,10 @@
       <w:sz w:val="16"/>
     </w:rPr>
   </w:style>
-  <w:style w:type="character" w:customStyle="1" w:styleId="BalloonTextChar">
-    <w:name w:val="Balloon Text Char"/>
-    <w:basedOn w:val="DefaultParagraphFont"/>
-    <w:link w:val="BalloonText"/>
+  <w:style w:type="character" w:customStyle="1" w:styleId="Char3">
+    <w:name w:val="نص في بالون Char"/>
+    <w:basedOn w:val="a2"/>
+    <w:link w:val="ab"/>
     <w:uiPriority w:val="99"/>
     <w:semiHidden/>
     <w:rPr>
@@ -10607,9 +10951,9 @@
       <w:sz w:val="16"/>
     </w:rPr>
   </w:style>
-  <w:style w:type="character" w:styleId="Strong">
+  <w:style w:type="character" w:styleId="ac">
     <w:name w:val="Strong"/>
-    <w:basedOn w:val="DefaultParagraphFont"/>
+    <w:basedOn w:val="a2"/>
     <w:uiPriority w:val="10"/>
     <w:qFormat/>
     <w:rPr>
@@ -10617,10 +10961,10 @@
       <w:bCs/>
     </w:rPr>
   </w:style>
-  <w:style w:type="character" w:customStyle="1" w:styleId="SubtitleChar">
-    <w:name w:val="Subtitle Char"/>
-    <w:basedOn w:val="DefaultParagraphFont"/>
-    <w:link w:val="Subtitle"/>
+  <w:style w:type="character" w:customStyle="1" w:styleId="Char0">
+    <w:name w:val="عنوان فرعي Char"/>
+    <w:basedOn w:val="a2"/>
+    <w:link w:val="a6"/>
     <w:uiPriority w:val="3"/>
     <w:rPr>
       <w:rFonts w:asciiTheme="majorHAnsi" w:eastAsiaTheme="majorEastAsia" w:hAnsiTheme="majorHAnsi" w:cstheme="majorBidi"/>
@@ -10634,7 +10978,7 @@
   </w:style>
   <w:style w:type="paragraph" w:customStyle="1" w:styleId="Abstract">
     <w:name w:val="Abstract"/>
-    <w:basedOn w:val="Normal"/>
+    <w:basedOn w:val="a1"/>
     <w:uiPriority w:val="3"/>
     <w:qFormat/>
     <w:pPr>
@@ -10648,9 +10992,9 @@
       <w:sz w:val="28"/>
     </w:rPr>
   </w:style>
-  <w:style w:type="paragraph" w:styleId="NoSpacing">
+  <w:style w:type="paragraph" w:styleId="ad">
     <w:name w:val="No Spacing"/>
-    <w:link w:val="NoSpacingChar"/>
+    <w:link w:val="Char4"/>
     <w:uiPriority w:val="1"/>
     <w:unhideWhenUsed/>
     <w:qFormat/>
@@ -10660,7 +11004,7 @@
   </w:style>
   <w:style w:type="character" w:styleId="Hyperlink">
     <w:name w:val="Hyperlink"/>
-    <w:basedOn w:val="DefaultParagraphFont"/>
+    <w:basedOn w:val="a2"/>
     <w:uiPriority w:val="99"/>
     <w:unhideWhenUsed/>
     <w:rPr>
@@ -10668,10 +11012,10 @@
       <w:u w:val="single"/>
     </w:rPr>
   </w:style>
-  <w:style w:type="paragraph" w:styleId="TOC1">
+  <w:style w:type="paragraph" w:styleId="10">
     <w:name w:val="toc 1"/>
-    <w:basedOn w:val="Normal"/>
-    <w:next w:val="Normal"/>
+    <w:basedOn w:val="a1"/>
+    <w:next w:val="a1"/>
     <w:autoRedefine/>
     <w:uiPriority w:val="39"/>
     <w:unhideWhenUsed/>
@@ -10686,10 +11030,10 @@
       <w:kern w:val="20"/>
     </w:rPr>
   </w:style>
-  <w:style w:type="character" w:customStyle="1" w:styleId="Heading1Char">
-    <w:name w:val="Heading 1 Char"/>
-    <w:basedOn w:val="DefaultParagraphFont"/>
-    <w:link w:val="Heading1"/>
+  <w:style w:type="character" w:customStyle="1" w:styleId="1Char">
+    <w:name w:val="العنوان 1 Char"/>
+    <w:basedOn w:val="a2"/>
+    <w:link w:val="1"/>
     <w:uiPriority w:val="1"/>
     <w:rPr>
       <w:rFonts w:asciiTheme="majorHAnsi" w:eastAsiaTheme="majorEastAsia" w:hAnsiTheme="majorHAnsi" w:cstheme="majorBidi"/>
@@ -10699,10 +11043,10 @@
       <w:sz w:val="40"/>
     </w:rPr>
   </w:style>
-  <w:style w:type="paragraph" w:styleId="TOCHeading">
+  <w:style w:type="paragraph" w:styleId="ae">
     <w:name w:val="TOC Heading"/>
-    <w:basedOn w:val="Heading1"/>
-    <w:next w:val="Normal"/>
+    <w:basedOn w:val="1"/>
+    <w:next w:val="a1"/>
     <w:uiPriority w:val="39"/>
     <w:unhideWhenUsed/>
     <w:qFormat/>
@@ -10719,10 +11063,10 @@
       <w:sz w:val="44"/>
     </w:rPr>
   </w:style>
-  <w:style w:type="character" w:customStyle="1" w:styleId="Heading2Char">
-    <w:name w:val="Heading 2 Char"/>
-    <w:basedOn w:val="DefaultParagraphFont"/>
-    <w:link w:val="Heading2"/>
+  <w:style w:type="character" w:customStyle="1" w:styleId="2Char">
+    <w:name w:val="عنوان 2 Char"/>
+    <w:basedOn w:val="a2"/>
+    <w:link w:val="20"/>
     <w:uiPriority w:val="1"/>
     <w:rPr>
       <w:rFonts w:asciiTheme="majorHAnsi" w:eastAsiaTheme="majorEastAsia" w:hAnsiTheme="majorHAnsi" w:cstheme="majorBidi"/>
@@ -10732,11 +11076,11 @@
       <w:sz w:val="28"/>
     </w:rPr>
   </w:style>
-  <w:style w:type="paragraph" w:styleId="Quote">
+  <w:style w:type="paragraph" w:styleId="af">
     <w:name w:val="Quote"/>
-    <w:basedOn w:val="Normal"/>
-    <w:next w:val="Normal"/>
-    <w:link w:val="QuoteChar"/>
+    <w:basedOn w:val="a1"/>
+    <w:next w:val="a1"/>
+    <w:link w:val="Char5"/>
     <w:uiPriority w:val="1"/>
     <w:unhideWhenUsed/>
     <w:qFormat/>
@@ -10751,10 +11095,10 @@
       <w:sz w:val="24"/>
     </w:rPr>
   </w:style>
-  <w:style w:type="character" w:customStyle="1" w:styleId="QuoteChar">
-    <w:name w:val="Quote Char"/>
-    <w:basedOn w:val="DefaultParagraphFont"/>
-    <w:link w:val="Quote"/>
+  <w:style w:type="character" w:customStyle="1" w:styleId="Char5">
+    <w:name w:val="اقتباس Char"/>
+    <w:basedOn w:val="a2"/>
+    <w:link w:val="af"/>
     <w:uiPriority w:val="1"/>
     <w:rPr>
       <w:i/>
@@ -10764,10 +11108,10 @@
       <w:sz w:val="24"/>
     </w:rPr>
   </w:style>
-  <w:style w:type="paragraph" w:styleId="Signature">
+  <w:style w:type="paragraph" w:styleId="af0">
     <w:name w:val="Signature"/>
-    <w:basedOn w:val="Normal"/>
-    <w:link w:val="SignatureChar"/>
+    <w:basedOn w:val="a1"/>
+    <w:link w:val="Char6"/>
     <w:uiPriority w:val="9"/>
     <w:unhideWhenUsed/>
     <w:qFormat/>
@@ -10780,25 +11124,25 @@
       <w:kern w:val="20"/>
     </w:rPr>
   </w:style>
-  <w:style w:type="character" w:customStyle="1" w:styleId="SignatureChar">
-    <w:name w:val="Signature Char"/>
-    <w:basedOn w:val="DefaultParagraphFont"/>
-    <w:link w:val="Signature"/>
+  <w:style w:type="character" w:customStyle="1" w:styleId="Char6">
+    <w:name w:val="توقيع Char"/>
+    <w:basedOn w:val="a2"/>
+    <w:link w:val="af0"/>
     <w:uiPriority w:val="9"/>
     <w:rPr>
       <w:color w:val="595959" w:themeColor="text1" w:themeTint="A6"/>
       <w:kern w:val="20"/>
     </w:rPr>
   </w:style>
-  <w:style w:type="character" w:customStyle="1" w:styleId="NoSpacingChar">
-    <w:name w:val="No Spacing Char"/>
-    <w:basedOn w:val="DefaultParagraphFont"/>
-    <w:link w:val="NoSpacing"/>
+  <w:style w:type="character" w:customStyle="1" w:styleId="Char4">
+    <w:name w:val="بلا تباعد Char"/>
+    <w:basedOn w:val="a2"/>
+    <w:link w:val="ad"/>
     <w:uiPriority w:val="1"/>
   </w:style>
-  <w:style w:type="paragraph" w:styleId="ListBullet">
+  <w:style w:type="paragraph" w:styleId="a">
     <w:name w:val="List Bullet"/>
-    <w:basedOn w:val="Normal"/>
+    <w:basedOn w:val="a1"/>
     <w:uiPriority w:val="1"/>
     <w:unhideWhenUsed/>
     <w:qFormat/>
@@ -10813,9 +11157,9 @@
       <w:kern w:val="20"/>
     </w:rPr>
   </w:style>
-  <w:style w:type="paragraph" w:styleId="ListNumber">
+  <w:style w:type="paragraph" w:styleId="a0">
     <w:name w:val="List Number"/>
-    <w:basedOn w:val="Normal"/>
+    <w:basedOn w:val="a1"/>
     <w:uiPriority w:val="1"/>
     <w:unhideWhenUsed/>
     <w:qFormat/>
@@ -10831,9 +11175,9 @@
       <w:kern w:val="20"/>
     </w:rPr>
   </w:style>
-  <w:style w:type="paragraph" w:styleId="ListNumber2">
+  <w:style w:type="paragraph" w:styleId="2">
     <w:name w:val="List Number 2"/>
-    <w:basedOn w:val="Normal"/>
+    <w:basedOn w:val="a1"/>
     <w:uiPriority w:val="1"/>
     <w:unhideWhenUsed/>
     <w:qFormat/>
@@ -10850,9 +11194,9 @@
       <w:kern w:val="20"/>
     </w:rPr>
   </w:style>
-  <w:style w:type="paragraph" w:styleId="ListNumber3">
+  <w:style w:type="paragraph" w:styleId="3">
     <w:name w:val="List Number 3"/>
-    <w:basedOn w:val="Normal"/>
+    <w:basedOn w:val="a1"/>
     <w:uiPriority w:val="18"/>
     <w:unhideWhenUsed/>
     <w:pPr>
@@ -10868,9 +11212,9 @@
       <w:kern w:val="20"/>
     </w:rPr>
   </w:style>
-  <w:style w:type="paragraph" w:styleId="ListNumber4">
+  <w:style w:type="paragraph" w:styleId="4">
     <w:name w:val="List Number 4"/>
-    <w:basedOn w:val="Normal"/>
+    <w:basedOn w:val="a1"/>
     <w:uiPriority w:val="18"/>
     <w:unhideWhenUsed/>
     <w:pPr>
@@ -10886,9 +11230,9 @@
       <w:kern w:val="20"/>
     </w:rPr>
   </w:style>
-  <w:style w:type="paragraph" w:styleId="ListNumber5">
+  <w:style w:type="paragraph" w:styleId="5">
     <w:name w:val="List Number 5"/>
-    <w:basedOn w:val="Normal"/>
+    <w:basedOn w:val="a1"/>
     <w:uiPriority w:val="18"/>
     <w:unhideWhenUsed/>
     <w:pPr>
@@ -10906,7 +11250,7 @@
   </w:style>
   <w:style w:type="table" w:customStyle="1" w:styleId="FinancialTable">
     <w:name w:val="Financial Table"/>
-    <w:basedOn w:val="TableNormal"/>
+    <w:basedOn w:val="a3"/>
     <w:uiPriority w:val="99"/>
     <w:pPr>
       <w:spacing w:before="60" w:after="60" w:line="240" w:lineRule="auto"/>
@@ -10948,9 +11292,9 @@
       </w:rPr>
     </w:tblStylePr>
   </w:style>
-  <w:style w:type="character" w:styleId="CommentReference">
+  <w:style w:type="character" w:styleId="af1">
     <w:name w:val="annotation reference"/>
-    <w:basedOn w:val="DefaultParagraphFont"/>
+    <w:basedOn w:val="a2"/>
     <w:uiPriority w:val="99"/>
     <w:semiHidden/>
     <w:unhideWhenUsed/>
@@ -10958,27 +11302,27 @@
       <w:sz w:val="16"/>
     </w:rPr>
   </w:style>
-  <w:style w:type="paragraph" w:styleId="CommentText">
+  <w:style w:type="paragraph" w:styleId="af2">
     <w:name w:val="annotation text"/>
-    <w:basedOn w:val="Normal"/>
-    <w:link w:val="CommentTextChar"/>
+    <w:basedOn w:val="a1"/>
+    <w:link w:val="Char7"/>
     <w:uiPriority w:val="99"/>
     <w:unhideWhenUsed/>
     <w:pPr>
       <w:spacing w:line="240" w:lineRule="auto"/>
     </w:pPr>
   </w:style>
-  <w:style w:type="character" w:customStyle="1" w:styleId="CommentTextChar">
-    <w:name w:val="Comment Text Char"/>
-    <w:basedOn w:val="DefaultParagraphFont"/>
-    <w:link w:val="CommentText"/>
+  <w:style w:type="character" w:customStyle="1" w:styleId="Char7">
+    <w:name w:val="نص تعليق Char"/>
+    <w:basedOn w:val="a2"/>
+    <w:link w:val="af2"/>
     <w:uiPriority w:val="99"/>
   </w:style>
-  <w:style w:type="paragraph" w:styleId="CommentSubject">
+  <w:style w:type="paragraph" w:styleId="af3">
     <w:name w:val="annotation subject"/>
-    <w:basedOn w:val="CommentText"/>
-    <w:next w:val="CommentText"/>
-    <w:link w:val="CommentSubjectChar"/>
+    <w:basedOn w:val="af2"/>
+    <w:next w:val="af2"/>
+    <w:link w:val="Char8"/>
     <w:uiPriority w:val="99"/>
     <w:semiHidden/>
     <w:unhideWhenUsed/>
@@ -10987,10 +11331,10 @@
       <w:bCs/>
     </w:rPr>
   </w:style>
-  <w:style w:type="character" w:customStyle="1" w:styleId="CommentSubjectChar">
-    <w:name w:val="Comment Subject Char"/>
-    <w:basedOn w:val="CommentTextChar"/>
-    <w:link w:val="CommentSubject"/>
+  <w:style w:type="character" w:customStyle="1" w:styleId="Char8">
+    <w:name w:val="موضوع تعليق Char"/>
+    <w:basedOn w:val="Char7"/>
+    <w:link w:val="af3"/>
     <w:uiPriority w:val="99"/>
     <w:semiHidden/>
     <w:rPr>
@@ -10998,9 +11342,9 @@
       <w:bCs/>
     </w:rPr>
   </w:style>
-  <w:style w:type="table" w:styleId="LightShading">
+  <w:style w:type="table" w:styleId="af4">
     <w:name w:val="Light Shading"/>
-    <w:basedOn w:val="TableNormal"/>
+    <w:basedOn w:val="a3"/>
     <w:uiPriority w:val="60"/>
     <w:pPr>
       <w:spacing w:after="0" w:line="240" w:lineRule="auto"/>
@@ -11095,7 +11439,7 @@
   </w:style>
   <w:style w:type="paragraph" w:customStyle="1" w:styleId="TableTextDecimal">
     <w:name w:val="Table Text Decimal"/>
-    <w:basedOn w:val="Normal"/>
+    <w:basedOn w:val="a1"/>
     <w:uiPriority w:val="1"/>
     <w:qFormat/>
     <w:pPr>
@@ -11107,7 +11451,7 @@
   </w:style>
   <w:style w:type="paragraph" w:customStyle="1" w:styleId="TableText">
     <w:name w:val="Table Text"/>
-    <w:basedOn w:val="Normal"/>
+    <w:basedOn w:val="a1"/>
     <w:uiPriority w:val="1"/>
     <w:qFormat/>
     <w:pPr>
@@ -11116,7 +11460,7 @@
   </w:style>
   <w:style w:type="paragraph" w:customStyle="1" w:styleId="Organization">
     <w:name w:val="Organization"/>
-    <w:basedOn w:val="Normal"/>
+    <w:basedOn w:val="a1"/>
     <w:uiPriority w:val="2"/>
     <w:qFormat/>
     <w:pPr>
@@ -11130,9 +11474,9 @@
       <w:sz w:val="36"/>
     </w:rPr>
   </w:style>
-  <w:style w:type="paragraph" w:styleId="ListParagraph">
+  <w:style w:type="paragraph" w:styleId="af5">
     <w:name w:val="List Paragraph"/>
-    <w:basedOn w:val="Normal"/>
+    <w:basedOn w:val="a1"/>
     <w:uiPriority w:val="34"/>
     <w:qFormat/>
     <w:rsid w:val="001B698D"/>
@@ -11141,9 +11485,9 @@
       <w:contextualSpacing/>
     </w:pPr>
   </w:style>
-  <w:style w:type="character" w:styleId="UnresolvedMention">
+  <w:style w:type="character" w:styleId="af6">
     <w:name w:val="Unresolved Mention"/>
-    <w:basedOn w:val="DefaultParagraphFont"/>
+    <w:basedOn w:val="a2"/>
     <w:uiPriority w:val="99"/>
     <w:semiHidden/>
     <w:unhideWhenUsed/>
@@ -11153,10 +11497,10 @@
       <w:shd w:val="clear" w:color="auto" w:fill="E1DFDD"/>
     </w:rPr>
   </w:style>
-  <w:style w:type="character" w:customStyle="1" w:styleId="Heading3Char">
-    <w:name w:val="Heading 3 Char"/>
-    <w:basedOn w:val="DefaultParagraphFont"/>
-    <w:link w:val="Heading3"/>
+  <w:style w:type="character" w:customStyle="1" w:styleId="3Char">
+    <w:name w:val="عنوان 3 Char"/>
+    <w:basedOn w:val="a2"/>
+    <w:link w:val="30"/>
     <w:uiPriority w:val="1"/>
     <w:semiHidden/>
     <w:rsid w:val="00667896"/>
@@ -11167,11 +11511,29 @@
       <w:szCs w:val="24"/>
     </w:rPr>
   </w:style>
+  <w:style w:type="paragraph" w:styleId="af7">
+    <w:name w:val="Normal (Web)"/>
+    <w:basedOn w:val="a1"/>
+    <w:uiPriority w:val="99"/>
+    <w:semiHidden/>
+    <w:unhideWhenUsed/>
+    <w:rsid w:val="0017220E"/>
+    <w:pPr>
+      <w:spacing w:before="100" w:beforeAutospacing="1" w:after="100" w:afterAutospacing="1" w:line="240" w:lineRule="auto"/>
+    </w:pPr>
+    <w:rPr>
+      <w:rFonts w:ascii="Times New Roman" w:eastAsiaTheme="minorEastAsia" w:hAnsi="Times New Roman" w:cs="Times New Roman"/>
+      <w:color w:val="auto"/>
+      <w:sz w:val="24"/>
+      <w:szCs w:val="24"/>
+      <w:lang w:eastAsia="en-US"/>
+    </w:rPr>
+  </w:style>
 </w:styles>
 </file>
 
 <file path=word/glossary/document.xml><?xml version="1.0" encoding="utf-8"?>
-<w:glossaryDocument xmlns:wpc="http://schemas.microsoft.com/office/word/2010/wordprocessingCanvas" xmlns:cx="http://schemas.microsoft.com/office/drawing/2014/chartex" xmlns:cx1="http://schemas.microsoft.com/office/drawing/2015/9/8/chartex" xmlns:cx2="http://schemas.microsoft.com/office/drawing/2015/10/21/chartex" xmlns:cx3="http://schemas.microsoft.com/office/drawing/2016/5/9/chartex" xmlns:cx4="http://schemas.microsoft.com/office/drawing/2016/5/10/chartex" xmlns:cx5="http://schemas.microsoft.com/office/drawing/2016/5/11/chartex" xmlns:cx6="http://schemas.microsoft.com/office/drawing/2016/5/12/chartex" xmlns:cx7="http://schemas.microsoft.com/office/drawing/2016/5/13/chartex" xmlns:cx8="http://schemas.microsoft.com/office/drawing/2016/5/14/chartex" xmlns:mc="http://schemas.openxmlformats.org/markup-compatibility/2006" xmlns:aink="http://schemas.microsoft.com/office/drawing/2016/ink" xmlns:am3d="http://schemas.microsoft.com/office/drawing/2017/model3d" xmlns:o="urn:schemas-microsoft-com:office:office" xmlns:oel="http://schemas.microsoft.com/office/2019/extlst" xmlns:r="http://schemas.openxmlformats.org/officeDocument/2006/relationships" xmlns:m="http://schemas.openxmlformats.org/officeDocument/2006/math" xmlns:v="urn:schemas-microsoft-com:vml" xmlns:wp14="http://schemas.microsoft.com/office/word/2010/wordprocessingDrawing" xmlns:wp="http://schemas.openxmlformats.org/drawingml/2006/wordprocessingDrawing" xmlns:w10="urn:schemas-microsoft-com:office:word" xmlns:w="http://schemas.openxmlformats.org/wordprocessingml/2006/main" xmlns:w14="http://schemas.microsoft.com/office/word/2010/wordml" xmlns:w15="http://schemas.microsoft.com/office/word/2012/wordml" xmlns:w16cex="http://schemas.microsoft.com/office/word/2018/wordml/cex" xmlns:w16cid="http://schemas.microsoft.com/office/word/2016/wordml/cid" xmlns:w16="http://schemas.microsoft.com/office/word/2018/wordml" xmlns:w16du="http://schemas.microsoft.com/office/word/2023/wordml/word16du" xmlns:w16sdtdh="http://schemas.microsoft.com/office/word/2020/wordml/sdtdatahash" xmlns:w16sdtfl="http://schemas.microsoft.com/office/word/2024/wordml/sdtformatlock" xmlns:w16se="http://schemas.microsoft.com/office/word/2015/wordml/symex" xmlns:wpg="http://schemas.microsoft.com/office/word/2010/wordprocessingGroup" xmlns:wpi="http://schemas.microsoft.com/office/word/2010/wordprocessingInk" xmlns:wne="http://schemas.microsoft.com/office/word/2006/wordml" xmlns:wps="http://schemas.microsoft.com/office/word/2010/wordprocessingShape" mc:Ignorable="w14 w15 w16se w16cid w16 w16cex w16sdtdh w16sdtfl w16du wp14">
+<w:glossaryDocument xmlns:wpc="http://schemas.microsoft.com/office/word/2010/wordprocessingCanvas" xmlns:cx="http://schemas.microsoft.com/office/drawing/2014/chartex" xmlns:cx1="http://schemas.microsoft.com/office/drawing/2015/9/8/chartex" xmlns:cx2="http://schemas.microsoft.com/office/drawing/2015/10/21/chartex" xmlns:cx3="http://schemas.microsoft.com/office/drawing/2016/5/9/chartex" xmlns:cx4="http://schemas.microsoft.com/office/drawing/2016/5/10/chartex" xmlns:cx5="http://schemas.microsoft.com/office/drawing/2016/5/11/chartex" xmlns:cx6="http://schemas.microsoft.com/office/drawing/2016/5/12/chartex" xmlns:cx7="http://schemas.microsoft.com/office/drawing/2016/5/13/chartex" xmlns:cx8="http://schemas.microsoft.com/office/drawing/2016/5/14/chartex" xmlns:mc="http://schemas.openxmlformats.org/markup-compatibility/2006" xmlns:m="http://schemas.openxmlformats.org/officeDocument/2006/math" xmlns:aink="http://schemas.microsoft.com/office/drawing/2016/ink" xmlns:am3d="http://schemas.microsoft.com/office/drawing/2017/model3d" xmlns:oel="http://schemas.microsoft.com/office/2019/extlst" xmlns:r="http://schemas.openxmlformats.org/officeDocument/2006/relationships" xmlns:wp14="http://schemas.microsoft.com/office/word/2010/wordprocessingDrawing" xmlns:wp="http://schemas.openxmlformats.org/drawingml/2006/wordprocessingDrawing" xmlns:wpg="http://schemas.microsoft.com/office/word/2010/wordprocessingGroup" xmlns:wpi="http://schemas.microsoft.com/office/word/2010/wordprocessingInk" xmlns:wps="http://schemas.microsoft.com/office/word/2010/wordprocessingShape" xmlns:o="urn:schemas-microsoft-com:office:office" xmlns:v="urn:schemas-microsoft-com:vml" xmlns:w10="urn:schemas-microsoft-com:office:word" xmlns:w="http://schemas.openxmlformats.org/wordprocessingml/2006/main" xmlns:w14="http://schemas.microsoft.com/office/word/2010/wordml" xmlns:w15="http://schemas.microsoft.com/office/word/2012/wordml" xmlns:w16cei="http://schemas.microsoft.com/office/word/2026/wordml/cei" xmlns:w16cex="http://schemas.microsoft.com/office/word/2018/wordml/cex" xmlns:w16cid="http://schemas.microsoft.com/office/word/2016/wordml/cid" xmlns:w16="http://schemas.microsoft.com/office/word/2018/wordml" xmlns:w16sdtdh="http://schemas.microsoft.com/office/word/2020/wordml/sdtdatahash" xmlns:w16sdtfl="http://schemas.microsoft.com/office/word/2024/wordml/sdtformatlock" xmlns:w16se="http://schemas.microsoft.com/office/word/2015/wordml/symex" xmlns:w16du="http://schemas.microsoft.com/office/word/2023/wordml/word16du" xmlns:wne="http://schemas.microsoft.com/office/word/2006/wordml" mc:Ignorable="w14 w15 w16se w16cid w16 w16cex w16sdtdh w16sdtfl w16du wp14">
   <w:docParts>
     <w:docPart>
       <w:docPartPr>
@@ -11256,7 +11618,7 @@
 </file>
 
 <file path=word/glossary/fontTable.xml><?xml version="1.0" encoding="utf-8"?>
-<w:fonts xmlns:mc="http://schemas.openxmlformats.org/markup-compatibility/2006" xmlns:r="http://schemas.openxmlformats.org/officeDocument/2006/relationships" xmlns:w="http://schemas.openxmlformats.org/wordprocessingml/2006/main" xmlns:w14="http://schemas.microsoft.com/office/word/2010/wordml" xmlns:w15="http://schemas.microsoft.com/office/word/2012/wordml" xmlns:w16cex="http://schemas.microsoft.com/office/word/2018/wordml/cex" xmlns:w16cid="http://schemas.microsoft.com/office/word/2016/wordml/cid" xmlns:w16="http://schemas.microsoft.com/office/word/2018/wordml" xmlns:w16du="http://schemas.microsoft.com/office/word/2023/wordml/word16du" xmlns:w16sdtdh="http://schemas.microsoft.com/office/word/2020/wordml/sdtdatahash" xmlns:w16sdtfl="http://schemas.microsoft.com/office/word/2024/wordml/sdtformatlock" xmlns:w16se="http://schemas.microsoft.com/office/word/2015/wordml/symex" mc:Ignorable="w14 w15 w16se w16cid w16 w16cex w16sdtdh w16sdtfl w16du">
+<w:fonts xmlns:mc="http://schemas.openxmlformats.org/markup-compatibility/2006" xmlns:r="http://schemas.openxmlformats.org/officeDocument/2006/relationships" xmlns:w="http://schemas.openxmlformats.org/wordprocessingml/2006/main" xmlns:w14="http://schemas.microsoft.com/office/word/2010/wordml" xmlns:w15="http://schemas.microsoft.com/office/word/2012/wordml" xmlns:w16cex="http://schemas.microsoft.com/office/word/2018/wordml/cex" xmlns:w16cid="http://schemas.microsoft.com/office/word/2016/wordml/cid" xmlns:w16="http://schemas.microsoft.com/office/word/2018/wordml" xmlns:w16sdtdh="http://schemas.microsoft.com/office/word/2020/wordml/sdtdatahash" xmlns:w16sdtfl="http://schemas.microsoft.com/office/word/2024/wordml/sdtformatlock" xmlns:w16se="http://schemas.microsoft.com/office/word/2015/wordml/symex" xmlns:w16du="http://schemas.microsoft.com/office/word/2023/wordml/word16du" mc:Ignorable="w14 w15 w16se w16cid w16 w16cex w16sdtdh w16sdtfl w16du">
   <w:font w:name="Cambria">
     <w:panose1 w:val="02040503050406030204"/>
     <w:charset w:val="00"/>
@@ -11274,7 +11636,7 @@
   <w:font w:name="Symbol">
     <w:panose1 w:val="05050102010706020507"/>
     <w:charset w:val="02"/>
-    <w:family w:val="roman"/>
+    <w:family w:val="decorative"/>
     <w:pitch w:val="variable"/>
     <w:sig w:usb0="00000000" w:usb1="10000000" w:usb2="00000000" w:usb3="00000000" w:csb0="80000000" w:csb1="00000000"/>
   </w:font>
@@ -11288,7 +11650,7 @@
   <w:font w:name="Wingdings">
     <w:panose1 w:val="05000000000000000000"/>
     <w:charset w:val="02"/>
-    <w:family w:val="auto"/>
+    <w:family w:val="decorative"/>
     <w:pitch w:val="variable"/>
     <w:sig w:usb0="00000000" w:usb1="10000000" w:usb2="00000000" w:usb3="00000000" w:csb0="80000000" w:csb1="00000000"/>
   </w:font>
@@ -11297,7 +11659,7 @@
     <w:charset w:val="00"/>
     <w:family w:val="swiss"/>
     <w:pitch w:val="variable"/>
-    <w:sig w:usb0="E0002EFF" w:usb1="C000785B" w:usb2="00000009" w:usb3="00000000" w:csb0="000001FF" w:csb1="00000000"/>
+    <w:sig w:usb0="E0002AFF" w:usb1="C0007843" w:usb2="00000009" w:usb3="00000000" w:csb0="000001FF" w:csb1="00000000"/>
   </w:font>
   <w:font w:name="MS PGothic">
     <w:panose1 w:val="020B0600070205080204"/>
@@ -11314,6 +11676,7 @@
     <w:sig w:usb0="E1002EFF" w:usb1="C000605B" w:usb2="00000029" w:usb3="00000000" w:csb0="000101FF" w:csb1="00000000"/>
   </w:font>
   <w:font w:name="Aptos">
+    <w:panose1 w:val="020B0004020202020204"/>
     <w:charset w:val="00"/>
     <w:family w:val="swiss"/>
     <w:pitch w:val="variable"/>
@@ -11321,12 +11684,14 @@
   </w:font>
   <w:font w:name="Frutiger LT Arabic 45 Light">
     <w:altName w:val="Arial"/>
+    <w:panose1 w:val="020B0604020202020204"/>
     <w:charset w:val="00"/>
     <w:family w:val="auto"/>
     <w:pitch w:val="variable"/>
     <w:sig w:usb0="800020AF" w:usb1="C000A04A" w:usb2="00000008" w:usb3="00000000" w:csb0="00000041" w:csb1="00000000"/>
   </w:font>
   <w:font w:name="Yu Mincho">
+    <w:panose1 w:val="02020400000000000000"/>
     <w:charset w:val="80"/>
     <w:family w:val="roman"/>
     <w:pitch w:val="variable"/>
@@ -11340,6 +11705,7 @@
     <w:sig w:usb0="E00002FF" w:usb1="2AC7FDFF" w:usb2="00000016" w:usb3="00000000" w:csb0="0002009F" w:csb1="00000000"/>
   </w:font>
   <w:font w:name="Aptos Display">
+    <w:panose1 w:val="020B0004020202020204"/>
     <w:charset w:val="00"/>
     <w:family w:val="swiss"/>
     <w:pitch w:val="variable"/>
@@ -11349,7 +11715,7 @@
 </file>
 
 <file path=word/glossary/numbering.xml><?xml version="1.0" encoding="utf-8"?>
-<w:numbering xmlns:wpc="http://schemas.microsoft.com/office/word/2010/wordprocessingCanvas" xmlns:cx="http://schemas.microsoft.com/office/drawing/2014/chartex" xmlns:cx1="http://schemas.microsoft.com/office/drawing/2015/9/8/chartex" xmlns:cx2="http://schemas.microsoft.com/office/drawing/2015/10/21/chartex" xmlns:cx3="http://schemas.microsoft.com/office/drawing/2016/5/9/chartex" xmlns:cx4="http://schemas.microsoft.com/office/drawing/2016/5/10/chartex" xmlns:cx5="http://schemas.microsoft.com/office/drawing/2016/5/11/chartex" xmlns:cx6="http://schemas.microsoft.com/office/drawing/2016/5/12/chartex" xmlns:cx7="http://schemas.microsoft.com/office/drawing/2016/5/13/chartex" xmlns:cx8="http://schemas.microsoft.com/office/drawing/2016/5/14/chartex" xmlns:mc="http://schemas.openxmlformats.org/markup-compatibility/2006" xmlns:aink="http://schemas.microsoft.com/office/drawing/2016/ink" xmlns:am3d="http://schemas.microsoft.com/office/drawing/2017/model3d" xmlns:o="urn:schemas-microsoft-com:office:office" xmlns:oel="http://schemas.microsoft.com/office/2019/extlst" xmlns:r="http://schemas.openxmlformats.org/officeDocument/2006/relationships" xmlns:m="http://schemas.openxmlformats.org/officeDocument/2006/math" xmlns:v="urn:schemas-microsoft-com:vml" xmlns:wp14="http://schemas.microsoft.com/office/word/2010/wordprocessingDrawing" xmlns:wp="http://schemas.openxmlformats.org/drawingml/2006/wordprocessingDrawing" xmlns:w10="urn:schemas-microsoft-com:office:word" xmlns:w="http://schemas.openxmlformats.org/wordprocessingml/2006/main" xmlns:w14="http://schemas.microsoft.com/office/word/2010/wordml" xmlns:w15="http://schemas.microsoft.com/office/word/2012/wordml" xmlns:w16cex="http://schemas.microsoft.com/office/word/2018/wordml/cex" xmlns:w16cid="http://schemas.microsoft.com/office/word/2016/wordml/cid" xmlns:w16="http://schemas.microsoft.com/office/word/2018/wordml" xmlns:w16du="http://schemas.microsoft.com/office/word/2023/wordml/word16du" xmlns:w16sdtdh="http://schemas.microsoft.com/office/word/2020/wordml/sdtdatahash" xmlns:w16sdtfl="http://schemas.microsoft.com/office/word/2024/wordml/sdtformatlock" xmlns:w16se="http://schemas.microsoft.com/office/word/2015/wordml/symex" xmlns:wpg="http://schemas.microsoft.com/office/word/2010/wordprocessingGroup" xmlns:wpi="http://schemas.microsoft.com/office/word/2010/wordprocessingInk" xmlns:wne="http://schemas.microsoft.com/office/word/2006/wordml" xmlns:wps="http://schemas.microsoft.com/office/word/2010/wordprocessingShape" mc:Ignorable="w14 w15 w16se w16cid w16 w16cex w16sdtdh w16sdtfl w16du wp14">
+<w:numbering xmlns:wpc="http://schemas.microsoft.com/office/word/2010/wordprocessingCanvas" xmlns:cx="http://schemas.microsoft.com/office/drawing/2014/chartex" xmlns:cx1="http://schemas.microsoft.com/office/drawing/2015/9/8/chartex" xmlns:cx2="http://schemas.microsoft.com/office/drawing/2015/10/21/chartex" xmlns:cx3="http://schemas.microsoft.com/office/drawing/2016/5/9/chartex" xmlns:cx4="http://schemas.microsoft.com/office/drawing/2016/5/10/chartex" xmlns:cx5="http://schemas.microsoft.com/office/drawing/2016/5/11/chartex" xmlns:cx6="http://schemas.microsoft.com/office/drawing/2016/5/12/chartex" xmlns:cx7="http://schemas.microsoft.com/office/drawing/2016/5/13/chartex" xmlns:cx8="http://schemas.microsoft.com/office/drawing/2016/5/14/chartex" xmlns:mc="http://schemas.openxmlformats.org/markup-compatibility/2006" xmlns:m="http://schemas.openxmlformats.org/officeDocument/2006/math" xmlns:aink="http://schemas.microsoft.com/office/drawing/2016/ink" xmlns:am3d="http://schemas.microsoft.com/office/drawing/2017/model3d" xmlns:oel="http://schemas.microsoft.com/office/2019/extlst" xmlns:r="http://schemas.openxmlformats.org/officeDocument/2006/relationships" xmlns:wp14="http://schemas.microsoft.com/office/word/2010/wordprocessingDrawing" xmlns:wp="http://schemas.openxmlformats.org/drawingml/2006/wordprocessingDrawing" xmlns:wpg="http://schemas.microsoft.com/office/word/2010/wordprocessingGroup" xmlns:wpi="http://schemas.microsoft.com/office/word/2010/wordprocessingInk" xmlns:wps="http://schemas.microsoft.com/office/word/2010/wordprocessingShape" xmlns:o="urn:schemas-microsoft-com:office:office" xmlns:v="urn:schemas-microsoft-com:vml" xmlns:w10="urn:schemas-microsoft-com:office:word" xmlns:w="http://schemas.openxmlformats.org/wordprocessingml/2006/main" xmlns:w14="http://schemas.microsoft.com/office/word/2010/wordml" xmlns:w15="http://schemas.microsoft.com/office/word/2012/wordml" xmlns:w16cei="http://schemas.microsoft.com/office/word/2026/wordml/cei" xmlns:w16cex="http://schemas.microsoft.com/office/word/2018/wordml/cex" xmlns:w16cid="http://schemas.microsoft.com/office/word/2016/wordml/cid" xmlns:w16="http://schemas.microsoft.com/office/word/2018/wordml" xmlns:w16sdtdh="http://schemas.microsoft.com/office/word/2020/wordml/sdtdatahash" xmlns:w16sdtfl="http://schemas.microsoft.com/office/word/2024/wordml/sdtformatlock" xmlns:w16se="http://schemas.microsoft.com/office/word/2015/wordml/symex" xmlns:w16du="http://schemas.microsoft.com/office/word/2023/wordml/word16du" xmlns:wne="http://schemas.microsoft.com/office/word/2006/wordml" mc:Ignorable="w14 w15 w16se w16cid w16 w16cex w16sdtdh w16sdtfl w16du wp14">
   <w:abstractNum w:abstractNumId="0" w15:restartNumberingAfterBreak="0">
     <w:nsid w:val="FFFFFF89"/>
     <w:multiLevelType w:val="singleLevel"/>
@@ -11357,7 +11723,7 @@
     <w:lvl w:ilvl="0">
       <w:start w:val="1"/>
       <w:numFmt w:val="bullet"/>
-      <w:pStyle w:val="ListBullet"/>
+      <w:pStyle w:val="a"/>
       <w:lvlText w:val="•"/>
       <w:lvlJc w:val="left"/>
       <w:pPr>
@@ -11376,7 +11742,7 @@
 </file>
 
 <file path=word/glossary/settings.xml><?xml version="1.0" encoding="utf-8"?>
-<w:settings xmlns:mc="http://schemas.openxmlformats.org/markup-compatibility/2006" xmlns:o="urn:schemas-microsoft-com:office:office" xmlns:r="http://schemas.openxmlformats.org/officeDocument/2006/relationships" xmlns:m="http://schemas.openxmlformats.org/officeDocument/2006/math" xmlns:v="urn:schemas-microsoft-com:vml" xmlns:w10="urn:schemas-microsoft-com:office:word" xmlns:w="http://schemas.openxmlformats.org/wordprocessingml/2006/main" xmlns:w14="http://schemas.microsoft.com/office/word/2010/wordml" xmlns:w15="http://schemas.microsoft.com/office/word/2012/wordml" xmlns:w16cex="http://schemas.microsoft.com/office/word/2018/wordml/cex" xmlns:w16cid="http://schemas.microsoft.com/office/word/2016/wordml/cid" xmlns:w16="http://schemas.microsoft.com/office/word/2018/wordml" xmlns:w16du="http://schemas.microsoft.com/office/word/2023/wordml/word16du" xmlns:w16sdtdh="http://schemas.microsoft.com/office/word/2020/wordml/sdtdatahash" xmlns:w16sdtfl="http://schemas.microsoft.com/office/word/2024/wordml/sdtformatlock" xmlns:w16se="http://schemas.microsoft.com/office/word/2015/wordml/symex" xmlns:sl="http://schemas.openxmlformats.org/schemaLibrary/2006/main" mc:Ignorable="w14 w15 w16se w16cid w16 w16cex w16sdtdh w16sdtfl w16du">
+<w:settings xmlns:mc="http://schemas.openxmlformats.org/markup-compatibility/2006" xmlns:m="http://schemas.openxmlformats.org/officeDocument/2006/math" xmlns:r="http://schemas.openxmlformats.org/officeDocument/2006/relationships" xmlns:sl="http://schemas.openxmlformats.org/schemaLibrary/2006/main" xmlns:o="urn:schemas-microsoft-com:office:office" xmlns:v="urn:schemas-microsoft-com:vml" xmlns:w10="urn:schemas-microsoft-com:office:word" xmlns:w="http://schemas.openxmlformats.org/wordprocessingml/2006/main" xmlns:w14="http://schemas.microsoft.com/office/word/2010/wordml" xmlns:w15="http://schemas.microsoft.com/office/word/2012/wordml" xmlns:w16cex="http://schemas.microsoft.com/office/word/2018/wordml/cex" xmlns:w16cid="http://schemas.microsoft.com/office/word/2016/wordml/cid" xmlns:w16="http://schemas.microsoft.com/office/word/2018/wordml" xmlns:w16sdtdh="http://schemas.microsoft.com/office/word/2020/wordml/sdtdatahash" xmlns:w16sdtfl="http://schemas.microsoft.com/office/word/2024/wordml/sdtformatlock" xmlns:w16se="http://schemas.microsoft.com/office/word/2015/wordml/symex" xmlns:w16du="http://schemas.microsoft.com/office/word/2023/wordml/word16du" mc:Ignorable="w14 w15 w16se w16cid w16 w16cex w16sdtdh w16sdtfl w16du">
   <w:view w:val="normal"/>
   <w:defaultTabStop w:val="720"/>
   <w:characterSpacingControl w:val="doNotCompress"/>
@@ -11392,13 +11758,11 @@
   <w:rsids>
     <w:rsidRoot w:val="00324ACF"/>
     <w:rsid w:val="000129E1"/>
-    <w:rsid w:val="00020C57"/>
     <w:rsid w:val="00051231"/>
     <w:rsid w:val="00075A1C"/>
     <w:rsid w:val="0018073C"/>
     <w:rsid w:val="001A632E"/>
     <w:rsid w:val="00207A61"/>
-    <w:rsid w:val="002D4EA1"/>
     <w:rsid w:val="00324ACF"/>
     <w:rsid w:val="00351A43"/>
     <w:rsid w:val="003B2F21"/>
@@ -11413,6 +11777,8 @@
     <w:rsid w:val="0067264F"/>
     <w:rsid w:val="00695677"/>
     <w:rsid w:val="0073624A"/>
+    <w:rsid w:val="007D0B29"/>
+    <w:rsid w:val="008955C3"/>
     <w:rsid w:val="008A4AE7"/>
     <w:rsid w:val="00902777"/>
     <w:rsid w:val="00977680"/>
@@ -11427,8 +11793,8 @@
     <w:rsid w:val="00C40158"/>
     <w:rsid w:val="00C54676"/>
     <w:rsid w:val="00C77297"/>
-    <w:rsid w:val="00CB721F"/>
     <w:rsid w:val="00CC6F9F"/>
+    <w:rsid w:val="00D074EE"/>
     <w:rsid w:val="00D1374E"/>
     <w:rsid w:val="00D248BA"/>
     <w:rsid w:val="00D36B88"/>
@@ -11437,8 +11803,9 @@
     <w:rsid w:val="00E35677"/>
     <w:rsid w:val="00E552F8"/>
     <w:rsid w:val="00E575CD"/>
+    <w:rsid w:val="00F42A55"/>
     <w:rsid w:val="00F55C51"/>
-    <w:rsid w:val="00FC128F"/>
+    <w:rsid w:val="00F6554B"/>
   </w:rsids>
   <m:mathPr>
     <m:mathFont m:val="Cambria Math"/>
@@ -11455,14 +11822,14 @@
   </m:mathPr>
   <w:themeFontLang w:val="en-GB" w:eastAsia="ja-JP" w:bidi="ar-SA"/>
   <w:clrSchemeMapping w:bg1="light1" w:t1="dark1" w:bg2="light2" w:t2="dark2" w:accent1="accent1" w:accent2="accent2" w:accent3="accent3" w:accent4="accent4" w:accent5="accent5" w:accent6="accent6" w:hyperlink="hyperlink" w:followedHyperlink="followedHyperlink"/>
-  <w:decimalSymbol w:val="."/>
-  <w:listSeparator w:val=","/>
+  <w:decimalSymbol w:val="٫"/>
+  <w:listSeparator w:val=";"/>
   <w15:chartTrackingRefBased/>
 </w:settings>
 </file>
 
 <file path=word/glossary/styles.xml><?xml version="1.0" encoding="utf-8"?>
-<w:styles xmlns:mc="http://schemas.openxmlformats.org/markup-compatibility/2006" xmlns:r="http://schemas.openxmlformats.org/officeDocument/2006/relationships" xmlns:w="http://schemas.openxmlformats.org/wordprocessingml/2006/main" xmlns:w14="http://schemas.microsoft.com/office/word/2010/wordml" xmlns:w15="http://schemas.microsoft.com/office/word/2012/wordml" xmlns:w16cex="http://schemas.microsoft.com/office/word/2018/wordml/cex" xmlns:w16cid="http://schemas.microsoft.com/office/word/2016/wordml/cid" xmlns:w16="http://schemas.microsoft.com/office/word/2018/wordml" xmlns:w16du="http://schemas.microsoft.com/office/word/2023/wordml/word16du" xmlns:w16sdtdh="http://schemas.microsoft.com/office/word/2020/wordml/sdtdatahash" xmlns:w16sdtfl="http://schemas.microsoft.com/office/word/2024/wordml/sdtformatlock" xmlns:w16se="http://schemas.microsoft.com/office/word/2015/wordml/symex" mc:Ignorable="w14 w15 w16se w16cid w16 w16cex w16sdtdh w16sdtfl w16du">
+<w:styles xmlns:mc="http://schemas.openxmlformats.org/markup-compatibility/2006" xmlns:r="http://schemas.openxmlformats.org/officeDocument/2006/relationships" xmlns:w="http://schemas.openxmlformats.org/wordprocessingml/2006/main" xmlns:w14="http://schemas.microsoft.com/office/word/2010/wordml" xmlns:w15="http://schemas.microsoft.com/office/word/2012/wordml" xmlns:w16cex="http://schemas.microsoft.com/office/word/2018/wordml/cex" xmlns:w16cid="http://schemas.microsoft.com/office/word/2016/wordml/cid" xmlns:w16="http://schemas.microsoft.com/office/word/2018/wordml" xmlns:w16sdtdh="http://schemas.microsoft.com/office/word/2020/wordml/sdtdatahash" xmlns:w16sdtfl="http://schemas.microsoft.com/office/word/2024/wordml/sdtformatlock" xmlns:w16se="http://schemas.microsoft.com/office/word/2015/wordml/symex" xmlns:w16du="http://schemas.microsoft.com/office/word/2023/wordml/word16du" mc:Ignorable="w14 w15 w16se w16cid w16 w16cex w16sdtdh w16sdtfl w16du">
   <w:docDefaults>
     <w:rPrDefault>
       <w:rPr>
@@ -11856,17 +12223,17 @@
     <w:lsdException w:name="Unresolved Mention" w:semiHidden="1" w:unhideWhenUsed="1"/>
     <w:lsdException w:name="Smart Link" w:semiHidden="1" w:unhideWhenUsed="1"/>
   </w:latentStyles>
-  <w:style w:type="paragraph" w:default="1" w:styleId="Normal">
+  <w:style w:type="paragraph" w:default="1" w:styleId="a0">
     <w:name w:val="Normal"/>
     <w:qFormat/>
   </w:style>
-  <w:style w:type="character" w:default="1" w:styleId="DefaultParagraphFont">
+  <w:style w:type="character" w:default="1" w:styleId="a1">
     <w:name w:val="Default Paragraph Font"/>
     <w:uiPriority w:val="1"/>
     <w:semiHidden/>
     <w:unhideWhenUsed/>
   </w:style>
-  <w:style w:type="table" w:default="1" w:styleId="TableNormal">
+  <w:style w:type="table" w:default="1" w:styleId="a2">
     <w:name w:val="Normal Table"/>
     <w:uiPriority w:val="99"/>
     <w:semiHidden/>
@@ -11881,15 +12248,15 @@
       </w:tblCellMar>
     </w:tblPr>
   </w:style>
-  <w:style w:type="numbering" w:default="1" w:styleId="NoList">
+  <w:style w:type="numbering" w:default="1" w:styleId="a3">
     <w:name w:val="No List"/>
     <w:uiPriority w:val="99"/>
     <w:semiHidden/>
     <w:unhideWhenUsed/>
   </w:style>
-  <w:style w:type="paragraph" w:styleId="ListBullet">
+  <w:style w:type="paragraph" w:styleId="a">
     <w:name w:val="List Bullet"/>
-    <w:basedOn w:val="Normal"/>
+    <w:basedOn w:val="a0"/>
     <w:uiPriority w:val="1"/>
     <w:unhideWhenUsed/>
     <w:qFormat/>
@@ -11906,9 +12273,9 @@
       <w:lang w:val="en-US" w:eastAsia="en-US"/>
     </w:rPr>
   </w:style>
-  <w:style w:type="character" w:styleId="Strong">
+  <w:style w:type="character" w:styleId="a4">
     <w:name w:val="Strong"/>
-    <w:basedOn w:val="DefaultParagraphFont"/>
+    <w:basedOn w:val="a1"/>
     <w:uiPriority w:val="10"/>
     <w:qFormat/>
     <w:rPr>
@@ -11929,7 +12296,7 @@
 </file>
 
 <file path=word/glossary/webSettings.xml><?xml version="1.0" encoding="utf-8"?>
-<w:webSettings xmlns:mc="http://schemas.openxmlformats.org/markup-compatibility/2006" xmlns:r="http://schemas.openxmlformats.org/officeDocument/2006/relationships" xmlns:w="http://schemas.openxmlformats.org/wordprocessingml/2006/main" xmlns:w14="http://schemas.microsoft.com/office/word/2010/wordml" xmlns:w15="http://schemas.microsoft.com/office/word/2012/wordml" xmlns:w16cex="http://schemas.microsoft.com/office/word/2018/wordml/cex" xmlns:w16cid="http://schemas.microsoft.com/office/word/2016/wordml/cid" xmlns:w16="http://schemas.microsoft.com/office/word/2018/wordml" xmlns:w16du="http://schemas.microsoft.com/office/word/2023/wordml/word16du" xmlns:w16sdtdh="http://schemas.microsoft.com/office/word/2020/wordml/sdtdatahash" xmlns:w16sdtfl="http://schemas.microsoft.com/office/word/2024/wordml/sdtformatlock" xmlns:w16se="http://schemas.microsoft.com/office/word/2015/wordml/symex" mc:Ignorable="w14 w15 w16se w16cid w16 w16cex w16sdtdh w16sdtfl w16du">
+<w:webSettings xmlns:mc="http://schemas.openxmlformats.org/markup-compatibility/2006" xmlns:r="http://schemas.openxmlformats.org/officeDocument/2006/relationships" xmlns:w="http://schemas.openxmlformats.org/wordprocessingml/2006/main" xmlns:w14="http://schemas.microsoft.com/office/word/2010/wordml" xmlns:w15="http://schemas.microsoft.com/office/word/2012/wordml" xmlns:w16cex="http://schemas.microsoft.com/office/word/2018/wordml/cex" xmlns:w16cid="http://schemas.microsoft.com/office/word/2016/wordml/cid" xmlns:w16="http://schemas.microsoft.com/office/word/2018/wordml" xmlns:w16sdtdh="http://schemas.microsoft.com/office/word/2020/wordml/sdtdatahash" xmlns:w16sdtfl="http://schemas.microsoft.com/office/word/2024/wordml/sdtformatlock" xmlns:w16se="http://schemas.microsoft.com/office/word/2015/wordml/symex" xmlns:w16du="http://schemas.microsoft.com/office/word/2023/wordml/word16du" mc:Ignorable="w14 w15 w16se w16cid w16 w16cex w16sdtdh w16sdtfl w16du">
   <w:optimizeForBrowser/>
   <w:allowPNG/>
 </w:webSettings>
@@ -12263,16 +12630,16 @@
 </file>
 
 <file path=customXml/item2.xml><?xml version="1.0" encoding="utf-8"?>
+<b:Sources xmlns:b="http://schemas.openxmlformats.org/officeDocument/2006/bibliography" SelectedStyle="\APA.XSL" StyleName="APA"/>
+</file>
+
+<file path=customXml/item3.xml><?xml version="1.0" encoding="utf-8"?>
 <?mso-contentType ?>
 <FormTemplates xmlns="http://schemas.microsoft.com/sharepoint/v3/contenttype/forms">
   <Display>DocumentLibraryForm</Display>
   <Edit>AssetEditForm</Edit>
   <New>DocumentLibraryForm</New>
 </FormTemplates>
-</file>
-
-<file path=customXml/item3.xml><?xml version="1.0" encoding="utf-8"?>
-<b:Sources xmlns:b="http://schemas.openxmlformats.org/officeDocument/2006/bibliography" SelectedStyle="\APA.XSL" StyleName="APA"/>
 </file>
 
 <file path=customXml/itemProps1.xml><?xml version="1.0" encoding="utf-8"?>
@@ -12284,17 +12651,18 @@
 </file>
 
 <file path=customXml/itemProps2.xml><?xml version="1.0" encoding="utf-8"?>
+<ds:datastoreItem xmlns:ds="http://schemas.openxmlformats.org/officeDocument/2006/customXml" ds:itemID="{355C5113-D031-41DB-A6D8-43CE1A0E6695}">
+  <ds:schemaRefs>
+    <ds:schemaRef ds:uri="http://schemas.openxmlformats.org/officeDocument/2006/bibliography"/>
+    <ds:schemaRef ds:uri="http://www.w3.org/2000/xmlns/"/>
+  </ds:schemaRefs>
+</ds:datastoreItem>
+</file>
+
+<file path=customXml/itemProps3.xml><?xml version="1.0" encoding="utf-8"?>
 <ds:datastoreItem xmlns:ds="http://schemas.openxmlformats.org/officeDocument/2006/customXml" ds:itemID="{E34C63B7-A026-4A37-9535-4FBB4C03A11D}">
   <ds:schemaRefs>
     <ds:schemaRef ds:uri="http://schemas.microsoft.com/sharepoint/v3/contenttype/forms"/>
   </ds:schemaRefs>
 </ds:datastoreItem>
-</file>
-
-<file path=customXml/itemProps3.xml><?xml version="1.0" encoding="utf-8"?>
-<ds:datastoreItem xmlns:ds="http://schemas.openxmlformats.org/officeDocument/2006/customXml" ds:itemID="{355C5113-D031-41DB-A6D8-43CE1A0E6695}">
-  <ds:schemaRefs>
-    <ds:schemaRef ds:uri="http://schemas.openxmlformats.org/officeDocument/2006/bibliography"/>
-  </ds:schemaRefs>
-</ds:datastoreItem>
 </file>
</xml_diff>